<commit_message>
update : mettre CdC a jour
</commit_message>
<xml_diff>
--- a/annexe/CdC.docx
+++ b/annexe/CdC.docx
@@ -51,7 +51,7 @@
                     </pic:cNvPicPr>
                   </pic:nvPicPr>
                   <pic:blipFill>
-                    <a:blip r:embed="rId6">
+                    <a:blip r:embed="rId8">
                       <a:extLst>
                         <a:ext uri="{28A0092B-C50C-407E-A947-70E740481C1C}">
                           <a14:useLocalDpi xmlns:a14="http://schemas.microsoft.com/office/drawing/2010/main" val="0"/>
@@ -185,7 +185,7 @@
         </w:rPr>
         <w:fldChar w:fldCharType="separate"/>
       </w:r>
-      <w:hyperlink w:anchor="_Toc232582510" w:history="1">
+      <w:hyperlink w:anchor="_Toc232586080" w:history="1">
         <w:r>
           <w:rPr>
             <w:rStyle w:val="Lienhypertexte"/>
@@ -212,7 +212,7 @@
             <w:noProof/>
             <w:webHidden/>
           </w:rPr>
-          <w:instrText xml:space="preserve"> PAGEREF _Toc232582510 \h </w:instrText>
+          <w:instrText xml:space="preserve"> PAGEREF _Toc232586080 \h </w:instrText>
         </w:r>
         <w:r>
           <w:rPr>
@@ -258,7 +258,7 @@
           <w14:ligatures w14:val="standardContextual"/>
         </w:rPr>
       </w:pPr>
-      <w:hyperlink w:anchor="_Toc232582511" w:history="1">
+      <w:hyperlink w:anchor="_Toc232586081" w:history="1">
         <w:r>
           <w:rPr>
             <w:rStyle w:val="Lienhypertexte"/>
@@ -285,7 +285,7 @@
             <w:noProof/>
             <w:webHidden/>
           </w:rPr>
-          <w:instrText xml:space="preserve"> PAGEREF _Toc232582511 \h </w:instrText>
+          <w:instrText xml:space="preserve"> PAGEREF _Toc232586081 \h </w:instrText>
         </w:r>
         <w:r>
           <w:rPr>
@@ -331,7 +331,7 @@
           <w14:ligatures w14:val="standardContextual"/>
         </w:rPr>
       </w:pPr>
-      <w:hyperlink w:anchor="_Toc232582512" w:history="1">
+      <w:hyperlink w:anchor="_Toc232586082" w:history="1">
         <w:r>
           <w:rPr>
             <w:rStyle w:val="Lienhypertexte"/>
@@ -358,7 +358,7 @@
             <w:noProof/>
             <w:webHidden/>
           </w:rPr>
-          <w:instrText xml:space="preserve"> PAGEREF _Toc232582512 \h </w:instrText>
+          <w:instrText xml:space="preserve"> PAGEREF _Toc232586082 \h </w:instrText>
         </w:r>
         <w:r>
           <w:rPr>
@@ -404,7 +404,7 @@
           <w14:ligatures w14:val="standardContextual"/>
         </w:rPr>
       </w:pPr>
-      <w:hyperlink w:anchor="_Toc232582513" w:history="1">
+      <w:hyperlink w:anchor="_Toc232586083" w:history="1">
         <w:r>
           <w:rPr>
             <w:rStyle w:val="Lienhypertexte"/>
@@ -431,7 +431,7 @@
             <w:noProof/>
             <w:webHidden/>
           </w:rPr>
-          <w:instrText xml:space="preserve"> PAGEREF _Toc232582513 \h </w:instrText>
+          <w:instrText xml:space="preserve"> PAGEREF _Toc232586083 \h </w:instrText>
         </w:r>
         <w:r>
           <w:rPr>
@@ -477,7 +477,7 @@
           <w14:ligatures w14:val="standardContextual"/>
         </w:rPr>
       </w:pPr>
-      <w:hyperlink w:anchor="_Toc232582514" w:history="1">
+      <w:hyperlink w:anchor="_Toc232586084" w:history="1">
         <w:r>
           <w:rPr>
             <w:rStyle w:val="Lienhypertexte"/>
@@ -504,7 +504,7 @@
             <w:noProof/>
             <w:webHidden/>
           </w:rPr>
-          <w:instrText xml:space="preserve"> PAGEREF _Toc232582514 \h </w:instrText>
+          <w:instrText xml:space="preserve"> PAGEREF _Toc232586084 \h </w:instrText>
         </w:r>
         <w:r>
           <w:rPr>
@@ -550,7 +550,7 @@
           <w14:ligatures w14:val="standardContextual"/>
         </w:rPr>
       </w:pPr>
-      <w:hyperlink w:anchor="_Toc232582515" w:history="1">
+      <w:hyperlink w:anchor="_Toc232586085" w:history="1">
         <w:r>
           <w:rPr>
             <w:rStyle w:val="Lienhypertexte"/>
@@ -577,7 +577,7 @@
             <w:noProof/>
             <w:webHidden/>
           </w:rPr>
-          <w:instrText xml:space="preserve"> PAGEREF _Toc232582515 \h </w:instrText>
+          <w:instrText xml:space="preserve"> PAGEREF _Toc232586085 \h </w:instrText>
         </w:r>
         <w:r>
           <w:rPr>
@@ -623,7 +623,7 @@
           <w14:ligatures w14:val="standardContextual"/>
         </w:rPr>
       </w:pPr>
-      <w:hyperlink w:anchor="_Toc232582516" w:history="1">
+      <w:hyperlink w:anchor="_Toc232586086" w:history="1">
         <w:r>
           <w:rPr>
             <w:rStyle w:val="Lienhypertexte"/>
@@ -650,7 +650,7 @@
             <w:noProof/>
             <w:webHidden/>
           </w:rPr>
-          <w:instrText xml:space="preserve"> PAGEREF _Toc232582516 \h </w:instrText>
+          <w:instrText xml:space="preserve"> PAGEREF _Toc232586086 \h </w:instrText>
         </w:r>
         <w:r>
           <w:rPr>
@@ -696,7 +696,7 @@
           <w14:ligatures w14:val="standardContextual"/>
         </w:rPr>
       </w:pPr>
-      <w:hyperlink w:anchor="_Toc232582517" w:history="1">
+      <w:hyperlink w:anchor="_Toc232586087" w:history="1">
         <w:r>
           <w:rPr>
             <w:rStyle w:val="Lienhypertexte"/>
@@ -723,7 +723,7 @@
             <w:noProof/>
             <w:webHidden/>
           </w:rPr>
-          <w:instrText xml:space="preserve"> PAGEREF _Toc232582517 \h </w:instrText>
+          <w:instrText xml:space="preserve"> PAGEREF _Toc232586087 \h </w:instrText>
         </w:r>
         <w:r>
           <w:rPr>
@@ -744,6 +744,225 @@
             <w:webHidden/>
           </w:rPr>
           <w:t>3</w:t>
+        </w:r>
+        <w:r>
+          <w:rPr>
+            <w:noProof/>
+            <w:webHidden/>
+          </w:rPr>
+          <w:fldChar w:fldCharType="end"/>
+        </w:r>
+      </w:hyperlink>
+    </w:p>
+    <w:p>
+      <w:pPr>
+        <w:pStyle w:val="TM1"/>
+        <w:tabs>
+          <w:tab w:val="right" w:leader="dot" w:pos="9060"/>
+        </w:tabs>
+        <w:rPr>
+          <w:rFonts w:eastAsiaTheme="minorEastAsia" w:cstheme="minorBidi"/>
+          <w:noProof/>
+          <w:kern w:val="2"/>
+          <w:sz w:val="24"/>
+          <w:szCs w:val="24"/>
+          <w14:ligatures w14:val="standardContextual"/>
+        </w:rPr>
+      </w:pPr>
+      <w:hyperlink w:anchor="_Toc232586088" w:history="1">
+        <w:r>
+          <w:rPr>
+            <w:rStyle w:val="Lienhypertexte"/>
+            <w:noProof/>
+          </w:rPr>
+          <w:t>Planification Initiale</w:t>
+        </w:r>
+        <w:r>
+          <w:rPr>
+            <w:noProof/>
+            <w:webHidden/>
+          </w:rPr>
+          <w:tab/>
+        </w:r>
+        <w:r>
+          <w:rPr>
+            <w:noProof/>
+            <w:webHidden/>
+          </w:rPr>
+          <w:fldChar w:fldCharType="begin"/>
+        </w:r>
+        <w:r>
+          <w:rPr>
+            <w:noProof/>
+            <w:webHidden/>
+          </w:rPr>
+          <w:instrText xml:space="preserve"> PAGEREF _Toc232586088 \h </w:instrText>
+        </w:r>
+        <w:r>
+          <w:rPr>
+            <w:noProof/>
+            <w:webHidden/>
+          </w:rPr>
+        </w:r>
+        <w:r>
+          <w:rPr>
+            <w:noProof/>
+            <w:webHidden/>
+          </w:rPr>
+          <w:fldChar w:fldCharType="separate"/>
+        </w:r>
+        <w:r>
+          <w:rPr>
+            <w:noProof/>
+            <w:webHidden/>
+          </w:rPr>
+          <w:t>3</w:t>
+        </w:r>
+        <w:r>
+          <w:rPr>
+            <w:noProof/>
+            <w:webHidden/>
+          </w:rPr>
+          <w:fldChar w:fldCharType="end"/>
+        </w:r>
+      </w:hyperlink>
+    </w:p>
+    <w:p>
+      <w:pPr>
+        <w:pStyle w:val="TM1"/>
+        <w:tabs>
+          <w:tab w:val="right" w:leader="dot" w:pos="9060"/>
+        </w:tabs>
+        <w:rPr>
+          <w:rFonts w:eastAsiaTheme="minorEastAsia" w:cstheme="minorBidi"/>
+          <w:noProof/>
+          <w:kern w:val="2"/>
+          <w:sz w:val="24"/>
+          <w:szCs w:val="24"/>
+          <w14:ligatures w14:val="standardContextual"/>
+        </w:rPr>
+      </w:pPr>
+      <w:hyperlink w:anchor="_Toc232586089" w:history="1">
+        <w:r>
+          <w:rPr>
+            <w:rStyle w:val="Lienhypertexte"/>
+            <w:noProof/>
+          </w:rPr>
+          <w:t>Journal de travail</w:t>
+        </w:r>
+        <w:r>
+          <w:rPr>
+            <w:noProof/>
+            <w:webHidden/>
+          </w:rPr>
+          <w:tab/>
+        </w:r>
+        <w:r>
+          <w:rPr>
+            <w:noProof/>
+            <w:webHidden/>
+          </w:rPr>
+          <w:fldChar w:fldCharType="begin"/>
+        </w:r>
+        <w:r>
+          <w:rPr>
+            <w:noProof/>
+            <w:webHidden/>
+          </w:rPr>
+          <w:instrText xml:space="preserve"> PAGEREF _Toc232586089 \h </w:instrText>
+        </w:r>
+        <w:r>
+          <w:rPr>
+            <w:noProof/>
+            <w:webHidden/>
+          </w:rPr>
+        </w:r>
+        <w:r>
+          <w:rPr>
+            <w:noProof/>
+            <w:webHidden/>
+          </w:rPr>
+          <w:fldChar w:fldCharType="separate"/>
+        </w:r>
+        <w:r>
+          <w:rPr>
+            <w:noProof/>
+            <w:webHidden/>
+          </w:rPr>
+          <w:t>4</w:t>
+        </w:r>
+        <w:r>
+          <w:rPr>
+            <w:noProof/>
+            <w:webHidden/>
+          </w:rPr>
+          <w:fldChar w:fldCharType="end"/>
+        </w:r>
+      </w:hyperlink>
+    </w:p>
+    <w:p>
+      <w:pPr>
+        <w:pStyle w:val="TM1"/>
+        <w:tabs>
+          <w:tab w:val="right" w:leader="dot" w:pos="9060"/>
+        </w:tabs>
+        <w:rPr>
+          <w:rFonts w:eastAsiaTheme="minorEastAsia" w:cstheme="minorBidi"/>
+          <w:noProof/>
+          <w:kern w:val="2"/>
+          <w:sz w:val="24"/>
+          <w:szCs w:val="24"/>
+          <w14:ligatures w14:val="standardContextual"/>
+        </w:rPr>
+      </w:pPr>
+      <w:hyperlink w:anchor="_Toc232586090" w:history="1">
+        <w:r>
+          <w:rPr>
+            <w:rStyle w:val="Lienhypertexte"/>
+            <w:noProof/>
+          </w:rPr>
+          <w:t>Analyse</w:t>
+        </w:r>
+        <w:r>
+          <w:rPr>
+            <w:noProof/>
+            <w:webHidden/>
+          </w:rPr>
+          <w:tab/>
+        </w:r>
+        <w:r>
+          <w:rPr>
+            <w:noProof/>
+            <w:webHidden/>
+          </w:rPr>
+          <w:fldChar w:fldCharType="begin"/>
+        </w:r>
+        <w:r>
+          <w:rPr>
+            <w:noProof/>
+            <w:webHidden/>
+          </w:rPr>
+          <w:instrText xml:space="preserve"> PAGEREF _Toc232586090 \h </w:instrText>
+        </w:r>
+        <w:r>
+          <w:rPr>
+            <w:noProof/>
+            <w:webHidden/>
+          </w:rPr>
+        </w:r>
+        <w:r>
+          <w:rPr>
+            <w:noProof/>
+            <w:webHidden/>
+          </w:rPr>
+          <w:fldChar w:fldCharType="separate"/>
+        </w:r>
+        <w:r>
+          <w:rPr>
+            <w:noProof/>
+            <w:webHidden/>
+          </w:rPr>
+          <w:t>7</w:t>
         </w:r>
         <w:r>
           <w:rPr>
@@ -769,13 +988,13 @@
           <w14:ligatures w14:val="standardContextual"/>
         </w:rPr>
       </w:pPr>
-      <w:hyperlink w:anchor="_Toc232582518" w:history="1">
+      <w:hyperlink w:anchor="_Toc232586091" w:history="1">
         <w:r>
           <w:rPr>
             <w:rStyle w:val="Lienhypertexte"/>
             <w:noProof/>
           </w:rPr>
-          <w:t>Travail à réaliser par l'apprenti</w:t>
+          <w:t>Temps</w:t>
         </w:r>
         <w:r>
           <w:rPr>
@@ -796,7 +1015,7 @@
             <w:noProof/>
             <w:webHidden/>
           </w:rPr>
-          <w:instrText xml:space="preserve"> PAGEREF _Toc232582518 \h </w:instrText>
+          <w:instrText xml:space="preserve"> PAGEREF _Toc232586091 \h </w:instrText>
         </w:r>
         <w:r>
           <w:rPr>
@@ -816,7 +1035,226 @@
             <w:noProof/>
             <w:webHidden/>
           </w:rPr>
-          <w:t>3</w:t>
+          <w:t>7</w:t>
+        </w:r>
+        <w:r>
+          <w:rPr>
+            <w:noProof/>
+            <w:webHidden/>
+          </w:rPr>
+          <w:fldChar w:fldCharType="end"/>
+        </w:r>
+      </w:hyperlink>
+    </w:p>
+    <w:p>
+      <w:pPr>
+        <w:pStyle w:val="TM2"/>
+        <w:tabs>
+          <w:tab w:val="right" w:leader="dot" w:pos="9060"/>
+        </w:tabs>
+        <w:rPr>
+          <w:rFonts w:eastAsiaTheme="minorEastAsia" w:cstheme="minorBidi"/>
+          <w:noProof/>
+          <w:kern w:val="2"/>
+          <w:sz w:val="24"/>
+          <w:szCs w:val="24"/>
+          <w14:ligatures w14:val="standardContextual"/>
+        </w:rPr>
+      </w:pPr>
+      <w:hyperlink w:anchor="_Toc232586092" w:history="1">
+        <w:r>
+          <w:rPr>
+            <w:rStyle w:val="Lienhypertexte"/>
+            <w:noProof/>
+          </w:rPr>
+          <w:t>Observations &amp; Analyse</w:t>
+        </w:r>
+        <w:r>
+          <w:rPr>
+            <w:noProof/>
+            <w:webHidden/>
+          </w:rPr>
+          <w:tab/>
+        </w:r>
+        <w:r>
+          <w:rPr>
+            <w:noProof/>
+            <w:webHidden/>
+          </w:rPr>
+          <w:fldChar w:fldCharType="begin"/>
+        </w:r>
+        <w:r>
+          <w:rPr>
+            <w:noProof/>
+            <w:webHidden/>
+          </w:rPr>
+          <w:instrText xml:space="preserve"> PAGEREF _Toc232586092 \h </w:instrText>
+        </w:r>
+        <w:r>
+          <w:rPr>
+            <w:noProof/>
+            <w:webHidden/>
+          </w:rPr>
+        </w:r>
+        <w:r>
+          <w:rPr>
+            <w:noProof/>
+            <w:webHidden/>
+          </w:rPr>
+          <w:fldChar w:fldCharType="separate"/>
+        </w:r>
+        <w:r>
+          <w:rPr>
+            <w:noProof/>
+            <w:webHidden/>
+          </w:rPr>
+          <w:t>7</w:t>
+        </w:r>
+        <w:r>
+          <w:rPr>
+            <w:noProof/>
+            <w:webHidden/>
+          </w:rPr>
+          <w:fldChar w:fldCharType="end"/>
+        </w:r>
+      </w:hyperlink>
+    </w:p>
+    <w:p>
+      <w:pPr>
+        <w:pStyle w:val="TM3"/>
+        <w:tabs>
+          <w:tab w:val="right" w:leader="dot" w:pos="9060"/>
+        </w:tabs>
+        <w:rPr>
+          <w:rFonts w:eastAsiaTheme="minorEastAsia" w:cstheme="minorBidi"/>
+          <w:noProof/>
+          <w:kern w:val="2"/>
+          <w:sz w:val="24"/>
+          <w:szCs w:val="24"/>
+          <w14:ligatures w14:val="standardContextual"/>
+        </w:rPr>
+      </w:pPr>
+      <w:hyperlink w:anchor="_Toc232586093" w:history="1">
+        <w:r>
+          <w:rPr>
+            <w:rStyle w:val="Lienhypertexte"/>
+            <w:noProof/>
+          </w:rPr>
+          <w:t>Points positifs</w:t>
+        </w:r>
+        <w:r>
+          <w:rPr>
+            <w:noProof/>
+            <w:webHidden/>
+          </w:rPr>
+          <w:tab/>
+        </w:r>
+        <w:r>
+          <w:rPr>
+            <w:noProof/>
+            <w:webHidden/>
+          </w:rPr>
+          <w:fldChar w:fldCharType="begin"/>
+        </w:r>
+        <w:r>
+          <w:rPr>
+            <w:noProof/>
+            <w:webHidden/>
+          </w:rPr>
+          <w:instrText xml:space="preserve"> PAGEREF _Toc232586093 \h </w:instrText>
+        </w:r>
+        <w:r>
+          <w:rPr>
+            <w:noProof/>
+            <w:webHidden/>
+          </w:rPr>
+        </w:r>
+        <w:r>
+          <w:rPr>
+            <w:noProof/>
+            <w:webHidden/>
+          </w:rPr>
+          <w:fldChar w:fldCharType="separate"/>
+        </w:r>
+        <w:r>
+          <w:rPr>
+            <w:noProof/>
+            <w:webHidden/>
+          </w:rPr>
+          <w:t>7</w:t>
+        </w:r>
+        <w:r>
+          <w:rPr>
+            <w:noProof/>
+            <w:webHidden/>
+          </w:rPr>
+          <w:fldChar w:fldCharType="end"/>
+        </w:r>
+      </w:hyperlink>
+    </w:p>
+    <w:p>
+      <w:pPr>
+        <w:pStyle w:val="TM3"/>
+        <w:tabs>
+          <w:tab w:val="right" w:leader="dot" w:pos="9060"/>
+        </w:tabs>
+        <w:rPr>
+          <w:rFonts w:eastAsiaTheme="minorEastAsia" w:cstheme="minorBidi"/>
+          <w:noProof/>
+          <w:kern w:val="2"/>
+          <w:sz w:val="24"/>
+          <w:szCs w:val="24"/>
+          <w14:ligatures w14:val="standardContextual"/>
+        </w:rPr>
+      </w:pPr>
+      <w:hyperlink w:anchor="_Toc232586094" w:history="1">
+        <w:r>
+          <w:rPr>
+            <w:rStyle w:val="Lienhypertexte"/>
+            <w:noProof/>
+          </w:rPr>
+          <w:t>Points d’amélioration</w:t>
+        </w:r>
+        <w:r>
+          <w:rPr>
+            <w:noProof/>
+            <w:webHidden/>
+          </w:rPr>
+          <w:tab/>
+        </w:r>
+        <w:r>
+          <w:rPr>
+            <w:noProof/>
+            <w:webHidden/>
+          </w:rPr>
+          <w:fldChar w:fldCharType="begin"/>
+        </w:r>
+        <w:r>
+          <w:rPr>
+            <w:noProof/>
+            <w:webHidden/>
+          </w:rPr>
+          <w:instrText xml:space="preserve"> PAGEREF _Toc232586094 \h </w:instrText>
+        </w:r>
+        <w:r>
+          <w:rPr>
+            <w:noProof/>
+            <w:webHidden/>
+          </w:rPr>
+        </w:r>
+        <w:r>
+          <w:rPr>
+            <w:noProof/>
+            <w:webHidden/>
+          </w:rPr>
+          <w:fldChar w:fldCharType="separate"/>
+        </w:r>
+        <w:r>
+          <w:rPr>
+            <w:noProof/>
+            <w:webHidden/>
+          </w:rPr>
+          <w:t>7</w:t>
         </w:r>
         <w:r>
           <w:rPr>
@@ -842,13 +1280,13 @@
           <w14:ligatures w14:val="standardContextual"/>
         </w:rPr>
       </w:pPr>
-      <w:hyperlink w:anchor="_Toc232582519" w:history="1">
+      <w:hyperlink w:anchor="_Toc232586095" w:history="1">
         <w:r>
           <w:rPr>
             <w:rStyle w:val="Lienhypertexte"/>
             <w:noProof/>
           </w:rPr>
-          <w:t>Planification Initiale</w:t>
+          <w:t>Amélioration</w:t>
         </w:r>
         <w:r>
           <w:rPr>
@@ -869,7 +1307,7 @@
             <w:noProof/>
             <w:webHidden/>
           </w:rPr>
-          <w:instrText xml:space="preserve"> PAGEREF _Toc232582519 \h </w:instrText>
+          <w:instrText xml:space="preserve"> PAGEREF _Toc232586095 \h </w:instrText>
         </w:r>
         <w:r>
           <w:rPr>
@@ -889,7 +1327,7 @@
             <w:noProof/>
             <w:webHidden/>
           </w:rPr>
-          <w:t>3</w:t>
+          <w:t>7</w:t>
         </w:r>
         <w:r>
           <w:rPr>
@@ -915,13 +1353,13 @@
           <w14:ligatures w14:val="standardContextual"/>
         </w:rPr>
       </w:pPr>
-      <w:hyperlink w:anchor="_Toc232582520" w:history="1">
+      <w:hyperlink w:anchor="_Toc232586096" w:history="1">
         <w:r>
           <w:rPr>
             <w:rStyle w:val="Lienhypertexte"/>
             <w:noProof/>
           </w:rPr>
-          <w:t>Journal de travail</w:t>
+          <w:t>Opportunités</w:t>
         </w:r>
         <w:r>
           <w:rPr>
@@ -942,7 +1380,7 @@
             <w:noProof/>
             <w:webHidden/>
           </w:rPr>
-          <w:instrText xml:space="preserve"> PAGEREF _Toc232582520 \h </w:instrText>
+          <w:instrText xml:space="preserve"> PAGEREF _Toc232586096 \h </w:instrText>
         </w:r>
         <w:r>
           <w:rPr>
@@ -962,7 +1400,7 @@
             <w:noProof/>
             <w:webHidden/>
           </w:rPr>
-          <w:t>4</w:t>
+          <w:t>8</w:t>
         </w:r>
         <w:r>
           <w:rPr>
@@ -988,13 +1426,13 @@
           <w14:ligatures w14:val="standardContextual"/>
         </w:rPr>
       </w:pPr>
-      <w:hyperlink w:anchor="_Toc232582521" w:history="1">
+      <w:hyperlink w:anchor="_Toc232586097" w:history="1">
         <w:r>
           <w:rPr>
             <w:rStyle w:val="Lienhypertexte"/>
             <w:noProof/>
           </w:rPr>
-          <w:t>Analyse</w:t>
+          <w:t>Annexes</w:t>
         </w:r>
         <w:r>
           <w:rPr>
@@ -1015,7 +1453,7 @@
             <w:noProof/>
             <w:webHidden/>
           </w:rPr>
-          <w:instrText xml:space="preserve"> PAGEREF _Toc232582521 \h </w:instrText>
+          <w:instrText xml:space="preserve"> PAGEREF _Toc232586097 \h </w:instrText>
         </w:r>
         <w:r>
           <w:rPr>
@@ -1035,687 +1473,7 @@
             <w:noProof/>
             <w:webHidden/>
           </w:rPr>
-          <w:t>6</w:t>
-        </w:r>
-        <w:r>
-          <w:rPr>
-            <w:noProof/>
-            <w:webHidden/>
-          </w:rPr>
-          <w:fldChar w:fldCharType="end"/>
-        </w:r>
-      </w:hyperlink>
-    </w:p>
-    <w:p>
-      <w:pPr>
-        <w:pStyle w:val="TM1"/>
-        <w:tabs>
-          <w:tab w:val="right" w:leader="dot" w:pos="9060"/>
-        </w:tabs>
-        <w:rPr>
-          <w:rFonts w:eastAsiaTheme="minorEastAsia" w:cstheme="minorBidi"/>
-          <w:noProof/>
-          <w:kern w:val="2"/>
-          <w:sz w:val="24"/>
-          <w:szCs w:val="24"/>
-          <w14:ligatures w14:val="standardContextual"/>
-        </w:rPr>
-      </w:pPr>
-      <w:hyperlink w:anchor="_Toc232582522" w:history="1">
-        <w:r>
-          <w:rPr>
-            <w:rStyle w:val="Lienhypertexte"/>
-            <w:noProof/>
-          </w:rPr>
-          <w:t>Amélioration</w:t>
-        </w:r>
-        <w:r>
-          <w:rPr>
-            <w:noProof/>
-            <w:webHidden/>
-          </w:rPr>
-          <w:tab/>
-        </w:r>
-        <w:r>
-          <w:rPr>
-            <w:noProof/>
-            <w:webHidden/>
-          </w:rPr>
-          <w:fldChar w:fldCharType="begin"/>
-        </w:r>
-        <w:r>
-          <w:rPr>
-            <w:noProof/>
-            <w:webHidden/>
-          </w:rPr>
-          <w:instrText xml:space="preserve"> PAGEREF _Toc232582522 \h </w:instrText>
-        </w:r>
-        <w:r>
-          <w:rPr>
-            <w:noProof/>
-            <w:webHidden/>
-          </w:rPr>
-        </w:r>
-        <w:r>
-          <w:rPr>
-            <w:noProof/>
-            <w:webHidden/>
-          </w:rPr>
-          <w:fldChar w:fldCharType="separate"/>
-        </w:r>
-        <w:r>
-          <w:rPr>
-            <w:noProof/>
-            <w:webHidden/>
-          </w:rPr>
-          <w:t>6</w:t>
-        </w:r>
-        <w:r>
-          <w:rPr>
-            <w:noProof/>
-            <w:webHidden/>
-          </w:rPr>
-          <w:fldChar w:fldCharType="end"/>
-        </w:r>
-      </w:hyperlink>
-    </w:p>
-    <w:p>
-      <w:pPr>
-        <w:pStyle w:val="TM1"/>
-        <w:tabs>
-          <w:tab w:val="right" w:leader="dot" w:pos="9060"/>
-        </w:tabs>
-        <w:rPr>
-          <w:rFonts w:eastAsiaTheme="minorEastAsia" w:cstheme="minorBidi"/>
-          <w:noProof/>
-          <w:kern w:val="2"/>
-          <w:sz w:val="24"/>
-          <w:szCs w:val="24"/>
-          <w14:ligatures w14:val="standardContextual"/>
-        </w:rPr>
-      </w:pPr>
-      <w:hyperlink w:anchor="_Toc232582523" w:history="1">
-        <w:r>
-          <w:rPr>
-            <w:rStyle w:val="Lienhypertexte"/>
-            <w:noProof/>
-          </w:rPr>
-          <w:t>Opportunités</w:t>
-        </w:r>
-        <w:r>
-          <w:rPr>
-            <w:noProof/>
-            <w:webHidden/>
-          </w:rPr>
-          <w:tab/>
-        </w:r>
-        <w:r>
-          <w:rPr>
-            <w:noProof/>
-            <w:webHidden/>
-          </w:rPr>
-          <w:fldChar w:fldCharType="begin"/>
-        </w:r>
-        <w:r>
-          <w:rPr>
-            <w:noProof/>
-            <w:webHidden/>
-          </w:rPr>
-          <w:instrText xml:space="preserve"> PAGEREF _Toc232582523 \h </w:instrText>
-        </w:r>
-        <w:r>
-          <w:rPr>
-            <w:noProof/>
-            <w:webHidden/>
-          </w:rPr>
-        </w:r>
-        <w:r>
-          <w:rPr>
-            <w:noProof/>
-            <w:webHidden/>
-          </w:rPr>
-          <w:fldChar w:fldCharType="separate"/>
-        </w:r>
-        <w:r>
-          <w:rPr>
-            <w:noProof/>
-            <w:webHidden/>
-          </w:rPr>
-          <w:t>7</w:t>
-        </w:r>
-        <w:r>
-          <w:rPr>
-            <w:noProof/>
-            <w:webHidden/>
-          </w:rPr>
-          <w:fldChar w:fldCharType="end"/>
-        </w:r>
-      </w:hyperlink>
-    </w:p>
-    <w:p>
-      <w:pPr>
-        <w:pStyle w:val="TM1"/>
-        <w:tabs>
-          <w:tab w:val="right" w:leader="dot" w:pos="9060"/>
-        </w:tabs>
-        <w:rPr>
-          <w:rFonts w:eastAsiaTheme="minorEastAsia" w:cstheme="minorBidi"/>
-          <w:noProof/>
-          <w:kern w:val="2"/>
-          <w:sz w:val="24"/>
-          <w:szCs w:val="24"/>
-          <w14:ligatures w14:val="standardContextual"/>
-        </w:rPr>
-      </w:pPr>
-      <w:hyperlink w:anchor="_Toc232582524" w:history="1">
-        <w:r>
-          <w:rPr>
-            <w:rStyle w:val="Lienhypertexte"/>
-            <w:noProof/>
-          </w:rPr>
-          <w:t>Conclusion</w:t>
-        </w:r>
-        <w:r>
-          <w:rPr>
-            <w:noProof/>
-            <w:webHidden/>
-          </w:rPr>
-          <w:tab/>
-        </w:r>
-        <w:r>
-          <w:rPr>
-            <w:noProof/>
-            <w:webHidden/>
-          </w:rPr>
-          <w:fldChar w:fldCharType="begin"/>
-        </w:r>
-        <w:r>
-          <w:rPr>
-            <w:noProof/>
-            <w:webHidden/>
-          </w:rPr>
-          <w:instrText xml:space="preserve"> PAGEREF _Toc232582524 \h </w:instrText>
-        </w:r>
-        <w:r>
-          <w:rPr>
-            <w:noProof/>
-            <w:webHidden/>
-          </w:rPr>
-        </w:r>
-        <w:r>
-          <w:rPr>
-            <w:noProof/>
-            <w:webHidden/>
-          </w:rPr>
-          <w:fldChar w:fldCharType="separate"/>
-        </w:r>
-        <w:r>
-          <w:rPr>
-            <w:noProof/>
-            <w:webHidden/>
-          </w:rPr>
-          <w:t>7</w:t>
-        </w:r>
-        <w:r>
-          <w:rPr>
-            <w:noProof/>
-            <w:webHidden/>
-          </w:rPr>
-          <w:fldChar w:fldCharType="end"/>
-        </w:r>
-      </w:hyperlink>
-    </w:p>
-    <w:p>
-      <w:pPr>
-        <w:pStyle w:val="TM2"/>
-        <w:tabs>
-          <w:tab w:val="right" w:leader="dot" w:pos="9060"/>
-        </w:tabs>
-        <w:rPr>
-          <w:rFonts w:eastAsiaTheme="minorEastAsia" w:cstheme="minorBidi"/>
-          <w:noProof/>
-          <w:kern w:val="2"/>
-          <w:sz w:val="24"/>
-          <w:szCs w:val="24"/>
-          <w14:ligatures w14:val="standardContextual"/>
-        </w:rPr>
-      </w:pPr>
-      <w:hyperlink w:anchor="_Toc232582525" w:history="1">
-        <w:r>
-          <w:rPr>
-            <w:rStyle w:val="Lienhypertexte"/>
-            <w:noProof/>
-          </w:rPr>
-          <w:t>Bilan des fonctionnalités demandées</w:t>
-        </w:r>
-        <w:r>
-          <w:rPr>
-            <w:noProof/>
-            <w:webHidden/>
-          </w:rPr>
-          <w:tab/>
-        </w:r>
-        <w:r>
-          <w:rPr>
-            <w:noProof/>
-            <w:webHidden/>
-          </w:rPr>
-          <w:fldChar w:fldCharType="begin"/>
-        </w:r>
-        <w:r>
-          <w:rPr>
-            <w:noProof/>
-            <w:webHidden/>
-          </w:rPr>
-          <w:instrText xml:space="preserve"> PAGEREF _Toc232582525 \h </w:instrText>
-        </w:r>
-        <w:r>
-          <w:rPr>
-            <w:noProof/>
-            <w:webHidden/>
-          </w:rPr>
-        </w:r>
-        <w:r>
-          <w:rPr>
-            <w:noProof/>
-            <w:webHidden/>
-          </w:rPr>
-          <w:fldChar w:fldCharType="separate"/>
-        </w:r>
-        <w:r>
-          <w:rPr>
-            <w:noProof/>
-            <w:webHidden/>
-          </w:rPr>
-          <w:t>7</w:t>
-        </w:r>
-        <w:r>
-          <w:rPr>
-            <w:noProof/>
-            <w:webHidden/>
-          </w:rPr>
-          <w:fldChar w:fldCharType="end"/>
-        </w:r>
-      </w:hyperlink>
-    </w:p>
-    <w:p>
-      <w:pPr>
-        <w:pStyle w:val="TM2"/>
-        <w:tabs>
-          <w:tab w:val="right" w:leader="dot" w:pos="9060"/>
-        </w:tabs>
-        <w:rPr>
-          <w:rFonts w:eastAsiaTheme="minorEastAsia" w:cstheme="minorBidi"/>
-          <w:noProof/>
-          <w:kern w:val="2"/>
-          <w:sz w:val="24"/>
-          <w:szCs w:val="24"/>
-          <w14:ligatures w14:val="standardContextual"/>
-        </w:rPr>
-      </w:pPr>
-      <w:hyperlink w:anchor="_Toc232582526" w:history="1">
-        <w:r>
-          <w:rPr>
-            <w:rStyle w:val="Lienhypertexte"/>
-            <w:noProof/>
-          </w:rPr>
-          <w:t>Bilan personnel</w:t>
-        </w:r>
-        <w:r>
-          <w:rPr>
-            <w:noProof/>
-            <w:webHidden/>
-          </w:rPr>
-          <w:tab/>
-        </w:r>
-        <w:r>
-          <w:rPr>
-            <w:noProof/>
-            <w:webHidden/>
-          </w:rPr>
-          <w:fldChar w:fldCharType="begin"/>
-        </w:r>
-        <w:r>
-          <w:rPr>
-            <w:noProof/>
-            <w:webHidden/>
-          </w:rPr>
-          <w:instrText xml:space="preserve"> PAGEREF _Toc232582526 \h </w:instrText>
-        </w:r>
-        <w:r>
-          <w:rPr>
-            <w:noProof/>
-            <w:webHidden/>
-          </w:rPr>
-        </w:r>
-        <w:r>
-          <w:rPr>
-            <w:noProof/>
-            <w:webHidden/>
-          </w:rPr>
-          <w:fldChar w:fldCharType="separate"/>
-        </w:r>
-        <w:r>
-          <w:rPr>
-            <w:noProof/>
-            <w:webHidden/>
-          </w:rPr>
-          <w:t>7</w:t>
-        </w:r>
-        <w:r>
-          <w:rPr>
-            <w:noProof/>
-            <w:webHidden/>
-          </w:rPr>
-          <w:fldChar w:fldCharType="end"/>
-        </w:r>
-      </w:hyperlink>
-    </w:p>
-    <w:p>
-      <w:pPr>
-        <w:pStyle w:val="TM1"/>
-        <w:tabs>
-          <w:tab w:val="right" w:leader="dot" w:pos="9060"/>
-        </w:tabs>
-        <w:rPr>
-          <w:rFonts w:eastAsiaTheme="minorEastAsia" w:cstheme="minorBidi"/>
-          <w:noProof/>
-          <w:kern w:val="2"/>
-          <w:sz w:val="24"/>
-          <w:szCs w:val="24"/>
-          <w14:ligatures w14:val="standardContextual"/>
-        </w:rPr>
-      </w:pPr>
-      <w:hyperlink w:anchor="_Toc232582527" w:history="1">
-        <w:r>
-          <w:rPr>
-            <w:rStyle w:val="Lienhypertexte"/>
-            <w:noProof/>
-          </w:rPr>
-          <w:t>Divers</w:t>
-        </w:r>
-        <w:r>
-          <w:rPr>
-            <w:noProof/>
-            <w:webHidden/>
-          </w:rPr>
-          <w:tab/>
-        </w:r>
-        <w:r>
-          <w:rPr>
-            <w:noProof/>
-            <w:webHidden/>
-          </w:rPr>
-          <w:fldChar w:fldCharType="begin"/>
-        </w:r>
-        <w:r>
-          <w:rPr>
-            <w:noProof/>
-            <w:webHidden/>
-          </w:rPr>
-          <w:instrText xml:space="preserve"> PAGEREF _Toc232582527 \h </w:instrText>
-        </w:r>
-        <w:r>
-          <w:rPr>
-            <w:noProof/>
-            <w:webHidden/>
-          </w:rPr>
-        </w:r>
-        <w:r>
-          <w:rPr>
-            <w:noProof/>
-            <w:webHidden/>
-          </w:rPr>
-          <w:fldChar w:fldCharType="separate"/>
-        </w:r>
-        <w:r>
-          <w:rPr>
-            <w:noProof/>
-            <w:webHidden/>
-          </w:rPr>
-          <w:t>7</w:t>
-        </w:r>
-        <w:r>
-          <w:rPr>
-            <w:noProof/>
-            <w:webHidden/>
-          </w:rPr>
-          <w:fldChar w:fldCharType="end"/>
-        </w:r>
-      </w:hyperlink>
-    </w:p>
-    <w:p>
-      <w:pPr>
-        <w:pStyle w:val="TM2"/>
-        <w:tabs>
-          <w:tab w:val="right" w:leader="dot" w:pos="9060"/>
-        </w:tabs>
-        <w:rPr>
-          <w:rFonts w:eastAsiaTheme="minorEastAsia" w:cstheme="minorBidi"/>
-          <w:noProof/>
-          <w:kern w:val="2"/>
-          <w:sz w:val="24"/>
-          <w:szCs w:val="24"/>
-          <w14:ligatures w14:val="standardContextual"/>
-        </w:rPr>
-      </w:pPr>
-      <w:hyperlink w:anchor="_Toc232582528" w:history="1">
-        <w:r>
-          <w:rPr>
-            <w:rStyle w:val="Lienhypertexte"/>
-            <w:noProof/>
-          </w:rPr>
-          <w:t>Journal de travail</w:t>
-        </w:r>
-        <w:r>
-          <w:rPr>
-            <w:noProof/>
-            <w:webHidden/>
-          </w:rPr>
-          <w:tab/>
-        </w:r>
-        <w:r>
-          <w:rPr>
-            <w:noProof/>
-            <w:webHidden/>
-          </w:rPr>
-          <w:fldChar w:fldCharType="begin"/>
-        </w:r>
-        <w:r>
-          <w:rPr>
-            <w:noProof/>
-            <w:webHidden/>
-          </w:rPr>
-          <w:instrText xml:space="preserve"> PAGEREF _Toc232582528 \h </w:instrText>
-        </w:r>
-        <w:r>
-          <w:rPr>
-            <w:noProof/>
-            <w:webHidden/>
-          </w:rPr>
-        </w:r>
-        <w:r>
-          <w:rPr>
-            <w:noProof/>
-            <w:webHidden/>
-          </w:rPr>
-          <w:fldChar w:fldCharType="separate"/>
-        </w:r>
-        <w:r>
-          <w:rPr>
-            <w:noProof/>
-            <w:webHidden/>
-          </w:rPr>
-          <w:t>7</w:t>
-        </w:r>
-        <w:r>
-          <w:rPr>
-            <w:noProof/>
-            <w:webHidden/>
-          </w:rPr>
-          <w:fldChar w:fldCharType="end"/>
-        </w:r>
-      </w:hyperlink>
-    </w:p>
-    <w:p>
-      <w:pPr>
-        <w:pStyle w:val="TM2"/>
-        <w:tabs>
-          <w:tab w:val="right" w:leader="dot" w:pos="9060"/>
-        </w:tabs>
-        <w:rPr>
-          <w:rFonts w:eastAsiaTheme="minorEastAsia" w:cstheme="minorBidi"/>
-          <w:noProof/>
-          <w:kern w:val="2"/>
-          <w:sz w:val="24"/>
-          <w:szCs w:val="24"/>
-          <w14:ligatures w14:val="standardContextual"/>
-        </w:rPr>
-      </w:pPr>
-      <w:hyperlink w:anchor="_Toc232582529" w:history="1">
-        <w:r>
-          <w:rPr>
-            <w:rStyle w:val="Lienhypertexte"/>
-            <w:noProof/>
-          </w:rPr>
-          <w:t>Votre jou</w:t>
-        </w:r>
-        <w:r>
-          <w:rPr>
-            <w:rStyle w:val="Lienhypertexte"/>
-            <w:noProof/>
-          </w:rPr>
-          <w:t>r</w:t>
-        </w:r>
-        <w:r>
-          <w:rPr>
-            <w:rStyle w:val="Lienhypertexte"/>
-            <w:noProof/>
-          </w:rPr>
-          <w:t xml:space="preserve">nal de travail est basé sur </w:t>
-        </w:r>
-        <w:r>
-          <w:rPr>
-            <w:rStyle w:val="Lienhypertexte"/>
-            <w:i/>
-            <w:iCs/>
-            <w:noProof/>
-          </w:rPr>
-          <w:t>« T-Psys-part3-NomPrenom-jdt.txt »</w:t>
-        </w:r>
-        <w:r>
-          <w:rPr>
-            <w:noProof/>
-            <w:webHidden/>
-          </w:rPr>
-          <w:tab/>
-        </w:r>
-        <w:r>
-          <w:rPr>
-            <w:noProof/>
-            <w:webHidden/>
-          </w:rPr>
-          <w:fldChar w:fldCharType="begin"/>
-        </w:r>
-        <w:r>
-          <w:rPr>
-            <w:noProof/>
-            <w:webHidden/>
-          </w:rPr>
-          <w:instrText xml:space="preserve"> PAGEREF _Toc232582529 \h </w:instrText>
-        </w:r>
-        <w:r>
-          <w:rPr>
-            <w:noProof/>
-            <w:webHidden/>
-          </w:rPr>
-        </w:r>
-        <w:r>
-          <w:rPr>
-            <w:noProof/>
-            <w:webHidden/>
-          </w:rPr>
-          <w:fldChar w:fldCharType="separate"/>
-        </w:r>
-        <w:r>
-          <w:rPr>
-            <w:noProof/>
-            <w:webHidden/>
-          </w:rPr>
-          <w:t>7</w:t>
-        </w:r>
-        <w:r>
-          <w:rPr>
-            <w:noProof/>
-            <w:webHidden/>
-          </w:rPr>
-          <w:fldChar w:fldCharType="end"/>
-        </w:r>
-      </w:hyperlink>
-    </w:p>
-    <w:p>
-      <w:pPr>
-        <w:pStyle w:val="TM1"/>
-        <w:tabs>
-          <w:tab w:val="right" w:leader="dot" w:pos="9060"/>
-        </w:tabs>
-        <w:rPr>
-          <w:rFonts w:eastAsiaTheme="minorEastAsia" w:cstheme="minorBidi"/>
-          <w:noProof/>
-          <w:kern w:val="2"/>
-          <w:sz w:val="24"/>
-          <w:szCs w:val="24"/>
-          <w14:ligatures w14:val="standardContextual"/>
-        </w:rPr>
-      </w:pPr>
-      <w:hyperlink w:anchor="_Toc232582530" w:history="1">
-        <w:r>
-          <w:rPr>
-            <w:rStyle w:val="Lienhypertexte"/>
-            <w:noProof/>
-          </w:rPr>
-          <w:t>Annexes</w:t>
-        </w:r>
-        <w:r>
-          <w:rPr>
-            <w:noProof/>
-            <w:webHidden/>
-          </w:rPr>
-          <w:tab/>
-        </w:r>
-        <w:r>
-          <w:rPr>
-            <w:noProof/>
-            <w:webHidden/>
-          </w:rPr>
-          <w:fldChar w:fldCharType="begin"/>
-        </w:r>
-        <w:r>
-          <w:rPr>
-            <w:noProof/>
-            <w:webHidden/>
-          </w:rPr>
-          <w:instrText xml:space="preserve"> PAGEREF _Toc232582530 \h </w:instrText>
-        </w:r>
-        <w:r>
-          <w:rPr>
-            <w:noProof/>
-            <w:webHidden/>
-          </w:rPr>
-        </w:r>
-        <w:r>
-          <w:rPr>
-            <w:noProof/>
-            <w:webHidden/>
-          </w:rPr>
-          <w:fldChar w:fldCharType="separate"/>
-        </w:r>
-        <w:r>
-          <w:rPr>
-            <w:noProof/>
-            <w:webHidden/>
-          </w:rPr>
-          <w:t>7</w:t>
+          <w:t>8</w:t>
         </w:r>
         <w:r>
           <w:rPr>
@@ -1746,7 +1504,7 @@
       </w:pPr>
       <w:bookmarkStart w:id="0" w:name="_Toc532179955"/>
       <w:bookmarkStart w:id="1" w:name="_Toc165969637"/>
-      <w:bookmarkStart w:id="2" w:name="_Toc232582510"/>
+      <w:bookmarkStart w:id="2" w:name="_Toc232586080"/>
       <w:r>
         <w:lastRenderedPageBreak/>
         <w:t>Spécifications</w:t>
@@ -1761,7 +1519,7 @@
       </w:pPr>
       <w:bookmarkStart w:id="3" w:name="_Toc532179969"/>
       <w:bookmarkStart w:id="4" w:name="_Toc165969639"/>
-      <w:bookmarkStart w:id="5" w:name="_Toc232582511"/>
+      <w:bookmarkStart w:id="5" w:name="_Toc232586081"/>
       <w:r>
         <w:t>Titre</w:t>
       </w:r>
@@ -1770,6 +1528,7 @@
     <w:p>
       <w:pPr>
         <w:pStyle w:val="Retraitcorpsdetexte"/>
+        <w:ind w:left="0"/>
       </w:pPr>
       <w:r>
         <w:t>AgaMoon</w:t>
@@ -1779,7 +1538,7 @@
       <w:pPr>
         <w:pStyle w:val="Titre2"/>
       </w:pPr>
-      <w:bookmarkStart w:id="6" w:name="_Toc232582512"/>
+      <w:bookmarkStart w:id="6" w:name="_Toc232586082"/>
       <w:r>
         <w:t>Description</w:t>
       </w:r>
@@ -1790,16 +1549,7 @@
         <w:pStyle w:val="Retraitcorpsdetexte"/>
       </w:pPr>
       <w:r>
-        <w:t xml:space="preserve">Site </w:t>
-      </w:r>
-      <w:r>
-        <w:t>web éducatif sur la Lune, réalisé durant le DemoMot 2025-2026</w:t>
-      </w:r>
-      <w:r>
-        <w:t>. Il est</w:t>
-      </w:r>
-      <w:r>
-        <w:t xml:space="preserve"> dédié à la Lune : </w:t>
+        <w:t xml:space="preserve">Site web éducatif sur la Lune, réalisé durant le DemoMot 2025-2026. Il est dédié à la Lune : </w:t>
       </w:r>
     </w:p>
     <w:p>
@@ -1811,10 +1561,7 @@
         </w:numPr>
       </w:pPr>
       <w:r>
-        <w:t>Données</w:t>
-      </w:r>
-      <w:r>
-        <w:t xml:space="preserve"> scientifiques</w:t>
+        <w:t>Données scientifiques</w:t>
       </w:r>
     </w:p>
     <w:p>
@@ -1826,10 +1573,7 @@
         </w:numPr>
       </w:pPr>
       <w:r>
-        <w:t>Phases</w:t>
-      </w:r>
-      <w:r>
-        <w:t xml:space="preserve"> lunaires</w:t>
+        <w:t>Phases lunaires</w:t>
       </w:r>
     </w:p>
     <w:p>
@@ -1841,10 +1585,7 @@
         </w:numPr>
       </w:pPr>
       <w:r>
-        <w:t>Histoire</w:t>
-      </w:r>
-      <w:r>
-        <w:t xml:space="preserve"> de l'exploration spatiale</w:t>
+        <w:t>Histoire de l'exploration spatiale</w:t>
       </w:r>
     </w:p>
     <w:p>
@@ -1856,10 +1597,7 @@
         </w:numPr>
       </w:pPr>
       <w:r>
-        <w:t>Galerie</w:t>
-      </w:r>
-      <w:r>
-        <w:t xml:space="preserve"> photo personnelle prise à l'iPhone 16 et au Samsung S24 Ultra.</w:t>
+        <w:t xml:space="preserve">Galerie photo personnelle </w:t>
       </w:r>
     </w:p>
     <w:p>
@@ -1884,7 +1622,7 @@
       <w:pPr>
         <w:pStyle w:val="Titre2"/>
       </w:pPr>
-      <w:bookmarkStart w:id="7" w:name="_Toc232582513"/>
+      <w:bookmarkStart w:id="7" w:name="_Toc232586083"/>
       <w:r>
         <w:t>Matériel et logiciels à disposition</w:t>
       </w:r>
@@ -1930,7 +1668,7 @@
       <w:pPr>
         <w:pStyle w:val="Titre2"/>
       </w:pPr>
-      <w:bookmarkStart w:id="8" w:name="_Toc232582514"/>
+      <w:bookmarkStart w:id="8" w:name="_Toc232586084"/>
       <w:r>
         <w:t>Prérequis</w:t>
       </w:r>
@@ -1939,6 +1677,7 @@
     <w:p>
       <w:pPr>
         <w:pStyle w:val="Retraitcorpsdetexte"/>
+        <w:ind w:left="0"/>
       </w:pPr>
       <w:r>
         <w:t>Être motivé</w:t>
@@ -1951,7 +1690,7 @@
       <w:pPr>
         <w:pStyle w:val="Titre1"/>
       </w:pPr>
-      <w:bookmarkStart w:id="9" w:name="_Toc232582515"/>
+      <w:bookmarkStart w:id="9" w:name="_Toc232586085"/>
       <w:r>
         <w:t>Cahier des charges</w:t>
       </w:r>
@@ -1961,11 +1700,144 @@
       <w:pPr>
         <w:pStyle w:val="Titre2"/>
       </w:pPr>
-      <w:bookmarkStart w:id="10" w:name="_Toc232582516"/>
+      <w:bookmarkStart w:id="10" w:name="_Toc232586086"/>
       <w:r>
         <w:t>Objectifs et portée du projet (objectifs SMART)</w:t>
       </w:r>
       <w:bookmarkEnd w:id="10"/>
+    </w:p>
+    <w:p>
+      <w:pPr>
+        <w:pStyle w:val="Retraitcorpsdetexte3"/>
+        <w:ind w:left="0"/>
+        <w:rPr>
+          <w:szCs w:val="20"/>
+        </w:rPr>
+      </w:pPr>
+      <w:r>
+        <w:rPr>
+          <w:szCs w:val="20"/>
+        </w:rPr>
+        <w:t>Le but c’est de</w:t>
+      </w:r>
+      <w:r>
+        <w:rPr>
+          <w:szCs w:val="20"/>
+        </w:rPr>
+        <w:t xml:space="preserve"> créer un site sur une de mes passions : l’espace et plus précisément sur la Lune</w:t>
+      </w:r>
+      <w:r>
+        <w:rPr>
+          <w:szCs w:val="20"/>
+        </w:rPr>
+        <w:t>.</w:t>
+      </w:r>
+    </w:p>
+    <w:p>
+      <w:pPr>
+        <w:pStyle w:val="Retraitcorpsdetexte3"/>
+        <w:ind w:left="0"/>
+        <w:rPr>
+          <w:szCs w:val="20"/>
+        </w:rPr>
+      </w:pPr>
+      <w:r>
+        <w:rPr>
+          <w:szCs w:val="20"/>
+        </w:rPr>
+        <w:t>A</w:t>
+      </w:r>
+      <w:r>
+        <w:rPr>
+          <w:szCs w:val="20"/>
+        </w:rPr>
+        <w:t>pprendre des notions sur la Lune et de faire découvrir à d’autres personnes.</w:t>
+      </w:r>
+    </w:p>
+    <w:p>
+      <w:pPr>
+        <w:pStyle w:val="Titre2"/>
+      </w:pPr>
+      <w:bookmarkStart w:id="11" w:name="_Toc232586087"/>
+      <w:r>
+        <w:t>Fonctionnalités requises</w:t>
+      </w:r>
+      <w:bookmarkEnd w:id="11"/>
+    </w:p>
+    <w:p>
+      <w:pPr>
+        <w:pStyle w:val="Retraitcorpsdetexte3"/>
+        <w:numPr>
+          <w:ilvl w:val="0"/>
+          <w:numId w:val="7"/>
+        </w:numPr>
+      </w:pPr>
+      <w:r>
+        <w:t>Afficher des informations générales sur la Lune.</w:t>
+      </w:r>
+    </w:p>
+    <w:p>
+      <w:pPr>
+        <w:pStyle w:val="Retraitcorpsdetexte3"/>
+        <w:numPr>
+          <w:ilvl w:val="0"/>
+          <w:numId w:val="7"/>
+        </w:numPr>
+      </w:pPr>
+      <w:r>
+        <w:t>Présenter les huit phases lunaires avec une illustration pour chacune.</w:t>
+      </w:r>
+    </w:p>
+    <w:p>
+      <w:pPr>
+        <w:pStyle w:val="Retraitcorpsdetexte3"/>
+        <w:numPr>
+          <w:ilvl w:val="0"/>
+          <w:numId w:val="7"/>
+        </w:numPr>
+      </w:pPr>
+      <w:r>
+        <w:t>Mettre à disposition une galerie de photographies de la Lune.</w:t>
+      </w:r>
+    </w:p>
+    <w:p>
+      <w:pPr>
+        <w:pStyle w:val="Retraitcorpsdetexte3"/>
+        <w:numPr>
+          <w:ilvl w:val="0"/>
+          <w:numId w:val="7"/>
+        </w:numPr>
+      </w:pPr>
+      <w:r>
+        <w:t>Avoir</w:t>
+      </w:r>
+      <w:r>
+        <w:t xml:space="preserve"> une navigation simple et intuitive sur une seule page.</w:t>
+      </w:r>
+    </w:p>
+    <w:p>
+      <w:pPr>
+        <w:pStyle w:val="Retraitcorpsdetexte3"/>
+        <w:numPr>
+          <w:ilvl w:val="0"/>
+          <w:numId w:val="7"/>
+        </w:numPr>
+      </w:pPr>
+      <w:r>
+        <w:t>Être accessible depuis un navigateur web.</w:t>
+      </w:r>
+    </w:p>
+    <w:p>
+      <w:pPr>
+        <w:pStyle w:val="Retraitcorpsdetexte3"/>
+        <w:numPr>
+          <w:ilvl w:val="0"/>
+          <w:numId w:val="7"/>
+        </w:numPr>
+      </w:pPr>
+      <w:r>
+        <w:t>Être Responsive</w:t>
+      </w:r>
     </w:p>
     <w:p>
       <w:pPr>
@@ -1975,155 +1847,12 @@
           <w:szCs w:val="20"/>
         </w:rPr>
       </w:pPr>
-      <w:r>
-        <w:rPr>
-          <w:szCs w:val="20"/>
-        </w:rPr>
-        <w:t>Le but c’est de</w:t>
-      </w:r>
-      <w:r>
-        <w:rPr>
-          <w:szCs w:val="20"/>
-        </w:rPr>
-        <w:t xml:space="preserve"> créer un site sur une de mes passions : l’espace et plus précisément sur la Lune</w:t>
-      </w:r>
-      <w:r>
-        <w:rPr>
-          <w:szCs w:val="20"/>
-        </w:rPr>
-        <w:t>.</w:t>
-      </w:r>
-    </w:p>
-    <w:p>
-      <w:pPr>
-        <w:pStyle w:val="Retraitcorpsdetexte3"/>
-        <w:ind w:left="1134"/>
-        <w:rPr>
-          <w:szCs w:val="20"/>
-        </w:rPr>
-      </w:pPr>
-      <w:r>
-        <w:rPr>
-          <w:szCs w:val="20"/>
-        </w:rPr>
-        <w:t>A</w:t>
-      </w:r>
-      <w:r>
-        <w:rPr>
-          <w:szCs w:val="20"/>
-        </w:rPr>
-        <w:t>pprendre des notions sur la Lune et de faire découvrir à d’autres personnes.</w:t>
-      </w:r>
-    </w:p>
-    <w:p>
-      <w:pPr>
-        <w:pStyle w:val="Titre2"/>
-      </w:pPr>
-      <w:bookmarkStart w:id="11" w:name="_Toc232582517"/>
-      <w:r>
-        <w:t>Fonctionnalités requises</w:t>
-      </w:r>
-      <w:bookmarkEnd w:id="11"/>
-    </w:p>
-    <w:p>
-      <w:pPr>
-        <w:pStyle w:val="Retraitcorpsdetexte3"/>
-        <w:numPr>
-          <w:ilvl w:val="0"/>
-          <w:numId w:val="7"/>
-        </w:numPr>
-      </w:pPr>
-      <w:r>
-        <w:t>Afficher des informations générales sur la Lune.</w:t>
-      </w:r>
-    </w:p>
-    <w:p>
-      <w:pPr>
-        <w:pStyle w:val="Retraitcorpsdetexte3"/>
-        <w:numPr>
-          <w:ilvl w:val="0"/>
-          <w:numId w:val="7"/>
-        </w:numPr>
-      </w:pPr>
-      <w:r>
-        <w:t>Présenter les huit phases lunaires avec une illustration pour chacune.</w:t>
-      </w:r>
-    </w:p>
-    <w:p>
-      <w:pPr>
-        <w:pStyle w:val="Retraitcorpsdetexte3"/>
-        <w:numPr>
-          <w:ilvl w:val="0"/>
-          <w:numId w:val="7"/>
-        </w:numPr>
-      </w:pPr>
-      <w:r>
-        <w:t>Mettre à disposition une galerie de photographies de la Lune.</w:t>
-      </w:r>
-    </w:p>
-    <w:p>
-      <w:pPr>
-        <w:pStyle w:val="Retraitcorpsdetexte3"/>
-        <w:numPr>
-          <w:ilvl w:val="0"/>
-          <w:numId w:val="7"/>
-        </w:numPr>
-      </w:pPr>
-      <w:r>
-        <w:t>Avoir</w:t>
-      </w:r>
-      <w:r>
-        <w:t xml:space="preserve"> une navigation simple et intuitive sur une seule page.</w:t>
-      </w:r>
-    </w:p>
-    <w:p>
-      <w:pPr>
-        <w:pStyle w:val="Retraitcorpsdetexte3"/>
-        <w:numPr>
-          <w:ilvl w:val="0"/>
-          <w:numId w:val="7"/>
-        </w:numPr>
-      </w:pPr>
-      <w:r>
-        <w:t>Être accessible depuis un navigateur web.</w:t>
-      </w:r>
-    </w:p>
-    <w:p>
-      <w:pPr>
-        <w:pStyle w:val="Retraitcorpsdetexte3"/>
-        <w:numPr>
-          <w:ilvl w:val="0"/>
-          <w:numId w:val="7"/>
-        </w:numPr>
-      </w:pPr>
-      <w:r>
-        <w:t>Être Responsive</w:t>
-      </w:r>
-    </w:p>
-    <w:p>
-      <w:pPr>
-        <w:pStyle w:val="Retraitcorpsdetexte3"/>
-        <w:ind w:left="1134"/>
-        <w:rPr>
-          <w:szCs w:val="20"/>
-        </w:rPr>
-      </w:pPr>
-    </w:p>
-    <w:p>
-      <w:pPr>
-        <w:pStyle w:val="Titre2"/>
-      </w:pPr>
-      <w:bookmarkStart w:id="12" w:name="_Toc232582518"/>
-      <w:r>
-        <w:t>Travail à réaliser par l'apprenti</w:t>
-      </w:r>
-      <w:bookmarkEnd w:id="12"/>
     </w:p>
     <w:p>
       <w:pPr>
         <w:pStyle w:val="Titre1"/>
       </w:pPr>
-      <w:bookmarkStart w:id="13" w:name="_Toc232582519"/>
+      <w:bookmarkStart w:id="12" w:name="_Toc232586088"/>
       <w:r>
         <w:t>Planification</w:t>
       </w:r>
@@ -2132,7 +1861,7 @@
       <w:r>
         <w:t xml:space="preserve"> Initiale</w:t>
       </w:r>
-      <w:bookmarkEnd w:id="13"/>
+      <w:bookmarkEnd w:id="12"/>
     </w:p>
     <w:p>
       <w:pPr>
@@ -2147,7 +1876,6 @@
         <w:spacing w:after="120"/>
       </w:pPr>
       <w:r>
-        <w:lastRenderedPageBreak/>
         <w:t>Fin du projet : 26.6.26</w:t>
       </w:r>
     </w:p>
@@ -2200,6 +1928,7 @@
               <w:rPr>
                 <w:color w:val="FFFFFF"/>
               </w:rPr>
+              <w:lastRenderedPageBreak/>
               <w:t>Étape</w:t>
             </w:r>
           </w:p>
@@ -3047,6 +2776,103 @@
               <w:bottom w:val="single" w:sz="1" w:space="0" w:color="CCCCCC"/>
               <w:right w:val="single" w:sz="1" w:space="0" w:color="CCCCCC"/>
             </w:tcBorders>
+            <w:shd w:val="clear" w:color="auto" w:fill="F2F2F2"/>
+            <w:tcMar>
+              <w:top w:w="80" w:type="dxa"/>
+              <w:left w:w="120" w:type="dxa"/>
+              <w:bottom w:w="80" w:type="dxa"/>
+              <w:right w:w="120" w:type="dxa"/>
+            </w:tcMar>
+          </w:tcPr>
+          <w:p>
+            <w:r>
+              <w:t>Projet Personnel</w:t>
+            </w:r>
+          </w:p>
+        </w:tc>
+        <w:tc>
+          <w:tcPr>
+            <w:tcW w:w="1800" w:type="dxa"/>
+            <w:tcBorders>
+              <w:top w:val="single" w:sz="1" w:space="0" w:color="CCCCCC"/>
+              <w:left w:val="single" w:sz="1" w:space="0" w:color="CCCCCC"/>
+              <w:bottom w:val="single" w:sz="1" w:space="0" w:color="CCCCCC"/>
+              <w:right w:val="single" w:sz="1" w:space="0" w:color="CCCCCC"/>
+            </w:tcBorders>
+            <w:shd w:val="clear" w:color="auto" w:fill="F2F2F2"/>
+            <w:tcMar>
+              <w:top w:w="80" w:type="dxa"/>
+              <w:left w:w="120" w:type="dxa"/>
+              <w:bottom w:w="80" w:type="dxa"/>
+              <w:right w:w="120" w:type="dxa"/>
+            </w:tcMar>
+          </w:tcPr>
+          <w:p>
+            <w:r>
+              <w:t>Le temps qui reste</w:t>
+            </w:r>
+          </w:p>
+        </w:tc>
+        <w:tc>
+          <w:tcPr>
+            <w:tcW w:w="1300" w:type="dxa"/>
+            <w:tcBorders>
+              <w:top w:val="single" w:sz="1" w:space="0" w:color="CCCCCC"/>
+              <w:left w:val="single" w:sz="1" w:space="0" w:color="CCCCCC"/>
+              <w:bottom w:val="single" w:sz="1" w:space="0" w:color="CCCCCC"/>
+              <w:right w:val="single" w:sz="1" w:space="0" w:color="CCCCCC"/>
+            </w:tcBorders>
+            <w:shd w:val="clear" w:color="auto" w:fill="F2F2F2"/>
+            <w:tcMar>
+              <w:top w:w="80" w:type="dxa"/>
+              <w:left w:w="120" w:type="dxa"/>
+              <w:bottom w:w="80" w:type="dxa"/>
+              <w:right w:w="120" w:type="dxa"/>
+            </w:tcMar>
+          </w:tcPr>
+          <w:p>
+            <w:r>
+              <w:t>04.06.26</w:t>
+            </w:r>
+            <w:r>
+              <w:t xml:space="preserve"> – 24.06.26</w:t>
+            </w:r>
+          </w:p>
+        </w:tc>
+        <w:tc>
+          <w:tcPr>
+            <w:tcW w:w="3426" w:type="dxa"/>
+            <w:tcBorders>
+              <w:top w:val="single" w:sz="1" w:space="0" w:color="CCCCCC"/>
+              <w:left w:val="single" w:sz="1" w:space="0" w:color="CCCCCC"/>
+              <w:bottom w:val="single" w:sz="1" w:space="0" w:color="CCCCCC"/>
+              <w:right w:val="single" w:sz="1" w:space="0" w:color="CCCCCC"/>
+            </w:tcBorders>
+            <w:shd w:val="clear" w:color="auto" w:fill="F2F2F2"/>
+            <w:tcMar>
+              <w:top w:w="80" w:type="dxa"/>
+              <w:left w:w="120" w:type="dxa"/>
+              <w:bottom w:w="80" w:type="dxa"/>
+              <w:right w:w="120" w:type="dxa"/>
+            </w:tcMar>
+          </w:tcPr>
+          <w:p>
+            <w:r>
+              <w:t>Création d’un projet personnel dans le cadre du DemoMot</w:t>
+            </w:r>
+          </w:p>
+        </w:tc>
+      </w:tr>
+      <w:tr>
+        <w:tc>
+          <w:tcPr>
+            <w:tcW w:w="2500" w:type="dxa"/>
+            <w:tcBorders>
+              <w:top w:val="single" w:sz="1" w:space="0" w:color="CCCCCC"/>
+              <w:left w:val="single" w:sz="1" w:space="0" w:color="CCCCCC"/>
+              <w:bottom w:val="single" w:sz="1" w:space="0" w:color="CCCCCC"/>
+              <w:right w:val="single" w:sz="1" w:space="0" w:color="CCCCCC"/>
+            </w:tcBorders>
             <w:shd w:val="clear" w:color="auto" w:fill="FFFFFF"/>
             <w:tcMar>
               <w:top w:w="80" w:type="dxa"/>
@@ -3103,7 +2929,10 @@
           </w:tcPr>
           <w:p>
             <w:r>
-              <w:t>04.06.26</w:t>
+              <w:t>24</w:t>
+            </w:r>
+            <w:r>
+              <w:t>.06.26</w:t>
             </w:r>
           </w:p>
         </w:tc>
@@ -3126,7 +2955,10 @@
           </w:tcPr>
           <w:p>
             <w:r>
-              <w:t>Présenter le projet et faire jouer la classe</w:t>
+              <w:t xml:space="preserve">Présenter le projet </w:t>
+            </w:r>
+            <w:r>
+              <w:t>DemoMot et mon projet personnel + faire jouer la classe</w:t>
             </w:r>
           </w:p>
         </w:tc>
@@ -3136,11 +2968,11 @@
       <w:pPr>
         <w:pStyle w:val="Titre1"/>
       </w:pPr>
-      <w:bookmarkStart w:id="14" w:name="_Toc232582520"/>
+      <w:bookmarkStart w:id="13" w:name="_Toc232586089"/>
       <w:r>
         <w:t>Journal de travail</w:t>
       </w:r>
-      <w:bookmarkEnd w:id="14"/>
+      <w:bookmarkEnd w:id="13"/>
     </w:p>
     <w:p>
       <w:pPr>
@@ -3181,8 +3013,7 @@
         <w:gridCol w:w="13"/>
         <w:gridCol w:w="1285"/>
         <w:gridCol w:w="13"/>
-        <w:gridCol w:w="1289"/>
-        <w:gridCol w:w="69"/>
+        <w:gridCol w:w="1358"/>
       </w:tblGrid>
       <w:tr>
         <w:trPr>
@@ -3244,7 +3075,7 @@
         <w:tc>
           <w:tcPr>
             <w:tcW w:w="1371" w:type="dxa"/>
-            <w:gridSpan w:val="3"/>
+            <w:gridSpan w:val="2"/>
             <w:tcBorders>
               <w:top w:val="single" w:sz="1" w:space="0" w:color="CCCCCC"/>
               <w:left w:val="single" w:sz="1" w:space="0" w:color="CCCCCC"/>
@@ -3270,10 +3101,6 @@
         </w:tc>
       </w:tr>
       <w:tr>
-        <w:trPr>
-          <w:gridAfter w:val="1"/>
-          <w:wAfter w:w="69" w:type="dxa"/>
-        </w:trPr>
         <w:tc>
           <w:tcPr>
             <w:tcW w:w="3016" w:type="dxa"/>
@@ -3324,7 +3151,7 @@
         </w:tc>
         <w:tc>
           <w:tcPr>
-            <w:tcW w:w="1289" w:type="dxa"/>
+            <w:tcW w:w="1358" w:type="dxa"/>
             <w:tcBorders>
               <w:top w:val="single" w:sz="1" w:space="0" w:color="CCCCCC"/>
               <w:left w:val="single" w:sz="1" w:space="0" w:color="CCCCCC"/>
@@ -3348,10 +3175,6 @@
         </w:tc>
       </w:tr>
       <w:tr>
-        <w:trPr>
-          <w:gridAfter w:val="1"/>
-          <w:wAfter w:w="69" w:type="dxa"/>
-        </w:trPr>
         <w:tc>
           <w:tcPr>
             <w:tcW w:w="3016" w:type="dxa"/>
@@ -3402,7 +3225,7 @@
         </w:tc>
         <w:tc>
           <w:tcPr>
-            <w:tcW w:w="1289" w:type="dxa"/>
+            <w:tcW w:w="1358" w:type="dxa"/>
             <w:tcBorders>
               <w:top w:val="single" w:sz="1" w:space="0" w:color="CCCCCC"/>
               <w:left w:val="single" w:sz="1" w:space="0" w:color="CCCCCC"/>
@@ -3426,10 +3249,6 @@
         </w:tc>
       </w:tr>
       <w:tr>
-        <w:trPr>
-          <w:gridAfter w:val="1"/>
-          <w:wAfter w:w="69" w:type="dxa"/>
-        </w:trPr>
         <w:tc>
           <w:tcPr>
             <w:tcW w:w="3016" w:type="dxa"/>
@@ -3480,7 +3299,7 @@
         </w:tc>
         <w:tc>
           <w:tcPr>
-            <w:tcW w:w="1289" w:type="dxa"/>
+            <w:tcW w:w="1358" w:type="dxa"/>
             <w:tcBorders>
               <w:top w:val="single" w:sz="1" w:space="0" w:color="CCCCCC"/>
               <w:left w:val="single" w:sz="1" w:space="0" w:color="CCCCCC"/>
@@ -3503,10 +3322,6 @@
         </w:tc>
       </w:tr>
       <w:tr>
-        <w:trPr>
-          <w:gridAfter w:val="1"/>
-          <w:wAfter w:w="69" w:type="dxa"/>
-        </w:trPr>
         <w:tc>
           <w:tcPr>
             <w:tcW w:w="3016" w:type="dxa"/>
@@ -3557,7 +3372,7 @@
         </w:tc>
         <w:tc>
           <w:tcPr>
-            <w:tcW w:w="1289" w:type="dxa"/>
+            <w:tcW w:w="1358" w:type="dxa"/>
             <w:tcBorders>
               <w:top w:val="single" w:sz="1" w:space="0" w:color="CCCCCC"/>
               <w:left w:val="single" w:sz="1" w:space="0" w:color="CCCCCC"/>
@@ -3580,10 +3395,6 @@
         </w:tc>
       </w:tr>
       <w:tr>
-        <w:trPr>
-          <w:gridAfter w:val="1"/>
-          <w:wAfter w:w="69" w:type="dxa"/>
-        </w:trPr>
         <w:tc>
           <w:tcPr>
             <w:tcW w:w="3016" w:type="dxa"/>
@@ -3634,7 +3445,7 @@
         </w:tc>
         <w:tc>
           <w:tcPr>
-            <w:tcW w:w="1289" w:type="dxa"/>
+            <w:tcW w:w="1358" w:type="dxa"/>
             <w:tcBorders>
               <w:top w:val="single" w:sz="1" w:space="0" w:color="CCCCCC"/>
               <w:left w:val="single" w:sz="1" w:space="0" w:color="CCCCCC"/>
@@ -3657,10 +3468,6 @@
         </w:tc>
       </w:tr>
       <w:tr>
-        <w:trPr>
-          <w:gridAfter w:val="1"/>
-          <w:wAfter w:w="69" w:type="dxa"/>
-        </w:trPr>
         <w:tc>
           <w:tcPr>
             <w:tcW w:w="3016" w:type="dxa"/>
@@ -3712,7 +3519,7 @@
         </w:tc>
         <w:tc>
           <w:tcPr>
-            <w:tcW w:w="1289" w:type="dxa"/>
+            <w:tcW w:w="1358" w:type="dxa"/>
             <w:tcBorders>
               <w:top w:val="single" w:sz="1" w:space="0" w:color="CCCCCC"/>
               <w:left w:val="single" w:sz="1" w:space="0" w:color="CCCCCC"/>
@@ -3735,10 +3542,6 @@
         </w:tc>
       </w:tr>
       <w:tr>
-        <w:trPr>
-          <w:gridAfter w:val="1"/>
-          <w:wAfter w:w="69" w:type="dxa"/>
-        </w:trPr>
         <w:tc>
           <w:tcPr>
             <w:tcW w:w="3016" w:type="dxa"/>
@@ -3789,7 +3592,7 @@
         </w:tc>
         <w:tc>
           <w:tcPr>
-            <w:tcW w:w="1289" w:type="dxa"/>
+            <w:tcW w:w="1358" w:type="dxa"/>
             <w:tcBorders>
               <w:top w:val="single" w:sz="1" w:space="0" w:color="CCCCCC"/>
               <w:left w:val="single" w:sz="1" w:space="0" w:color="CCCCCC"/>
@@ -3812,10 +3615,6 @@
         </w:tc>
       </w:tr>
       <w:tr>
-        <w:trPr>
-          <w:gridAfter w:val="1"/>
-          <w:wAfter w:w="69" w:type="dxa"/>
-        </w:trPr>
         <w:tc>
           <w:tcPr>
             <w:tcW w:w="3016" w:type="dxa"/>
@@ -3866,7 +3665,7 @@
         </w:tc>
         <w:tc>
           <w:tcPr>
-            <w:tcW w:w="1289" w:type="dxa"/>
+            <w:tcW w:w="1358" w:type="dxa"/>
             <w:tcBorders>
               <w:top w:val="single" w:sz="1" w:space="0" w:color="CCCCCC"/>
               <w:left w:val="single" w:sz="1" w:space="0" w:color="CCCCCC"/>
@@ -3889,10 +3688,6 @@
         </w:tc>
       </w:tr>
       <w:tr>
-        <w:trPr>
-          <w:gridAfter w:val="1"/>
-          <w:wAfter w:w="69" w:type="dxa"/>
-        </w:trPr>
         <w:tc>
           <w:tcPr>
             <w:tcW w:w="3016" w:type="dxa"/>
@@ -3943,7 +3738,7 @@
         </w:tc>
         <w:tc>
           <w:tcPr>
-            <w:tcW w:w="1289" w:type="dxa"/>
+            <w:tcW w:w="1358" w:type="dxa"/>
             <w:tcBorders>
               <w:top w:val="single" w:sz="1" w:space="0" w:color="CCCCCC"/>
               <w:left w:val="single" w:sz="1" w:space="0" w:color="CCCCCC"/>
@@ -3966,10 +3761,6 @@
         </w:tc>
       </w:tr>
       <w:tr>
-        <w:trPr>
-          <w:gridAfter w:val="1"/>
-          <w:wAfter w:w="69" w:type="dxa"/>
-        </w:trPr>
         <w:tc>
           <w:tcPr>
             <w:tcW w:w="3016" w:type="dxa"/>
@@ -4020,7 +3811,7 @@
         </w:tc>
         <w:tc>
           <w:tcPr>
-            <w:tcW w:w="1289" w:type="dxa"/>
+            <w:tcW w:w="1358" w:type="dxa"/>
             <w:tcBorders>
               <w:top w:val="single" w:sz="1" w:space="0" w:color="CCCCCC"/>
               <w:left w:val="single" w:sz="1" w:space="0" w:color="CCCCCC"/>
@@ -4043,10 +3834,6 @@
         </w:tc>
       </w:tr>
       <w:tr>
-        <w:trPr>
-          <w:gridAfter w:val="1"/>
-          <w:wAfter w:w="69" w:type="dxa"/>
-        </w:trPr>
         <w:tc>
           <w:tcPr>
             <w:tcW w:w="3016" w:type="dxa"/>
@@ -4097,7 +3884,7 @@
         </w:tc>
         <w:tc>
           <w:tcPr>
-            <w:tcW w:w="1289" w:type="dxa"/>
+            <w:tcW w:w="1358" w:type="dxa"/>
             <w:tcBorders>
               <w:top w:val="single" w:sz="1" w:space="0" w:color="CCCCCC"/>
               <w:left w:val="single" w:sz="1" w:space="0" w:color="CCCCCC"/>
@@ -4120,10 +3907,6 @@
         </w:tc>
       </w:tr>
       <w:tr>
-        <w:trPr>
-          <w:gridAfter w:val="1"/>
-          <w:wAfter w:w="69" w:type="dxa"/>
-        </w:trPr>
         <w:tc>
           <w:tcPr>
             <w:tcW w:w="3016" w:type="dxa"/>
@@ -4174,7 +3957,7 @@
         </w:tc>
         <w:tc>
           <w:tcPr>
-            <w:tcW w:w="1289" w:type="dxa"/>
+            <w:tcW w:w="1358" w:type="dxa"/>
             <w:tcBorders>
               <w:top w:val="single" w:sz="1" w:space="0" w:color="CCCCCC"/>
               <w:left w:val="single" w:sz="1" w:space="0" w:color="CCCCCC"/>
@@ -4197,10 +3980,6 @@
         </w:tc>
       </w:tr>
       <w:tr>
-        <w:trPr>
-          <w:gridAfter w:val="1"/>
-          <w:wAfter w:w="69" w:type="dxa"/>
-        </w:trPr>
         <w:tc>
           <w:tcPr>
             <w:tcW w:w="3016" w:type="dxa"/>
@@ -4251,7 +4030,7 @@
         </w:tc>
         <w:tc>
           <w:tcPr>
-            <w:tcW w:w="1289" w:type="dxa"/>
+            <w:tcW w:w="1358" w:type="dxa"/>
             <w:tcBorders>
               <w:top w:val="single" w:sz="1" w:space="0" w:color="CCCCCC"/>
               <w:left w:val="single" w:sz="1" w:space="0" w:color="CCCCCC"/>
@@ -4274,10 +4053,6 @@
         </w:tc>
       </w:tr>
       <w:tr>
-        <w:trPr>
-          <w:gridAfter w:val="1"/>
-          <w:wAfter w:w="69" w:type="dxa"/>
-        </w:trPr>
         <w:tc>
           <w:tcPr>
             <w:tcW w:w="3016" w:type="dxa"/>
@@ -4328,7 +4103,7 @@
         </w:tc>
         <w:tc>
           <w:tcPr>
-            <w:tcW w:w="1289" w:type="dxa"/>
+            <w:tcW w:w="1358" w:type="dxa"/>
             <w:tcBorders>
               <w:top w:val="single" w:sz="1" w:space="0" w:color="CCCCCC"/>
               <w:left w:val="single" w:sz="1" w:space="0" w:color="CCCCCC"/>
@@ -4351,10 +4126,6 @@
         </w:tc>
       </w:tr>
       <w:tr>
-        <w:trPr>
-          <w:gridAfter w:val="1"/>
-          <w:wAfter w:w="69" w:type="dxa"/>
-        </w:trPr>
         <w:tc>
           <w:tcPr>
             <w:tcW w:w="3016" w:type="dxa"/>
@@ -4405,7 +4176,7 @@
         </w:tc>
         <w:tc>
           <w:tcPr>
-            <w:tcW w:w="1289" w:type="dxa"/>
+            <w:tcW w:w="1358" w:type="dxa"/>
             <w:tcBorders>
               <w:top w:val="single" w:sz="1" w:space="0" w:color="CCCCCC"/>
               <w:left w:val="single" w:sz="1" w:space="0" w:color="CCCCCC"/>
@@ -4428,10 +4199,6 @@
         </w:tc>
       </w:tr>
       <w:tr>
-        <w:trPr>
-          <w:gridAfter w:val="1"/>
-          <w:wAfter w:w="69" w:type="dxa"/>
-        </w:trPr>
         <w:tc>
           <w:tcPr>
             <w:tcW w:w="3016" w:type="dxa"/>
@@ -4482,7 +4249,7 @@
         </w:tc>
         <w:tc>
           <w:tcPr>
-            <w:tcW w:w="1289" w:type="dxa"/>
+            <w:tcW w:w="1358" w:type="dxa"/>
             <w:tcBorders>
               <w:top w:val="single" w:sz="1" w:space="0" w:color="CCCCCC"/>
               <w:left w:val="single" w:sz="1" w:space="0" w:color="CCCCCC"/>
@@ -4505,10 +4272,6 @@
         </w:tc>
       </w:tr>
       <w:tr>
-        <w:trPr>
-          <w:gridAfter w:val="1"/>
-          <w:wAfter w:w="69" w:type="dxa"/>
-        </w:trPr>
         <w:tc>
           <w:tcPr>
             <w:tcW w:w="3016" w:type="dxa"/>
@@ -4559,7 +4322,7 @@
         </w:tc>
         <w:tc>
           <w:tcPr>
-            <w:tcW w:w="1289" w:type="dxa"/>
+            <w:tcW w:w="1358" w:type="dxa"/>
             <w:tcBorders>
               <w:top w:val="single" w:sz="1" w:space="0" w:color="CCCCCC"/>
               <w:left w:val="single" w:sz="1" w:space="0" w:color="CCCCCC"/>
@@ -4582,10 +4345,6 @@
         </w:tc>
       </w:tr>
       <w:tr>
-        <w:trPr>
-          <w:gridAfter w:val="1"/>
-          <w:wAfter w:w="69" w:type="dxa"/>
-        </w:trPr>
         <w:tc>
           <w:tcPr>
             <w:tcW w:w="3016" w:type="dxa"/>
@@ -4637,7 +4396,7 @@
         </w:tc>
         <w:tc>
           <w:tcPr>
-            <w:tcW w:w="1289" w:type="dxa"/>
+            <w:tcW w:w="1358" w:type="dxa"/>
             <w:tcBorders>
               <w:top w:val="single" w:sz="1" w:space="0" w:color="CCCCCC"/>
               <w:left w:val="single" w:sz="1" w:space="0" w:color="CCCCCC"/>
@@ -4660,10 +4419,6 @@
         </w:tc>
       </w:tr>
       <w:tr>
-        <w:trPr>
-          <w:gridAfter w:val="1"/>
-          <w:wAfter w:w="69" w:type="dxa"/>
-        </w:trPr>
         <w:tc>
           <w:tcPr>
             <w:tcW w:w="3016" w:type="dxa"/>
@@ -4686,7 +4441,7 @@
             <w:r>
               <w:t xml:space="preserve">Rendre le projet public : </w:t>
             </w:r>
-            <w:hyperlink r:id="rId7" w:history="1">
+            <w:hyperlink r:id="rId9" w:history="1">
               <w:r>
                 <w:rPr>
                   <w:rStyle w:val="Lienhypertexte"/>
@@ -4725,7 +4480,7 @@
         </w:tc>
         <w:tc>
           <w:tcPr>
-            <w:tcW w:w="1289" w:type="dxa"/>
+            <w:tcW w:w="1358" w:type="dxa"/>
             <w:tcBorders>
               <w:top w:val="single" w:sz="1" w:space="0" w:color="CCCCCC"/>
               <w:left w:val="single" w:sz="1" w:space="0" w:color="CCCCCC"/>
@@ -4748,10 +4503,6 @@
         </w:tc>
       </w:tr>
       <w:tr>
-        <w:trPr>
-          <w:gridAfter w:val="1"/>
-          <w:wAfter w:w="69" w:type="dxa"/>
-        </w:trPr>
         <w:tc>
           <w:tcPr>
             <w:tcW w:w="3016" w:type="dxa"/>
@@ -4802,7 +4553,7 @@
         </w:tc>
         <w:tc>
           <w:tcPr>
-            <w:tcW w:w="1289" w:type="dxa"/>
+            <w:tcW w:w="1358" w:type="dxa"/>
             <w:tcBorders>
               <w:top w:val="single" w:sz="1" w:space="0" w:color="CCCCCC"/>
               <w:left w:val="single" w:sz="1" w:space="0" w:color="CCCCCC"/>
@@ -4825,10 +4576,6 @@
         </w:tc>
       </w:tr>
       <w:tr>
-        <w:trPr>
-          <w:gridAfter w:val="1"/>
-          <w:wAfter w:w="69" w:type="dxa"/>
-        </w:trPr>
         <w:tc>
           <w:tcPr>
             <w:tcW w:w="3016" w:type="dxa"/>
@@ -4879,7 +4626,7 @@
         </w:tc>
         <w:tc>
           <w:tcPr>
-            <w:tcW w:w="1289" w:type="dxa"/>
+            <w:tcW w:w="1358" w:type="dxa"/>
             <w:tcBorders>
               <w:top w:val="single" w:sz="1" w:space="0" w:color="CCCCCC"/>
               <w:left w:val="single" w:sz="1" w:space="0" w:color="CCCCCC"/>
@@ -4902,10 +4649,6 @@
         </w:tc>
       </w:tr>
       <w:tr>
-        <w:trPr>
-          <w:gridAfter w:val="1"/>
-          <w:wAfter w:w="69" w:type="dxa"/>
-        </w:trPr>
         <w:tc>
           <w:tcPr>
             <w:tcW w:w="3016" w:type="dxa"/>
@@ -4956,7 +4699,7 @@
         </w:tc>
         <w:tc>
           <w:tcPr>
-            <w:tcW w:w="1289" w:type="dxa"/>
+            <w:tcW w:w="1358" w:type="dxa"/>
             <w:tcBorders>
               <w:top w:val="single" w:sz="1" w:space="0" w:color="CCCCCC"/>
               <w:left w:val="single" w:sz="1" w:space="0" w:color="CCCCCC"/>
@@ -4979,10 +4722,6 @@
         </w:tc>
       </w:tr>
       <w:tr>
-        <w:trPr>
-          <w:gridAfter w:val="1"/>
-          <w:wAfter w:w="69" w:type="dxa"/>
-        </w:trPr>
         <w:tc>
           <w:tcPr>
             <w:tcW w:w="3016" w:type="dxa"/>
@@ -5033,7 +4772,7 @@
         </w:tc>
         <w:tc>
           <w:tcPr>
-            <w:tcW w:w="1289" w:type="dxa"/>
+            <w:tcW w:w="1358" w:type="dxa"/>
             <w:tcBorders>
               <w:top w:val="single" w:sz="1" w:space="0" w:color="CCCCCC"/>
               <w:left w:val="single" w:sz="1" w:space="0" w:color="CCCCCC"/>
@@ -5056,10 +4795,6 @@
         </w:tc>
       </w:tr>
       <w:tr>
-        <w:trPr>
-          <w:gridAfter w:val="1"/>
-          <w:wAfter w:w="69" w:type="dxa"/>
-        </w:trPr>
         <w:tc>
           <w:tcPr>
             <w:tcW w:w="3016" w:type="dxa"/>
@@ -5082,7 +4817,7 @@
             <w:r>
               <w:t xml:space="preserve">Recherche nom de domaine + Achat nom de domaine sur Infomaniak + ajout CNAME sur le projet : </w:t>
             </w:r>
-            <w:hyperlink r:id="rId8" w:history="1">
+            <w:hyperlink r:id="rId10" w:history="1">
               <w:r>
                 <w:rPr>
                   <w:rStyle w:val="Lienhypertexte"/>
@@ -5121,7 +4856,7 @@
         </w:tc>
         <w:tc>
           <w:tcPr>
-            <w:tcW w:w="1289" w:type="dxa"/>
+            <w:tcW w:w="1358" w:type="dxa"/>
             <w:tcBorders>
               <w:top w:val="single" w:sz="1" w:space="0" w:color="CCCCCC"/>
               <w:left w:val="single" w:sz="1" w:space="0" w:color="CCCCCC"/>
@@ -5144,10 +4879,6 @@
         </w:tc>
       </w:tr>
       <w:tr>
-        <w:trPr>
-          <w:gridAfter w:val="1"/>
-          <w:wAfter w:w="69" w:type="dxa"/>
-        </w:trPr>
         <w:tc>
           <w:tcPr>
             <w:tcW w:w="3016" w:type="dxa"/>
@@ -5198,7 +4929,7 @@
         </w:tc>
         <w:tc>
           <w:tcPr>
-            <w:tcW w:w="1289" w:type="dxa"/>
+            <w:tcW w:w="1358" w:type="dxa"/>
             <w:tcBorders>
               <w:top w:val="single" w:sz="1" w:space="0" w:color="CCCCCC"/>
               <w:left w:val="single" w:sz="1" w:space="0" w:color="CCCCCC"/>
@@ -5221,10 +4952,6 @@
         </w:tc>
       </w:tr>
       <w:tr>
-        <w:trPr>
-          <w:gridAfter w:val="1"/>
-          <w:wAfter w:w="69" w:type="dxa"/>
-        </w:trPr>
         <w:tc>
           <w:tcPr>
             <w:tcW w:w="3016" w:type="dxa"/>
@@ -5275,7 +5002,7 @@
         </w:tc>
         <w:tc>
           <w:tcPr>
-            <w:tcW w:w="1289" w:type="dxa"/>
+            <w:tcW w:w="1358" w:type="dxa"/>
             <w:tcBorders>
               <w:top w:val="single" w:sz="1" w:space="0" w:color="CCCCCC"/>
               <w:left w:val="single" w:sz="1" w:space="0" w:color="CCCCCC"/>
@@ -5298,10 +5025,6 @@
         </w:tc>
       </w:tr>
       <w:tr>
-        <w:trPr>
-          <w:gridAfter w:val="1"/>
-          <w:wAfter w:w="69" w:type="dxa"/>
-        </w:trPr>
         <w:tc>
           <w:tcPr>
             <w:tcW w:w="3016" w:type="dxa"/>
@@ -5324,6 +5047,9 @@
             <w:r>
               <w:t>Création du CdC</w:t>
             </w:r>
+            <w:r>
+              <w:t xml:space="preserve"> et PowerPoint</w:t>
+            </w:r>
           </w:p>
         </w:tc>
         <w:tc>
@@ -5352,7 +5078,7 @@
         </w:tc>
         <w:tc>
           <w:tcPr>
-            <w:tcW w:w="1289" w:type="dxa"/>
+            <w:tcW w:w="1358" w:type="dxa"/>
             <w:tcBorders>
               <w:top w:val="single" w:sz="1" w:space="0" w:color="CCCCCC"/>
               <w:left w:val="single" w:sz="1" w:space="0" w:color="CCCCCC"/>
@@ -5372,6 +5098,356 @@
               <w:t>17.06.26</w:t>
             </w:r>
           </w:p>
+        </w:tc>
+      </w:tr>
+      <w:tr>
+        <w:tc>
+          <w:tcPr>
+            <w:tcW w:w="3016" w:type="dxa"/>
+            <w:gridSpan w:val="2"/>
+            <w:tcBorders>
+              <w:top w:val="single" w:sz="1" w:space="0" w:color="CCCCCC"/>
+              <w:left w:val="single" w:sz="1" w:space="0" w:color="CCCCCC"/>
+              <w:bottom w:val="single" w:sz="1" w:space="0" w:color="CCCCCC"/>
+              <w:right w:val="single" w:sz="1" w:space="0" w:color="CCCCCC"/>
+            </w:tcBorders>
+            <w:shd w:val="clear" w:color="auto" w:fill="FFFFFF" w:themeFill="background1"/>
+            <w:tcMar>
+              <w:top w:w="80" w:type="dxa"/>
+              <w:left w:w="120" w:type="dxa"/>
+              <w:bottom w:w="80" w:type="dxa"/>
+              <w:right w:w="120" w:type="dxa"/>
+            </w:tcMar>
+          </w:tcPr>
+          <w:p>
+            <w:pPr>
+              <w:pStyle w:val="TM1"/>
+              <w:tabs>
+                <w:tab w:val="right" w:leader="dot" w:pos="9060"/>
+              </w:tabs>
+              <w:rPr>
+                <w:rFonts w:eastAsiaTheme="minorEastAsia" w:cstheme="minorBidi"/>
+                <w:noProof/>
+                <w:kern w:val="2"/>
+                <w:sz w:val="24"/>
+                <w:szCs w:val="24"/>
+                <w14:ligatures w14:val="standardContextual"/>
+              </w:rPr>
+            </w:pPr>
+            <w:r>
+              <w:t xml:space="preserve">Ajout point : </w:t>
+            </w:r>
+            <w:r>
+              <w:rPr>
+                <w:noProof/>
+              </w:rPr>
+              <w:t>Spécific</w:t>
+            </w:r>
+            <w:r>
+              <w:rPr>
+                <w:noProof/>
+              </w:rPr>
+              <w:t>a</w:t>
+            </w:r>
+            <w:r>
+              <w:rPr>
+                <w:noProof/>
+              </w:rPr>
+              <w:t>tions</w:t>
+            </w:r>
+            <w:r>
+              <w:rPr>
+                <w:noProof/>
+              </w:rPr>
+              <w:t>, T</w:t>
+            </w:r>
+            <w:r>
+              <w:rPr>
+                <w:noProof/>
+              </w:rPr>
+              <w:t>itre</w:t>
+            </w:r>
+            <w:r>
+              <w:rPr>
+                <w:noProof/>
+              </w:rPr>
+              <w:t xml:space="preserve">, </w:t>
+            </w:r>
+            <w:r>
+              <w:rPr>
+                <w:noProof/>
+              </w:rPr>
+              <w:t>Description</w:t>
+            </w:r>
+            <w:r>
+              <w:rPr>
+                <w:noProof/>
+              </w:rPr>
+              <w:t xml:space="preserve">, </w:t>
+            </w:r>
+            <w:r>
+              <w:rPr>
+                <w:noProof/>
+              </w:rPr>
+              <w:t>Matériel et logiciels à disposition</w:t>
+            </w:r>
+            <w:r>
+              <w:rPr>
+                <w:noProof/>
+              </w:rPr>
+              <w:t xml:space="preserve">, </w:t>
+            </w:r>
+            <w:r>
+              <w:rPr>
+                <w:noProof/>
+              </w:rPr>
+              <w:t>Prérequis</w:t>
+            </w:r>
+            <w:r>
+              <w:rPr>
+                <w:noProof/>
+              </w:rPr>
+              <w:t xml:space="preserve">, </w:t>
+            </w:r>
+            <w:r>
+              <w:rPr>
+                <w:noProof/>
+              </w:rPr>
+              <w:t>Cahier des charges</w:t>
+            </w:r>
+            <w:r>
+              <w:rPr>
+                <w:noProof/>
+              </w:rPr>
+              <w:t xml:space="preserve">, </w:t>
+            </w:r>
+            <w:r>
+              <w:rPr>
+                <w:noProof/>
+              </w:rPr>
+              <w:t>Objectifs et portée du projet (objectifs SMART)</w:t>
+            </w:r>
+            <w:r>
+              <w:rPr>
+                <w:noProof/>
+              </w:rPr>
+              <w:t xml:space="preserve">, </w:t>
+            </w:r>
+            <w:r>
+              <w:rPr>
+                <w:noProof/>
+              </w:rPr>
+              <w:t>Fonctionnalités requises</w:t>
+            </w:r>
+            <w:r>
+              <w:rPr>
+                <w:noProof/>
+              </w:rPr>
+              <w:t xml:space="preserve">, </w:t>
+            </w:r>
+            <w:r>
+              <w:rPr>
+                <w:noProof/>
+              </w:rPr>
+              <w:t>Travail à réaliser par l'apprenti</w:t>
+            </w:r>
+            <w:r>
+              <w:rPr>
+                <w:noProof/>
+              </w:rPr>
+              <w:t xml:space="preserve">, </w:t>
+            </w:r>
+            <w:r>
+              <w:rPr>
+                <w:noProof/>
+              </w:rPr>
+              <w:t>Planification Initiale</w:t>
+            </w:r>
+            <w:r>
+              <w:rPr>
+                <w:noProof/>
+              </w:rPr>
+              <w:t xml:space="preserve">, </w:t>
+            </w:r>
+            <w:r>
+              <w:rPr>
+                <w:noProof/>
+              </w:rPr>
+              <w:t>Journal de travail</w:t>
+            </w:r>
+            <w:r>
+              <w:rPr>
+                <w:noProof/>
+              </w:rPr>
+              <w:t>, A</w:t>
+            </w:r>
+            <w:r>
+              <w:rPr>
+                <w:noProof/>
+              </w:rPr>
+              <w:t>nalyse</w:t>
+            </w:r>
+            <w:r>
+              <w:rPr>
+                <w:noProof/>
+              </w:rPr>
+              <w:t xml:space="preserve">, </w:t>
+            </w:r>
+            <w:r>
+              <w:rPr>
+                <w:noProof/>
+              </w:rPr>
+              <w:t>Amélioration</w:t>
+            </w:r>
+            <w:r>
+              <w:rPr>
+                <w:noProof/>
+              </w:rPr>
+              <w:t xml:space="preserve">, </w:t>
+            </w:r>
+            <w:r>
+              <w:rPr>
+                <w:noProof/>
+              </w:rPr>
+              <w:t>Opportunités</w:t>
+            </w:r>
+            <w:r>
+              <w:rPr>
+                <w:noProof/>
+              </w:rPr>
+              <w:t>, C</w:t>
+            </w:r>
+            <w:r>
+              <w:rPr>
+                <w:noProof/>
+              </w:rPr>
+              <w:t>onclusion</w:t>
+            </w:r>
+            <w:r>
+              <w:rPr>
+                <w:noProof/>
+                <w:webHidden/>
+              </w:rPr>
+              <w:t xml:space="preserve">, </w:t>
+            </w:r>
+            <w:r>
+              <w:rPr>
+                <w:noProof/>
+              </w:rPr>
+              <w:t>Bilan des fonctionnalités demandées</w:t>
+            </w:r>
+            <w:r>
+              <w:rPr>
+                <w:noProof/>
+                <w:webHidden/>
+              </w:rPr>
+              <w:t xml:space="preserve">, </w:t>
+            </w:r>
+            <w:r>
+              <w:rPr>
+                <w:noProof/>
+              </w:rPr>
+              <w:t>Bilan personnel</w:t>
+            </w:r>
+            <w:r>
+              <w:rPr>
+                <w:noProof/>
+                <w:webHidden/>
+              </w:rPr>
+              <w:t xml:space="preserve">, </w:t>
+            </w:r>
+            <w:r>
+              <w:rPr>
+                <w:noProof/>
+                <w:webHidden/>
+              </w:rPr>
+              <w:lastRenderedPageBreak/>
+              <w:t>D</w:t>
+            </w:r>
+            <w:r>
+              <w:rPr>
+                <w:noProof/>
+              </w:rPr>
+              <w:t>ivers</w:t>
+            </w:r>
+            <w:r>
+              <w:rPr>
+                <w:noProof/>
+              </w:rPr>
+              <w:t xml:space="preserve">, </w:t>
+            </w:r>
+            <w:r>
+              <w:rPr>
+                <w:noProof/>
+              </w:rPr>
+              <w:t>Journal de travail</w:t>
+            </w:r>
+            <w:r>
+              <w:rPr>
+                <w:noProof/>
+              </w:rPr>
+              <w:t xml:space="preserve">, </w:t>
+            </w:r>
+            <w:r>
+              <w:rPr>
+                <w:noProof/>
+              </w:rPr>
+              <w:t>Annexes</w:t>
+            </w:r>
+          </w:p>
+        </w:tc>
+        <w:tc>
+          <w:tcPr>
+            <w:tcW w:w="1298" w:type="dxa"/>
+            <w:gridSpan w:val="2"/>
+            <w:tcBorders>
+              <w:top w:val="single" w:sz="1" w:space="0" w:color="CCCCCC"/>
+              <w:left w:val="single" w:sz="1" w:space="0" w:color="CCCCCC"/>
+              <w:bottom w:val="single" w:sz="1" w:space="0" w:color="CCCCCC"/>
+              <w:right w:val="single" w:sz="1" w:space="0" w:color="CCCCCC"/>
+            </w:tcBorders>
+            <w:shd w:val="clear" w:color="auto" w:fill="FFFFFF" w:themeFill="background1"/>
+            <w:tcMar>
+              <w:top w:w="80" w:type="dxa"/>
+              <w:left w:w="120" w:type="dxa"/>
+              <w:bottom w:w="80" w:type="dxa"/>
+              <w:right w:w="120" w:type="dxa"/>
+            </w:tcMar>
+          </w:tcPr>
+          <w:p>
+            <w:r>
+              <w:lastRenderedPageBreak/>
+              <w:t xml:space="preserve">1 séquence de </w:t>
+            </w:r>
+            <w:r>
+              <w:t>4</w:t>
+            </w:r>
+            <w:r>
+              <w:t xml:space="preserve"> période</w:t>
+            </w:r>
+            <w:r>
+              <w:t>s</w:t>
+            </w:r>
+          </w:p>
+        </w:tc>
+        <w:tc>
+          <w:tcPr>
+            <w:tcW w:w="1358" w:type="dxa"/>
+            <w:tcBorders>
+              <w:top w:val="single" w:sz="1" w:space="0" w:color="CCCCCC"/>
+              <w:left w:val="single" w:sz="1" w:space="0" w:color="CCCCCC"/>
+              <w:bottom w:val="single" w:sz="1" w:space="0" w:color="CCCCCC"/>
+              <w:right w:val="single" w:sz="1" w:space="0" w:color="CCCCCC"/>
+            </w:tcBorders>
+            <w:shd w:val="clear" w:color="auto" w:fill="FFFFFF" w:themeFill="background1"/>
+            <w:tcMar>
+              <w:top w:w="80" w:type="dxa"/>
+              <w:left w:w="120" w:type="dxa"/>
+              <w:bottom w:w="80" w:type="dxa"/>
+              <w:right w:w="120" w:type="dxa"/>
+            </w:tcMar>
+          </w:tcPr>
+          <w:p/>
         </w:tc>
       </w:tr>
     </w:tbl>
@@ -5389,31 +5465,286 @@
       <w:pPr>
         <w:pStyle w:val="Titre1"/>
       </w:pPr>
-      <w:bookmarkStart w:id="15" w:name="_Toc532179957"/>
-      <w:bookmarkStart w:id="16" w:name="_Toc165969641"/>
-      <w:bookmarkStart w:id="17" w:name="_Toc232582521"/>
+      <w:bookmarkStart w:id="14" w:name="_Toc532179957"/>
+      <w:bookmarkStart w:id="15" w:name="_Toc165969641"/>
+      <w:bookmarkStart w:id="16" w:name="_Toc232586090"/>
       <w:r>
         <w:t>Analyse</w:t>
       </w:r>
+      <w:bookmarkEnd w:id="14"/>
       <w:bookmarkEnd w:id="15"/>
       <w:bookmarkEnd w:id="16"/>
+    </w:p>
+    <w:p>
+      <w:pPr>
+        <w:pStyle w:val="Titre2"/>
+      </w:pPr>
+      <w:bookmarkStart w:id="17" w:name="_Toc232586091"/>
+      <w:r>
+        <w:t>Temps</w:t>
+      </w:r>
       <w:bookmarkEnd w:id="17"/>
     </w:p>
     <w:p>
       <w:r>
-        <w:t>Dire la différence entre planif et JDT</w:t>
+        <w:t>Ma</w:t>
+      </w:r>
+      <w:r>
+        <w:t xml:space="preserve"> planification </w:t>
+      </w:r>
+      <w:r>
+        <w:t xml:space="preserve">dit que j’ai fini tout mon projet </w:t>
+      </w:r>
+      <w:r>
+        <w:t xml:space="preserve">Portes Ouvertes </w:t>
+      </w:r>
+      <w:r>
+        <w:t xml:space="preserve">le </w:t>
+      </w:r>
+      <w:r>
+        <w:t>4 juin</w:t>
+      </w:r>
+      <w:r>
+        <w:t>.</w:t>
+      </w:r>
+    </w:p>
+    <w:p>
+      <w:r>
+        <w:t>Et que durant le temps restant, je ferai mon projet personnel.</w:t>
+      </w:r>
+    </w:p>
+    <w:p>
+      <w:r>
+        <w:t>Puis le 24 juin, faire notre présentation.</w:t>
+      </w:r>
+    </w:p>
+    <w:p/>
+    <w:p>
+      <w:r>
+        <w:t>Sur mon journal de travail, le 4 juin j’ai effectivement fini le projet et commencé le projet personnel, alors le temps a bien été calculé.</w:t>
+      </w:r>
+    </w:p>
+    <w:p/>
+    <w:p>
+      <w:r>
+        <w:t>Pour le projet personnel, c’était sur le temps restant, et donc je n’ai pas mis de planification.</w:t>
+      </w:r>
+    </w:p>
+    <w:p>
+      <w:r>
+        <w:t>Cependant, j’ai fait un cahier des charges pour voir quoi faire et je pensais que ça allait tenir sur la fin du DemoMot, mais non. Alors j’ai amélioré mon projet et même acheter un nom de domaine pour le site : agashae.space</w:t>
+      </w:r>
+    </w:p>
+    <w:p/>
+    <w:p/>
+    <w:p>
+      <w:r>
+        <w:t xml:space="preserve">Sur tout le DemoMot, ce qui j’ai fait </w:t>
+      </w:r>
+      <w:r>
+        <w:t>beaucoup de travail d’équipe et de support</w:t>
+      </w:r>
+      <w:r>
+        <w:t xml:space="preserve"> </w:t>
+      </w:r>
+      <w:r>
+        <w:t>:</w:t>
+      </w:r>
+    </w:p>
+    <w:p/>
+    <w:p>
+      <w:pPr>
+        <w:pStyle w:val="Paragraphedeliste"/>
+        <w:numPr>
+          <w:ilvl w:val="0"/>
+          <w:numId w:val="11"/>
+        </w:numPr>
+      </w:pPr>
+      <w:r>
+        <w:t>Aider Noah (AideCode cadavre exquis) → 2 périodes</w:t>
+      </w:r>
+    </w:p>
+    <w:p>
+      <w:pPr>
+        <w:pStyle w:val="Paragraphedeliste"/>
+        <w:numPr>
+          <w:ilvl w:val="0"/>
+          <w:numId w:val="11"/>
+        </w:numPr>
+      </w:pPr>
+      <w:r>
+        <w:t>Création vidéo de présentation du jeu → 1 période</w:t>
+      </w:r>
+    </w:p>
+    <w:p>
+      <w:pPr>
+        <w:pStyle w:val="Paragraphedeliste"/>
+        <w:numPr>
+          <w:ilvl w:val="0"/>
+          <w:numId w:val="11"/>
+        </w:numPr>
+      </w:pPr>
+      <w:r>
+        <w:t>Aider Nathan (envoi vidéo) → 1 période</w:t>
+      </w:r>
+    </w:p>
+    <w:p>
+      <w:pPr>
+        <w:pStyle w:val="Paragraphedeliste"/>
+        <w:numPr>
+          <w:ilvl w:val="0"/>
+          <w:numId w:val="11"/>
+        </w:numPr>
+      </w:pPr>
+      <w:r>
+        <w:t>Aider Liam (PowerPoint + problème écran) → 2 périodes</w:t>
+      </w:r>
+    </w:p>
+    <w:p>
+      <w:pPr>
+        <w:pStyle w:val="Paragraphedeliste"/>
+        <w:numPr>
+          <w:ilvl w:val="0"/>
+          <w:numId w:val="11"/>
+        </w:numPr>
+      </w:pPr>
+      <w:r>
+        <w:t>Parler avec M. Duding + création fichier Word besoins/solutions → 4 périodes</w:t>
+      </w:r>
+    </w:p>
+    <w:p>
+      <w:pPr>
+        <w:pStyle w:val="Paragraphedeliste"/>
+        <w:numPr>
+          <w:ilvl w:val="0"/>
+          <w:numId w:val="11"/>
+        </w:numPr>
+      </w:pPr>
+      <w:r>
+        <w:t>Tests VM + solutions de contrôle distant (Parsec, Teams, etc.) → 3 périodes</w:t>
+      </w:r>
+    </w:p>
+    <w:p>
+      <w:pPr>
+        <w:pStyle w:val="Paragraphedeliste"/>
+        <w:numPr>
+          <w:ilvl w:val="0"/>
+          <w:numId w:val="11"/>
+        </w:numPr>
+      </w:pPr>
+      <w:r>
+        <w:t>Démo des projets de la classe → 2 périodes</w:t>
+      </w:r>
+    </w:p>
+    <w:p>
+      <w:pPr>
+        <w:pStyle w:val="Paragraphedeliste"/>
+        <w:numPr>
+          <w:ilvl w:val="0"/>
+          <w:numId w:val="11"/>
+        </w:numPr>
+      </w:pPr>
+      <w:r>
+        <w:t>Retour de M. Sahli + prise de notes → 2 périodes</w:t>
+      </w:r>
+    </w:p>
+    <w:p/>
+    <w:p/>
+    <w:p>
+      <w:pPr>
+        <w:pStyle w:val="Titre2"/>
+      </w:pPr>
+      <w:bookmarkStart w:id="18" w:name="_Toc232586092"/>
+      <w:r>
+        <w:t>Observations &amp; Analyse</w:t>
+      </w:r>
+      <w:bookmarkEnd w:id="18"/>
+    </w:p>
+    <w:p>
+      <w:pPr>
+        <w:pStyle w:val="Titre3"/>
+      </w:pPr>
+      <w:bookmarkStart w:id="19" w:name="_Toc232586093"/>
+      <w:r>
+        <w:t>Points positifs</w:t>
+      </w:r>
+      <w:bookmarkEnd w:id="19"/>
+    </w:p>
+    <w:p>
+      <w:r>
+        <w:t xml:space="preserve">- </w:t>
+      </w:r>
+      <w:r>
+        <w:t xml:space="preserve">J’ai </w:t>
+      </w:r>
+      <w:r>
+        <w:t xml:space="preserve">terminé le projet </w:t>
+      </w:r>
+      <w:r>
+        <w:t>portes ouvertes</w:t>
+      </w:r>
+    </w:p>
+    <w:p>
+      <w:r>
+        <w:t xml:space="preserve">- </w:t>
+      </w:r>
+      <w:r>
+        <w:t xml:space="preserve">Beaucoup de travail </w:t>
+      </w:r>
+      <w:r>
+        <w:t>d’équip</w:t>
+      </w:r>
+      <w:r>
+        <w:t>e</w:t>
+      </w:r>
+      <w:r>
+        <w:t xml:space="preserve"> </w:t>
+      </w:r>
+    </w:p>
+    <w:p>
+      <w:r>
+        <w:t xml:space="preserve">- </w:t>
+      </w:r>
+      <w:r>
+        <w:t xml:space="preserve">J’ai un </w:t>
+      </w:r>
+      <w:r>
+        <w:t>projet personnel très avancé et bien documenté (GitHub, domaine, responsive, PWA)</w:t>
+      </w:r>
+    </w:p>
+    <w:p>
+      <w:r>
+        <w:t>- Bonne gestion des imprévus</w:t>
+      </w:r>
+    </w:p>
+    <w:p>
+      <w:pPr>
+        <w:pStyle w:val="Titre3"/>
+      </w:pPr>
+      <w:bookmarkStart w:id="20" w:name="_Toc232586094"/>
+      <w:r>
+        <w:t>Points d’amélioration</w:t>
+      </w:r>
+      <w:bookmarkEnd w:id="20"/>
+    </w:p>
+    <w:p>
+      <w:r>
+        <w:t>- La planification initiale est devenue obsolète</w:t>
       </w:r>
     </w:p>
     <w:p>
       <w:pPr>
         <w:pStyle w:val="Titre1"/>
       </w:pPr>
-      <w:bookmarkStart w:id="18" w:name="_Toc232582522"/>
-      <w:r>
-        <w:t>Amélioration</w:t>
-      </w:r>
-      <w:bookmarkStart w:id="19" w:name="_Toc165969653"/>
-      <w:bookmarkEnd w:id="18"/>
+      <w:bookmarkStart w:id="21" w:name="_Toc232586095"/>
+      <w:r>
+        <w:t>A</w:t>
+      </w:r>
+      <w:r>
+        <w:t>mélioration</w:t>
+      </w:r>
+      <w:bookmarkStart w:id="22" w:name="_Toc165969653"/>
+      <w:bookmarkEnd w:id="21"/>
     </w:p>
     <w:p>
       <w:pPr>
@@ -5451,6 +5782,7 @@
         <w:ind w:left="1134"/>
       </w:pPr>
       <w:r>
+        <w:lastRenderedPageBreak/>
         <w:t>Ajout d’un CNAME : agashae.space</w:t>
       </w:r>
     </w:p>
@@ -5458,78 +5790,61 @@
       <w:pPr>
         <w:pStyle w:val="Titre1"/>
       </w:pPr>
-      <w:bookmarkStart w:id="20" w:name="_Toc232582523"/>
-      <w:r>
-        <w:lastRenderedPageBreak/>
+      <w:bookmarkStart w:id="23" w:name="_Toc232586096"/>
+      <w:r>
         <w:t>Opportunités</w:t>
       </w:r>
-      <w:bookmarkEnd w:id="20"/>
-    </w:p>
-    <w:p>
-      <w:pPr>
-        <w:pStyle w:val="Titre1"/>
-      </w:pPr>
-      <w:bookmarkStart w:id="21" w:name="_Toc232582524"/>
-      <w:r>
-        <w:t>Conclusion</w:t>
-      </w:r>
-      <w:bookmarkEnd w:id="19"/>
-      <w:bookmarkEnd w:id="21"/>
-    </w:p>
-    <w:p>
-      <w:pPr>
-        <w:pStyle w:val="Titre2"/>
-      </w:pPr>
-      <w:bookmarkStart w:id="22" w:name="_Toc165969654"/>
-      <w:bookmarkStart w:id="23" w:name="_Toc232582525"/>
-      <w:r>
-        <w:t xml:space="preserve">Bilan des </w:t>
-      </w:r>
-      <w:bookmarkEnd w:id="22"/>
-      <w:r>
-        <w:t>fonctionnalités demandées</w:t>
-      </w:r>
       <w:bookmarkEnd w:id="23"/>
     </w:p>
     <w:p>
       <w:pPr>
-        <w:pStyle w:val="Informations"/>
+        <w:pStyle w:val="Paragraphedeliste"/>
         <w:numPr>
-          <w:ilvl w:val="5"/>
-          <w:numId w:val="3"/>
+          <w:ilvl w:val="0"/>
+          <w:numId w:val="12"/>
         </w:numPr>
-        <w:rPr>
-          <w:color w:val="auto"/>
-          <w:sz w:val="20"/>
-        </w:rPr>
-      </w:pPr>
-      <w:bookmarkStart w:id="24" w:name="_Toc165969656"/>
-      <w:r>
-        <w:rPr>
-          <w:color w:val="auto"/>
-          <w:sz w:val="20"/>
-        </w:rPr>
-        <w:t>J’ai réussi à insérer tous les points demandés, et</w:t>
-      </w:r>
-      <w:r>
-        <w:rPr>
-          <w:color w:val="auto"/>
-          <w:sz w:val="20"/>
-        </w:rPr>
-        <w:t xml:space="preserve"> avec ma motivation, je suis allé plus loin.</w:t>
-      </w:r>
-    </w:p>
-    <w:p>
-      <w:pPr>
-        <w:pStyle w:val="Titre2"/>
-      </w:pPr>
-      <w:bookmarkStart w:id="25" w:name="_Toc232582526"/>
-      <w:r>
-        <w:t>Bilan personnel</w:t>
-      </w:r>
-      <w:bookmarkEnd w:id="24"/>
-      <w:bookmarkEnd w:id="25"/>
-    </w:p>
+      </w:pPr>
+      <w:r>
+        <w:t>Refaire de l’HTML/CSS</w:t>
+      </w:r>
+    </w:p>
+    <w:p>
+      <w:pPr>
+        <w:pStyle w:val="Paragraphedeliste"/>
+        <w:numPr>
+          <w:ilvl w:val="0"/>
+          <w:numId w:val="12"/>
+        </w:numPr>
+      </w:pPr>
+      <w:r>
+        <w:t>Mieux comprendre ce qu’est GitHub</w:t>
+      </w:r>
+    </w:p>
+    <w:p>
+      <w:pPr>
+        <w:pStyle w:val="Paragraphedeliste"/>
+        <w:numPr>
+          <w:ilvl w:val="0"/>
+          <w:numId w:val="12"/>
+        </w:numPr>
+      </w:pPr>
+      <w:r>
+        <w:t>Découvrir PWA</w:t>
+      </w:r>
+    </w:p>
+    <w:p>
+      <w:pPr>
+        <w:pStyle w:val="Paragraphedeliste"/>
+        <w:numPr>
+          <w:ilvl w:val="0"/>
+          <w:numId w:val="12"/>
+        </w:numPr>
+      </w:pPr>
+      <w:r>
+        <w:t>Découvrir les CNAME</w:t>
+      </w:r>
+    </w:p>
+    <w:bookmarkEnd w:id="22"/>
     <w:p>
       <w:pPr>
         <w:pStyle w:val="Informations"/>
@@ -5544,83 +5859,51 @@
       <w:pPr>
         <w:pStyle w:val="Titre1"/>
       </w:pPr>
-      <w:bookmarkStart w:id="26" w:name="_Toc532179971"/>
-      <w:bookmarkStart w:id="27" w:name="_Toc165969657"/>
-      <w:bookmarkStart w:id="28" w:name="_Toc232582527"/>
-      <w:r>
-        <w:t>Divers</w:t>
-      </w:r>
-      <w:bookmarkEnd w:id="26"/>
-      <w:bookmarkEnd w:id="27"/>
-      <w:bookmarkEnd w:id="28"/>
-    </w:p>
-    <w:p>
-      <w:pPr>
-        <w:pStyle w:val="Titre2"/>
-      </w:pPr>
-      <w:bookmarkStart w:id="29" w:name="_Toc532179972"/>
-      <w:bookmarkStart w:id="30" w:name="_Toc165969658"/>
-      <w:bookmarkStart w:id="31" w:name="_Toc232582528"/>
-      <w:r>
-        <w:t>Journal de travail</w:t>
-      </w:r>
-      <w:bookmarkEnd w:id="29"/>
-      <w:bookmarkEnd w:id="30"/>
-      <w:bookmarkEnd w:id="31"/>
+      <w:bookmarkStart w:id="24" w:name="_Toc232586097"/>
+      <w:r>
+        <w:t>Annexes</w:t>
+      </w:r>
+      <w:bookmarkEnd w:id="24"/>
     </w:p>
     <w:p>
       <w:pPr>
         <w:pStyle w:val="Informations"/>
-        <w:numPr>
-          <w:ilvl w:val="5"/>
-          <w:numId w:val="4"/>
-        </w:numPr>
+        <w:ind w:left="0"/>
         <w:rPr>
           <w:color w:val="auto"/>
           <w:sz w:val="20"/>
         </w:rPr>
       </w:pPr>
-      <w:bookmarkStart w:id="32" w:name="_Toc232582530"/>
       <w:r>
         <w:rPr>
           <w:color w:val="auto"/>
           <w:sz w:val="20"/>
         </w:rPr>
-        <w:t>T-PSys-part3-PremakumarAgashae-jdt</w:t>
-      </w:r>
-    </w:p>
-    <w:p>
-      <w:pPr>
-        <w:pStyle w:val="Titre1"/>
-      </w:pPr>
-      <w:r>
-        <w:t>Annexes</w:t>
-      </w:r>
-      <w:bookmarkEnd w:id="32"/>
+        <w:t xml:space="preserve">Tout dans le repo : </w:t>
+      </w:r>
+      <w:hyperlink r:id="rId11" w:history="1">
+        <w:r>
+          <w:rPr>
+            <w:rStyle w:val="Lienhypertexte"/>
+            <w:sz w:val="20"/>
+          </w:rPr>
+          <w:t>https://github.com/Agashae/MoonWebsite</w:t>
+        </w:r>
+      </w:hyperlink>
     </w:p>
     <w:p>
       <w:pPr>
         <w:pStyle w:val="Informations"/>
-        <w:numPr>
-          <w:ilvl w:val="5"/>
-          <w:numId w:val="4"/>
-        </w:numPr>
+        <w:ind w:left="0"/>
         <w:rPr>
           <w:color w:val="auto"/>
           <w:sz w:val="20"/>
         </w:rPr>
       </w:pPr>
-      <w:r>
-        <w:rPr>
-          <w:color w:val="auto"/>
-          <w:sz w:val="20"/>
-        </w:rPr>
-        <w:t>T-PSys-part3-PremakumarAgashae-jdt</w:t>
-      </w:r>
     </w:p>
     <w:sectPr>
-      <w:headerReference w:type="default" r:id="rId9"/>
-      <w:footerReference w:type="default" r:id="rId10"/>
+      <w:headerReference w:type="default" r:id="rId12"/>
+      <w:footerReference w:type="default" r:id="rId13"/>
       <w:pgSz w:w="11906" w:h="16838" w:code="9"/>
       <w:pgMar w:top="1418" w:right="1418" w:bottom="1418" w:left="1418" w:header="709" w:footer="709" w:gutter="0"/>
       <w:cols w:space="708"/>
@@ -5629,6 +5912,25 @@
     </w:sectPr>
   </w:body>
 </w:document>
+</file>
+
+<file path=word/endnotes.xml><?xml version="1.0" encoding="utf-8"?>
+<w:endnotes xmlns:wpc="http://schemas.microsoft.com/office/word/2010/wordprocessingCanvas" xmlns:cx="http://schemas.microsoft.com/office/drawing/2014/chartex" xmlns:cx1="http://schemas.microsoft.com/office/drawing/2015/9/8/chartex" xmlns:cx2="http://schemas.microsoft.com/office/drawing/2015/10/21/chartex" xmlns:cx3="http://schemas.microsoft.com/office/drawing/2016/5/9/chartex" xmlns:cx4="http://schemas.microsoft.com/office/drawing/2016/5/10/chartex" xmlns:cx5="http://schemas.microsoft.com/office/drawing/2016/5/11/chartex" xmlns:cx6="http://schemas.microsoft.com/office/drawing/2016/5/12/chartex" xmlns:cx7="http://schemas.microsoft.com/office/drawing/2016/5/13/chartex" xmlns:cx8="http://schemas.microsoft.com/office/drawing/2016/5/14/chartex" xmlns:mc="http://schemas.openxmlformats.org/markup-compatibility/2006" xmlns:aink="http://schemas.microsoft.com/office/drawing/2016/ink" xmlns:am3d="http://schemas.microsoft.com/office/drawing/2017/model3d" xmlns:o="urn:schemas-microsoft-com:office:office" xmlns:oel="http://schemas.microsoft.com/office/2019/extlst" xmlns:r="http://schemas.openxmlformats.org/officeDocument/2006/relationships" xmlns:m="http://schemas.openxmlformats.org/officeDocument/2006/math" xmlns:v="urn:schemas-microsoft-com:vml" xmlns:wp14="http://schemas.microsoft.com/office/word/2010/wordprocessingDrawing" xmlns:wp="http://schemas.openxmlformats.org/drawingml/2006/wordprocessingDrawing" xmlns:w10="urn:schemas-microsoft-com:office:word" xmlns:w="http://schemas.openxmlformats.org/wordprocessingml/2006/main" xmlns:w14="http://schemas.microsoft.com/office/word/2010/wordml" xmlns:w15="http://schemas.microsoft.com/office/word/2012/wordml" xmlns:w16cex="http://schemas.microsoft.com/office/word/2018/wordml/cex" xmlns:w16cid="http://schemas.microsoft.com/office/word/2016/wordml/cid" xmlns:w16="http://schemas.microsoft.com/office/word/2018/wordml" xmlns:w16du="http://schemas.microsoft.com/office/word/2023/wordml/word16du" xmlns:w16sdtdh="http://schemas.microsoft.com/office/word/2020/wordml/sdtdatahash" xmlns:w16sdtfl="http://schemas.microsoft.com/office/word/2024/wordml/sdtformatlock" xmlns:w16se="http://schemas.microsoft.com/office/word/2015/wordml/symex" xmlns:wpg="http://schemas.microsoft.com/office/word/2010/wordprocessingGroup" xmlns:wpi="http://schemas.microsoft.com/office/word/2010/wordprocessingInk" xmlns:wne="http://schemas.microsoft.com/office/word/2006/wordml" xmlns:wps="http://schemas.microsoft.com/office/word/2010/wordprocessingShape" mc:Ignorable="w14 w15 w16se w16cid w16 w16cex w16sdtdh w16sdtfl w16du wp14">
+  <w:endnote w:type="separator" w:id="-1">
+    <w:p>
+      <w:r>
+        <w:separator/>
+      </w:r>
+    </w:p>
+  </w:endnote>
+  <w:endnote w:type="continuationSeparator" w:id="0">
+    <w:p>
+      <w:r>
+        <w:continuationSeparator/>
+      </w:r>
+    </w:p>
+  </w:endnote>
+</w:endnotes>
 </file>
 
 <file path=word/footer1.xml><?xml version="1.0" encoding="utf-8"?>
@@ -5676,31 +5978,16 @@
             </w:rPr>
             <w:t> :</w:t>
           </w:r>
-          <w:r>
-            <w:fldChar w:fldCharType="begin"/>
-          </w:r>
-          <w:r>
-            <w:instrText xml:space="preserve"> AUTHOR   \* MERGEFORMAT </w:instrText>
-          </w:r>
-          <w:r>
-            <w:fldChar w:fldCharType="separate"/>
-          </w:r>
-          <w:r>
-            <w:rPr>
-              <w:rFonts w:cs="Arial"/>
-              <w:noProof/>
-              <w:szCs w:val="16"/>
-            </w:rPr>
-            <w:t>Agashae Premakumar</w:t>
-          </w:r>
-          <w:r>
-            <w:rPr>
-              <w:rFonts w:cs="Arial"/>
-              <w:noProof/>
-              <w:szCs w:val="16"/>
-            </w:rPr>
-            <w:fldChar w:fldCharType="end"/>
-          </w:r>
+          <w:fldSimple w:instr=" AUTHOR   \* MERGEFORMAT ">
+            <w:r>
+              <w:rPr>
+                <w:rFonts w:cs="Arial"/>
+                <w:noProof/>
+                <w:szCs w:val="16"/>
+              </w:rPr>
+              <w:t>Agashae Premakumar</w:t>
+            </w:r>
+          </w:fldSimple>
         </w:p>
         <w:p>
           <w:pPr>
@@ -6039,31 +6326,16 @@
             </w:rPr>
             <w:t xml:space="preserve">Version : </w:t>
           </w:r>
-          <w:r>
-            <w:fldChar w:fldCharType="begin"/>
-          </w:r>
-          <w:r>
-            <w:instrText xml:space="preserve"> REVNUM   \* MERGEFORMAT </w:instrText>
-          </w:r>
-          <w:r>
-            <w:fldChar w:fldCharType="separate"/>
-          </w:r>
-          <w:r>
-            <w:rPr>
-              <w:rFonts w:cs="Arial"/>
-              <w:noProof/>
-              <w:szCs w:val="16"/>
-            </w:rPr>
-            <w:t>1</w:t>
-          </w:r>
-          <w:r>
-            <w:rPr>
-              <w:rFonts w:cs="Arial"/>
-              <w:noProof/>
-              <w:szCs w:val="16"/>
-            </w:rPr>
-            <w:fldChar w:fldCharType="end"/>
-          </w:r>
+          <w:fldSimple w:instr=" REVNUM   \* MERGEFORMAT ">
+            <w:r>
+              <w:rPr>
+                <w:rFonts w:cs="Arial"/>
+                <w:noProof/>
+                <w:szCs w:val="16"/>
+              </w:rPr>
+              <w:t>1</w:t>
+            </w:r>
+          </w:fldSimple>
           <w:r>
             <w:rPr>
               <w:rFonts w:cs="Arial"/>
@@ -6106,7 +6378,7 @@
               <w:noProof/>
               <w:szCs w:val="16"/>
             </w:rPr>
-            <w:t>05.01.2026 12:51</w:t>
+            <w:t>17.06.2026 10:32</w:t>
           </w:r>
           <w:r>
             <w:rPr>
@@ -6132,31 +6404,16 @@
               <w:szCs w:val="16"/>
             </w:rPr>
           </w:pPr>
-          <w:r>
-            <w:fldChar w:fldCharType="begin"/>
-          </w:r>
-          <w:r>
-            <w:instrText xml:space="preserve"> FILENAME  \* FirstCap  \* MERGEFORMAT </w:instrText>
-          </w:r>
-          <w:r>
-            <w:fldChar w:fldCharType="separate"/>
-          </w:r>
-          <w:r>
-            <w:rPr>
-              <w:rFonts w:cs="Arial"/>
-              <w:noProof/>
-              <w:szCs w:val="16"/>
-            </w:rPr>
-            <w:t>X-187-agapremakum-Rapport-projet-docx</w:t>
-          </w:r>
-          <w:r>
-            <w:rPr>
-              <w:rFonts w:cs="Arial"/>
-              <w:noProof/>
-              <w:szCs w:val="16"/>
-            </w:rPr>
-            <w:fldChar w:fldCharType="end"/>
-          </w:r>
+          <w:fldSimple w:instr=" FILENAME  \* FirstCap  \* MERGEFORMAT ">
+            <w:r>
+              <w:rPr>
+                <w:rFonts w:cs="Arial"/>
+                <w:noProof/>
+                <w:szCs w:val="16"/>
+              </w:rPr>
+              <w:t>X-187-agapremakum-Rapport-projet-docx</w:t>
+            </w:r>
+          </w:fldSimple>
         </w:p>
       </w:tc>
     </w:tr>
@@ -6171,6 +6428,25 @@
     </w:pPr>
   </w:p>
 </w:ftr>
+</file>
+
+<file path=word/footnotes.xml><?xml version="1.0" encoding="utf-8"?>
+<w:footnotes xmlns:wpc="http://schemas.microsoft.com/office/word/2010/wordprocessingCanvas" xmlns:cx="http://schemas.microsoft.com/office/drawing/2014/chartex" xmlns:cx1="http://schemas.microsoft.com/office/drawing/2015/9/8/chartex" xmlns:cx2="http://schemas.microsoft.com/office/drawing/2015/10/21/chartex" xmlns:cx3="http://schemas.microsoft.com/office/drawing/2016/5/9/chartex" xmlns:cx4="http://schemas.microsoft.com/office/drawing/2016/5/10/chartex" xmlns:cx5="http://schemas.microsoft.com/office/drawing/2016/5/11/chartex" xmlns:cx6="http://schemas.microsoft.com/office/drawing/2016/5/12/chartex" xmlns:cx7="http://schemas.microsoft.com/office/drawing/2016/5/13/chartex" xmlns:cx8="http://schemas.microsoft.com/office/drawing/2016/5/14/chartex" xmlns:mc="http://schemas.openxmlformats.org/markup-compatibility/2006" xmlns:aink="http://schemas.microsoft.com/office/drawing/2016/ink" xmlns:am3d="http://schemas.microsoft.com/office/drawing/2017/model3d" xmlns:o="urn:schemas-microsoft-com:office:office" xmlns:oel="http://schemas.microsoft.com/office/2019/extlst" xmlns:r="http://schemas.openxmlformats.org/officeDocument/2006/relationships" xmlns:m="http://schemas.openxmlformats.org/officeDocument/2006/math" xmlns:v="urn:schemas-microsoft-com:vml" xmlns:wp14="http://schemas.microsoft.com/office/word/2010/wordprocessingDrawing" xmlns:wp="http://schemas.openxmlformats.org/drawingml/2006/wordprocessingDrawing" xmlns:w10="urn:schemas-microsoft-com:office:word" xmlns:w="http://schemas.openxmlformats.org/wordprocessingml/2006/main" xmlns:w14="http://schemas.microsoft.com/office/word/2010/wordml" xmlns:w15="http://schemas.microsoft.com/office/word/2012/wordml" xmlns:w16cex="http://schemas.microsoft.com/office/word/2018/wordml/cex" xmlns:w16cid="http://schemas.microsoft.com/office/word/2016/wordml/cid" xmlns:w16="http://schemas.microsoft.com/office/word/2018/wordml" xmlns:w16du="http://schemas.microsoft.com/office/word/2023/wordml/word16du" xmlns:w16sdtdh="http://schemas.microsoft.com/office/word/2020/wordml/sdtdatahash" xmlns:w16sdtfl="http://schemas.microsoft.com/office/word/2024/wordml/sdtformatlock" xmlns:w16se="http://schemas.microsoft.com/office/word/2015/wordml/symex" xmlns:wpg="http://schemas.microsoft.com/office/word/2010/wordprocessingGroup" xmlns:wpi="http://schemas.microsoft.com/office/word/2010/wordprocessingInk" xmlns:wne="http://schemas.microsoft.com/office/word/2006/wordml" xmlns:wps="http://schemas.microsoft.com/office/word/2010/wordprocessingShape" mc:Ignorable="w14 w15 w16se w16cid w16 w16cex w16sdtdh w16sdtfl w16du wp14">
+  <w:footnote w:type="separator" w:id="-1">
+    <w:p>
+      <w:r>
+        <w:separator/>
+      </w:r>
+    </w:p>
+  </w:footnote>
+  <w:footnote w:type="continuationSeparator" w:id="0">
+    <w:p>
+      <w:r>
+        <w:continuationSeparator/>
+      </w:r>
+    </w:p>
+  </w:footnote>
+</w:footnotes>
 </file>
 
 <file path=word/header1.xml><?xml version="1.0" encoding="utf-8"?>
@@ -6314,7 +6590,7 @@
         <v:path o:extrusionok="f" gradientshapeok="t" o:connecttype="rect"/>
         <o:lock v:ext="edit" aspectratio="t"/>
       </v:shapetype>
-      <v:shape id="_x0000_i1025" type="#_x0000_t75" style="width:11.3pt;height:11.3pt" o:bullet="t">
+      <v:shape id="_x0000_i1025" type="#_x0000_t75" style="width:11.15pt;height:11.15pt" o:bullet="t">
         <v:imagedata r:id="rId1" o:title="BD10263_"/>
       </v:shape>
     </w:pict>
@@ -6859,6 +7135,231 @@
     </w:lvl>
   </w:abstractNum>
   <w:abstractNum w:abstractNumId="5" w15:restartNumberingAfterBreak="0">
+    <w:nsid w:val="391D4706"/>
+    <w:multiLevelType w:val="hybridMultilevel"/>
+    <w:tmpl w:val="D00C0EE0"/>
+    <w:lvl w:ilvl="0" w:tplc="100C0001">
+      <w:start w:val="1"/>
+      <w:numFmt w:val="bullet"/>
+      <w:lvlText w:val=""/>
+      <w:lvlJc w:val="left"/>
+      <w:pPr>
+        <w:ind w:left="720" w:hanging="360"/>
+      </w:pPr>
+      <w:rPr>
+        <w:rFonts w:ascii="Symbol" w:hAnsi="Symbol" w:hint="default"/>
+      </w:rPr>
+    </w:lvl>
+    <w:lvl w:ilvl="1" w:tplc="100C0003" w:tentative="1">
+      <w:start w:val="1"/>
+      <w:numFmt w:val="bullet"/>
+      <w:lvlText w:val="o"/>
+      <w:lvlJc w:val="left"/>
+      <w:pPr>
+        <w:ind w:left="1440" w:hanging="360"/>
+      </w:pPr>
+      <w:rPr>
+        <w:rFonts w:ascii="Courier New" w:hAnsi="Courier New" w:cs="Courier New" w:hint="default"/>
+      </w:rPr>
+    </w:lvl>
+    <w:lvl w:ilvl="2" w:tplc="100C0005" w:tentative="1">
+      <w:start w:val="1"/>
+      <w:numFmt w:val="bullet"/>
+      <w:lvlText w:val=""/>
+      <w:lvlJc w:val="left"/>
+      <w:pPr>
+        <w:ind w:left="2160" w:hanging="360"/>
+      </w:pPr>
+      <w:rPr>
+        <w:rFonts w:ascii="Wingdings" w:hAnsi="Wingdings" w:hint="default"/>
+      </w:rPr>
+    </w:lvl>
+    <w:lvl w:ilvl="3" w:tplc="100C0001" w:tentative="1">
+      <w:start w:val="1"/>
+      <w:numFmt w:val="bullet"/>
+      <w:lvlText w:val=""/>
+      <w:lvlJc w:val="left"/>
+      <w:pPr>
+        <w:ind w:left="2880" w:hanging="360"/>
+      </w:pPr>
+      <w:rPr>
+        <w:rFonts w:ascii="Symbol" w:hAnsi="Symbol" w:hint="default"/>
+      </w:rPr>
+    </w:lvl>
+    <w:lvl w:ilvl="4" w:tplc="100C0003" w:tentative="1">
+      <w:start w:val="1"/>
+      <w:numFmt w:val="bullet"/>
+      <w:lvlText w:val="o"/>
+      <w:lvlJc w:val="left"/>
+      <w:pPr>
+        <w:ind w:left="3600" w:hanging="360"/>
+      </w:pPr>
+      <w:rPr>
+        <w:rFonts w:ascii="Courier New" w:hAnsi="Courier New" w:cs="Courier New" w:hint="default"/>
+      </w:rPr>
+    </w:lvl>
+    <w:lvl w:ilvl="5" w:tplc="100C0005" w:tentative="1">
+      <w:start w:val="1"/>
+      <w:numFmt w:val="bullet"/>
+      <w:lvlText w:val=""/>
+      <w:lvlJc w:val="left"/>
+      <w:pPr>
+        <w:ind w:left="4320" w:hanging="360"/>
+      </w:pPr>
+      <w:rPr>
+        <w:rFonts w:ascii="Wingdings" w:hAnsi="Wingdings" w:hint="default"/>
+      </w:rPr>
+    </w:lvl>
+    <w:lvl w:ilvl="6" w:tplc="100C0001" w:tentative="1">
+      <w:start w:val="1"/>
+      <w:numFmt w:val="bullet"/>
+      <w:lvlText w:val=""/>
+      <w:lvlJc w:val="left"/>
+      <w:pPr>
+        <w:ind w:left="5040" w:hanging="360"/>
+      </w:pPr>
+      <w:rPr>
+        <w:rFonts w:ascii="Symbol" w:hAnsi="Symbol" w:hint="default"/>
+      </w:rPr>
+    </w:lvl>
+    <w:lvl w:ilvl="7" w:tplc="100C0003" w:tentative="1">
+      <w:start w:val="1"/>
+      <w:numFmt w:val="bullet"/>
+      <w:lvlText w:val="o"/>
+      <w:lvlJc w:val="left"/>
+      <w:pPr>
+        <w:ind w:left="5760" w:hanging="360"/>
+      </w:pPr>
+      <w:rPr>
+        <w:rFonts w:ascii="Courier New" w:hAnsi="Courier New" w:cs="Courier New" w:hint="default"/>
+      </w:rPr>
+    </w:lvl>
+    <w:lvl w:ilvl="8" w:tplc="100C0005" w:tentative="1">
+      <w:start w:val="1"/>
+      <w:numFmt w:val="bullet"/>
+      <w:lvlText w:val=""/>
+      <w:lvlJc w:val="left"/>
+      <w:pPr>
+        <w:ind w:left="6480" w:hanging="360"/>
+      </w:pPr>
+      <w:rPr>
+        <w:rFonts w:ascii="Wingdings" w:hAnsi="Wingdings" w:hint="default"/>
+      </w:rPr>
+    </w:lvl>
+  </w:abstractNum>
+  <w:abstractNum w:abstractNumId="6" w15:restartNumberingAfterBreak="0">
+    <w:nsid w:val="39D43E6A"/>
+    <w:multiLevelType w:val="hybridMultilevel"/>
+    <w:tmpl w:val="5FE2D6EA"/>
+    <w:lvl w:ilvl="0" w:tplc="1C565470">
+      <w:numFmt w:val="bullet"/>
+      <w:lvlText w:val="-"/>
+      <w:lvlJc w:val="left"/>
+      <w:pPr>
+        <w:ind w:left="2628" w:hanging="360"/>
+      </w:pPr>
+      <w:rPr>
+        <w:rFonts w:ascii="Century Gothic" w:eastAsia="Times New Roman" w:hAnsi="Century Gothic" w:cs="Times New Roman" w:hint="default"/>
+      </w:rPr>
+    </w:lvl>
+    <w:lvl w:ilvl="1" w:tplc="100C0003">
+      <w:start w:val="1"/>
+      <w:numFmt w:val="bullet"/>
+      <w:lvlText w:val="o"/>
+      <w:lvlJc w:val="left"/>
+      <w:pPr>
+        <w:ind w:left="2574" w:hanging="360"/>
+      </w:pPr>
+      <w:rPr>
+        <w:rFonts w:ascii="Courier New" w:hAnsi="Courier New" w:cs="Courier New" w:hint="default"/>
+      </w:rPr>
+    </w:lvl>
+    <w:lvl w:ilvl="2" w:tplc="100C0005" w:tentative="1">
+      <w:start w:val="1"/>
+      <w:numFmt w:val="bullet"/>
+      <w:lvlText w:val=""/>
+      <w:lvlJc w:val="left"/>
+      <w:pPr>
+        <w:ind w:left="3294" w:hanging="360"/>
+      </w:pPr>
+      <w:rPr>
+        <w:rFonts w:ascii="Wingdings" w:hAnsi="Wingdings" w:hint="default"/>
+      </w:rPr>
+    </w:lvl>
+    <w:lvl w:ilvl="3" w:tplc="100C0001" w:tentative="1">
+      <w:start w:val="1"/>
+      <w:numFmt w:val="bullet"/>
+      <w:lvlText w:val=""/>
+      <w:lvlJc w:val="left"/>
+      <w:pPr>
+        <w:ind w:left="4014" w:hanging="360"/>
+      </w:pPr>
+      <w:rPr>
+        <w:rFonts w:ascii="Symbol" w:hAnsi="Symbol" w:hint="default"/>
+      </w:rPr>
+    </w:lvl>
+    <w:lvl w:ilvl="4" w:tplc="100C0003" w:tentative="1">
+      <w:start w:val="1"/>
+      <w:numFmt w:val="bullet"/>
+      <w:lvlText w:val="o"/>
+      <w:lvlJc w:val="left"/>
+      <w:pPr>
+        <w:ind w:left="4734" w:hanging="360"/>
+      </w:pPr>
+      <w:rPr>
+        <w:rFonts w:ascii="Courier New" w:hAnsi="Courier New" w:cs="Courier New" w:hint="default"/>
+      </w:rPr>
+    </w:lvl>
+    <w:lvl w:ilvl="5" w:tplc="100C0005" w:tentative="1">
+      <w:start w:val="1"/>
+      <w:numFmt w:val="bullet"/>
+      <w:lvlText w:val=""/>
+      <w:lvlJc w:val="left"/>
+      <w:pPr>
+        <w:ind w:left="5454" w:hanging="360"/>
+      </w:pPr>
+      <w:rPr>
+        <w:rFonts w:ascii="Wingdings" w:hAnsi="Wingdings" w:hint="default"/>
+      </w:rPr>
+    </w:lvl>
+    <w:lvl w:ilvl="6" w:tplc="100C0001" w:tentative="1">
+      <w:start w:val="1"/>
+      <w:numFmt w:val="bullet"/>
+      <w:lvlText w:val=""/>
+      <w:lvlJc w:val="left"/>
+      <w:pPr>
+        <w:ind w:left="6174" w:hanging="360"/>
+      </w:pPr>
+      <w:rPr>
+        <w:rFonts w:ascii="Symbol" w:hAnsi="Symbol" w:hint="default"/>
+      </w:rPr>
+    </w:lvl>
+    <w:lvl w:ilvl="7" w:tplc="100C0003" w:tentative="1">
+      <w:start w:val="1"/>
+      <w:numFmt w:val="bullet"/>
+      <w:lvlText w:val="o"/>
+      <w:lvlJc w:val="left"/>
+      <w:pPr>
+        <w:ind w:left="6894" w:hanging="360"/>
+      </w:pPr>
+      <w:rPr>
+        <w:rFonts w:ascii="Courier New" w:hAnsi="Courier New" w:cs="Courier New" w:hint="default"/>
+      </w:rPr>
+    </w:lvl>
+    <w:lvl w:ilvl="8" w:tplc="100C0005" w:tentative="1">
+      <w:start w:val="1"/>
+      <w:numFmt w:val="bullet"/>
+      <w:lvlText w:val=""/>
+      <w:lvlJc w:val="left"/>
+      <w:pPr>
+        <w:ind w:left="7614" w:hanging="360"/>
+      </w:pPr>
+      <w:rPr>
+        <w:rFonts w:ascii="Wingdings" w:hAnsi="Wingdings" w:hint="default"/>
+      </w:rPr>
+    </w:lvl>
+  </w:abstractNum>
+  <w:abstractNum w:abstractNumId="7" w15:restartNumberingAfterBreak="0">
     <w:nsid w:val="42C3715D"/>
     <w:multiLevelType w:val="hybridMultilevel"/>
     <w:tmpl w:val="A6544F94"/>
@@ -6970,7 +7471,232 @@
       </w:rPr>
     </w:lvl>
   </w:abstractNum>
-  <w:abstractNum w:abstractNumId="6" w15:restartNumberingAfterBreak="0">
+  <w:abstractNum w:abstractNumId="8" w15:restartNumberingAfterBreak="0">
+    <w:nsid w:val="4677751C"/>
+    <w:multiLevelType w:val="hybridMultilevel"/>
+    <w:tmpl w:val="111CC6E2"/>
+    <w:lvl w:ilvl="0" w:tplc="100C0001">
+      <w:start w:val="1"/>
+      <w:numFmt w:val="bullet"/>
+      <w:lvlText w:val=""/>
+      <w:lvlJc w:val="left"/>
+      <w:pPr>
+        <w:ind w:left="720" w:hanging="360"/>
+      </w:pPr>
+      <w:rPr>
+        <w:rFonts w:ascii="Symbol" w:hAnsi="Symbol" w:hint="default"/>
+      </w:rPr>
+    </w:lvl>
+    <w:lvl w:ilvl="1" w:tplc="100C0003" w:tentative="1">
+      <w:start w:val="1"/>
+      <w:numFmt w:val="bullet"/>
+      <w:lvlText w:val="o"/>
+      <w:lvlJc w:val="left"/>
+      <w:pPr>
+        <w:ind w:left="1440" w:hanging="360"/>
+      </w:pPr>
+      <w:rPr>
+        <w:rFonts w:ascii="Courier New" w:hAnsi="Courier New" w:cs="Courier New" w:hint="default"/>
+      </w:rPr>
+    </w:lvl>
+    <w:lvl w:ilvl="2" w:tplc="100C0005" w:tentative="1">
+      <w:start w:val="1"/>
+      <w:numFmt w:val="bullet"/>
+      <w:lvlText w:val=""/>
+      <w:lvlJc w:val="left"/>
+      <w:pPr>
+        <w:ind w:left="2160" w:hanging="360"/>
+      </w:pPr>
+      <w:rPr>
+        <w:rFonts w:ascii="Wingdings" w:hAnsi="Wingdings" w:hint="default"/>
+      </w:rPr>
+    </w:lvl>
+    <w:lvl w:ilvl="3" w:tplc="100C0001" w:tentative="1">
+      <w:start w:val="1"/>
+      <w:numFmt w:val="bullet"/>
+      <w:lvlText w:val=""/>
+      <w:lvlJc w:val="left"/>
+      <w:pPr>
+        <w:ind w:left="2880" w:hanging="360"/>
+      </w:pPr>
+      <w:rPr>
+        <w:rFonts w:ascii="Symbol" w:hAnsi="Symbol" w:hint="default"/>
+      </w:rPr>
+    </w:lvl>
+    <w:lvl w:ilvl="4" w:tplc="100C0003" w:tentative="1">
+      <w:start w:val="1"/>
+      <w:numFmt w:val="bullet"/>
+      <w:lvlText w:val="o"/>
+      <w:lvlJc w:val="left"/>
+      <w:pPr>
+        <w:ind w:left="3600" w:hanging="360"/>
+      </w:pPr>
+      <w:rPr>
+        <w:rFonts w:ascii="Courier New" w:hAnsi="Courier New" w:cs="Courier New" w:hint="default"/>
+      </w:rPr>
+    </w:lvl>
+    <w:lvl w:ilvl="5" w:tplc="100C0005" w:tentative="1">
+      <w:start w:val="1"/>
+      <w:numFmt w:val="bullet"/>
+      <w:lvlText w:val=""/>
+      <w:lvlJc w:val="left"/>
+      <w:pPr>
+        <w:ind w:left="4320" w:hanging="360"/>
+      </w:pPr>
+      <w:rPr>
+        <w:rFonts w:ascii="Wingdings" w:hAnsi="Wingdings" w:hint="default"/>
+      </w:rPr>
+    </w:lvl>
+    <w:lvl w:ilvl="6" w:tplc="100C0001" w:tentative="1">
+      <w:start w:val="1"/>
+      <w:numFmt w:val="bullet"/>
+      <w:lvlText w:val=""/>
+      <w:lvlJc w:val="left"/>
+      <w:pPr>
+        <w:ind w:left="5040" w:hanging="360"/>
+      </w:pPr>
+      <w:rPr>
+        <w:rFonts w:ascii="Symbol" w:hAnsi="Symbol" w:hint="default"/>
+      </w:rPr>
+    </w:lvl>
+    <w:lvl w:ilvl="7" w:tplc="100C0003" w:tentative="1">
+      <w:start w:val="1"/>
+      <w:numFmt w:val="bullet"/>
+      <w:lvlText w:val="o"/>
+      <w:lvlJc w:val="left"/>
+      <w:pPr>
+        <w:ind w:left="5760" w:hanging="360"/>
+      </w:pPr>
+      <w:rPr>
+        <w:rFonts w:ascii="Courier New" w:hAnsi="Courier New" w:cs="Courier New" w:hint="default"/>
+      </w:rPr>
+    </w:lvl>
+    <w:lvl w:ilvl="8" w:tplc="100C0005" w:tentative="1">
+      <w:start w:val="1"/>
+      <w:numFmt w:val="bullet"/>
+      <w:lvlText w:val=""/>
+      <w:lvlJc w:val="left"/>
+      <w:pPr>
+        <w:ind w:left="6480" w:hanging="360"/>
+      </w:pPr>
+      <w:rPr>
+        <w:rFonts w:ascii="Wingdings" w:hAnsi="Wingdings" w:hint="default"/>
+      </w:rPr>
+    </w:lvl>
+  </w:abstractNum>
+  <w:abstractNum w:abstractNumId="9" w15:restartNumberingAfterBreak="0">
+    <w:nsid w:val="4DAE50F6"/>
+    <w:multiLevelType w:val="hybridMultilevel"/>
+    <w:tmpl w:val="163C649A"/>
+    <w:lvl w:ilvl="0" w:tplc="FFFFFFFF">
+      <w:numFmt w:val="bullet"/>
+      <w:lvlText w:val="-"/>
+      <w:lvlJc w:val="left"/>
+      <w:pPr>
+        <w:ind w:left="360" w:hanging="360"/>
+      </w:pPr>
+      <w:rPr>
+        <w:rFonts w:ascii="Century Gothic" w:eastAsia="Times New Roman" w:hAnsi="Century Gothic" w:cs="Times New Roman" w:hint="default"/>
+      </w:rPr>
+    </w:lvl>
+    <w:lvl w:ilvl="1" w:tplc="100C0001">
+      <w:start w:val="1"/>
+      <w:numFmt w:val="bullet"/>
+      <w:lvlText w:val=""/>
+      <w:lvlJc w:val="left"/>
+      <w:pPr>
+        <w:ind w:left="-414" w:hanging="360"/>
+      </w:pPr>
+      <w:rPr>
+        <w:rFonts w:ascii="Symbol" w:hAnsi="Symbol" w:hint="default"/>
+      </w:rPr>
+    </w:lvl>
+    <w:lvl w:ilvl="2" w:tplc="FFFFFFFF" w:tentative="1">
+      <w:start w:val="1"/>
+      <w:numFmt w:val="bullet"/>
+      <w:lvlText w:val=""/>
+      <w:lvlJc w:val="left"/>
+      <w:pPr>
+        <w:ind w:left="1026" w:hanging="360"/>
+      </w:pPr>
+      <w:rPr>
+        <w:rFonts w:ascii="Wingdings" w:hAnsi="Wingdings" w:hint="default"/>
+      </w:rPr>
+    </w:lvl>
+    <w:lvl w:ilvl="3" w:tplc="FFFFFFFF" w:tentative="1">
+      <w:start w:val="1"/>
+      <w:numFmt w:val="bullet"/>
+      <w:lvlText w:val=""/>
+      <w:lvlJc w:val="left"/>
+      <w:pPr>
+        <w:ind w:left="1746" w:hanging="360"/>
+      </w:pPr>
+      <w:rPr>
+        <w:rFonts w:ascii="Symbol" w:hAnsi="Symbol" w:hint="default"/>
+      </w:rPr>
+    </w:lvl>
+    <w:lvl w:ilvl="4" w:tplc="FFFFFFFF" w:tentative="1">
+      <w:start w:val="1"/>
+      <w:numFmt w:val="bullet"/>
+      <w:lvlText w:val="o"/>
+      <w:lvlJc w:val="left"/>
+      <w:pPr>
+        <w:ind w:left="2466" w:hanging="360"/>
+      </w:pPr>
+      <w:rPr>
+        <w:rFonts w:ascii="Courier New" w:hAnsi="Courier New" w:cs="Courier New" w:hint="default"/>
+      </w:rPr>
+    </w:lvl>
+    <w:lvl w:ilvl="5" w:tplc="FFFFFFFF" w:tentative="1">
+      <w:start w:val="1"/>
+      <w:numFmt w:val="bullet"/>
+      <w:lvlText w:val=""/>
+      <w:lvlJc w:val="left"/>
+      <w:pPr>
+        <w:ind w:left="3186" w:hanging="360"/>
+      </w:pPr>
+      <w:rPr>
+        <w:rFonts w:ascii="Wingdings" w:hAnsi="Wingdings" w:hint="default"/>
+      </w:rPr>
+    </w:lvl>
+    <w:lvl w:ilvl="6" w:tplc="FFFFFFFF" w:tentative="1">
+      <w:start w:val="1"/>
+      <w:numFmt w:val="bullet"/>
+      <w:lvlText w:val=""/>
+      <w:lvlJc w:val="left"/>
+      <w:pPr>
+        <w:ind w:left="3906" w:hanging="360"/>
+      </w:pPr>
+      <w:rPr>
+        <w:rFonts w:ascii="Symbol" w:hAnsi="Symbol" w:hint="default"/>
+      </w:rPr>
+    </w:lvl>
+    <w:lvl w:ilvl="7" w:tplc="FFFFFFFF" w:tentative="1">
+      <w:start w:val="1"/>
+      <w:numFmt w:val="bullet"/>
+      <w:lvlText w:val="o"/>
+      <w:lvlJc w:val="left"/>
+      <w:pPr>
+        <w:ind w:left="4626" w:hanging="360"/>
+      </w:pPr>
+      <w:rPr>
+        <w:rFonts w:ascii="Courier New" w:hAnsi="Courier New" w:cs="Courier New" w:hint="default"/>
+      </w:rPr>
+    </w:lvl>
+    <w:lvl w:ilvl="8" w:tplc="FFFFFFFF" w:tentative="1">
+      <w:start w:val="1"/>
+      <w:numFmt w:val="bullet"/>
+      <w:lvlText w:val=""/>
+      <w:lvlJc w:val="left"/>
+      <w:pPr>
+        <w:ind w:left="5346" w:hanging="360"/>
+      </w:pPr>
+      <w:rPr>
+        <w:rFonts w:ascii="Wingdings" w:hAnsi="Wingdings" w:hint="default"/>
+      </w:rPr>
+    </w:lvl>
+  </w:abstractNum>
+  <w:abstractNum w:abstractNumId="10" w15:restartNumberingAfterBreak="0">
     <w:nsid w:val="5ED670C5"/>
     <w:multiLevelType w:val="hybridMultilevel"/>
     <w:tmpl w:val="18F6FBE8"/>
@@ -7083,7 +7809,7 @@
       </w:rPr>
     </w:lvl>
   </w:abstractNum>
-  <w:abstractNum w:abstractNumId="7" w15:restartNumberingAfterBreak="0">
+  <w:abstractNum w:abstractNumId="11" w15:restartNumberingAfterBreak="0">
     <w:nsid w:val="7CA80F47"/>
     <w:multiLevelType w:val="multilevel"/>
     <w:tmpl w:val="6E6A5C5C"/>
@@ -7245,16 +7971,28 @@
     <w:abstractNumId w:val="2"/>
   </w:num>
   <w:num w:numId="5" w16cid:durableId="706881446">
-    <w:abstractNumId w:val="5"/>
+    <w:abstractNumId w:val="7"/>
   </w:num>
   <w:num w:numId="6" w16cid:durableId="504590212">
-    <w:abstractNumId w:val="6"/>
+    <w:abstractNumId w:val="10"/>
   </w:num>
   <w:num w:numId="7" w16cid:durableId="1270233319">
-    <w:abstractNumId w:val="7"/>
+    <w:abstractNumId w:val="11"/>
   </w:num>
   <w:num w:numId="8" w16cid:durableId="1304502320">
     <w:abstractNumId w:val="4"/>
+  </w:num>
+  <w:num w:numId="9" w16cid:durableId="1570072861">
+    <w:abstractNumId w:val="8"/>
+  </w:num>
+  <w:num w:numId="10" w16cid:durableId="2438248">
+    <w:abstractNumId w:val="6"/>
+  </w:num>
+  <w:num w:numId="11" w16cid:durableId="767385839">
+    <w:abstractNumId w:val="9"/>
+  </w:num>
+  <w:num w:numId="12" w16cid:durableId="1797718650">
+    <w:abstractNumId w:val="5"/>
   </w:num>
   <w:numIdMacAtCleanup w:val="8"/>
 </w:numbering>
@@ -7856,6 +8594,7 @@
   <w:style w:type="character" w:default="1" w:styleId="Policepardfaut">
     <w:name w:val="Default Paragraph Font"/>
     <w:uiPriority w:val="1"/>
+    <w:semiHidden/>
     <w:unhideWhenUsed/>
   </w:style>
   <w:style w:type="table" w:default="1" w:styleId="TableauNormal">
@@ -8731,6 +9470,18 @@
       <w:szCs w:val="24"/>
     </w:rPr>
   </w:style>
+  <w:style w:type="character" w:styleId="Lienhypertextesuivivisit">
+    <w:name w:val="FollowedHyperlink"/>
+    <w:basedOn w:val="Policepardfaut"/>
+    <w:uiPriority w:val="99"/>
+    <w:semiHidden/>
+    <w:unhideWhenUsed/>
+    <w:rsid w:val="007843BD"/>
+    <w:rPr>
+      <w:color w:val="96607D" w:themeColor="followedHyperlink"/>
+      <w:u w:val="single"/>
+    </w:rPr>
+  </w:style>
 </w:styles>
 </file>
 

</xml_diff>

<commit_message>
update : mettre a jour CDC
</commit_message>
<xml_diff>
--- a/annexe/CdC.docx
+++ b/annexe/CdC.docx
@@ -5854,6 +5854,85 @@
           <w:sz w:val="20"/>
         </w:rPr>
       </w:pPr>
+    </w:p>
+    <w:p>
+      <w:pPr>
+        <w:pStyle w:val="Titre1"/>
+      </w:pPr>
+      <w:r>
+        <w:t>Utilisation de l’IA</w:t>
+      </w:r>
+    </w:p>
+    <w:p>
+      <w:r>
+        <w:t>L’IA a été utilisé pour m’aider à :</w:t>
+      </w:r>
+    </w:p>
+    <w:p>
+      <w:pPr>
+        <w:pStyle w:val="Paragraphedeliste"/>
+        <w:numPr>
+          <w:ilvl w:val="0"/>
+          <w:numId w:val="14"/>
+        </w:numPr>
+      </w:pPr>
+      <w:r>
+        <w:t>Structurer</w:t>
+      </w:r>
+      <w:r>
+        <w:t>/nettoyer</w:t>
+      </w:r>
+      <w:r>
+        <w:t xml:space="preserve"> mon code HTML/CSS</w:t>
+      </w:r>
+    </w:p>
+    <w:p>
+      <w:pPr>
+        <w:pStyle w:val="Paragraphedeliste"/>
+        <w:numPr>
+          <w:ilvl w:val="0"/>
+          <w:numId w:val="14"/>
+        </w:numPr>
+      </w:pPr>
+      <w:r>
+        <w:t>Création des fichiers JS/JSON du PWA</w:t>
+      </w:r>
+    </w:p>
+    <w:p>
+      <w:pPr>
+        <w:pStyle w:val="Paragraphedeliste"/>
+        <w:numPr>
+          <w:ilvl w:val="0"/>
+          <w:numId w:val="14"/>
+        </w:numPr>
+      </w:pPr>
+      <w:r>
+        <w:t>Me renseigner sur le PWA et sur</w:t>
+      </w:r>
+      <w:r>
+        <w:t xml:space="preserve"> l’utilisation de</w:t>
+      </w:r>
+      <w:r>
+        <w:t xml:space="preserve"> GitHub</w:t>
+      </w:r>
+    </w:p>
+    <w:p>
+      <w:pPr>
+        <w:pStyle w:val="Paragraphedeliste"/>
+        <w:numPr>
+          <w:ilvl w:val="0"/>
+          <w:numId w:val="14"/>
+        </w:numPr>
+      </w:pPr>
+      <w:r>
+        <w:t>Ajouter mon CdC dans le Rea</w:t>
+      </w:r>
+      <w:r>
+        <w:t>dm</w:t>
+      </w:r>
+      <w:r>
+        <w:t>e</w:t>
+      </w:r>
     </w:p>
     <w:p>
       <w:pPr>
@@ -6730,6 +6809,119 @@
     </w:lvl>
   </w:abstractNum>
   <w:abstractNum w:abstractNumId="2" w15:restartNumberingAfterBreak="0">
+    <w:nsid w:val="0F684BDA"/>
+    <w:multiLevelType w:val="hybridMultilevel"/>
+    <w:tmpl w:val="6246828C"/>
+    <w:lvl w:ilvl="0" w:tplc="100C0001">
+      <w:start w:val="1"/>
+      <w:numFmt w:val="bullet"/>
+      <w:lvlText w:val=""/>
+      <w:lvlJc w:val="left"/>
+      <w:pPr>
+        <w:ind w:left="720" w:hanging="360"/>
+      </w:pPr>
+      <w:rPr>
+        <w:rFonts w:ascii="Symbol" w:hAnsi="Symbol" w:hint="default"/>
+      </w:rPr>
+    </w:lvl>
+    <w:lvl w:ilvl="1" w:tplc="100C0003" w:tentative="1">
+      <w:start w:val="1"/>
+      <w:numFmt w:val="bullet"/>
+      <w:lvlText w:val="o"/>
+      <w:lvlJc w:val="left"/>
+      <w:pPr>
+        <w:ind w:left="1440" w:hanging="360"/>
+      </w:pPr>
+      <w:rPr>
+        <w:rFonts w:ascii="Courier New" w:hAnsi="Courier New" w:cs="Courier New" w:hint="default"/>
+      </w:rPr>
+    </w:lvl>
+    <w:lvl w:ilvl="2" w:tplc="100C0005" w:tentative="1">
+      <w:start w:val="1"/>
+      <w:numFmt w:val="bullet"/>
+      <w:lvlText w:val=""/>
+      <w:lvlJc w:val="left"/>
+      <w:pPr>
+        <w:ind w:left="2160" w:hanging="360"/>
+      </w:pPr>
+      <w:rPr>
+        <w:rFonts w:ascii="Wingdings" w:hAnsi="Wingdings" w:hint="default"/>
+      </w:rPr>
+    </w:lvl>
+    <w:lvl w:ilvl="3" w:tplc="100C0001" w:tentative="1">
+      <w:start w:val="1"/>
+      <w:numFmt w:val="bullet"/>
+      <w:lvlText w:val=""/>
+      <w:lvlJc w:val="left"/>
+      <w:pPr>
+        <w:ind w:left="2880" w:hanging="360"/>
+      </w:pPr>
+      <w:rPr>
+        <w:rFonts w:ascii="Symbol" w:hAnsi="Symbol" w:hint="default"/>
+      </w:rPr>
+    </w:lvl>
+    <w:lvl w:ilvl="4" w:tplc="100C0003" w:tentative="1">
+      <w:start w:val="1"/>
+      <w:numFmt w:val="bullet"/>
+      <w:lvlText w:val="o"/>
+      <w:lvlJc w:val="left"/>
+      <w:pPr>
+        <w:ind w:left="3600" w:hanging="360"/>
+      </w:pPr>
+      <w:rPr>
+        <w:rFonts w:ascii="Courier New" w:hAnsi="Courier New" w:cs="Courier New" w:hint="default"/>
+      </w:rPr>
+    </w:lvl>
+    <w:lvl w:ilvl="5" w:tplc="100C0005" w:tentative="1">
+      <w:start w:val="1"/>
+      <w:numFmt w:val="bullet"/>
+      <w:lvlText w:val=""/>
+      <w:lvlJc w:val="left"/>
+      <w:pPr>
+        <w:ind w:left="4320" w:hanging="360"/>
+      </w:pPr>
+      <w:rPr>
+        <w:rFonts w:ascii="Wingdings" w:hAnsi="Wingdings" w:hint="default"/>
+      </w:rPr>
+    </w:lvl>
+    <w:lvl w:ilvl="6" w:tplc="100C0001" w:tentative="1">
+      <w:start w:val="1"/>
+      <w:numFmt w:val="bullet"/>
+      <w:lvlText w:val=""/>
+      <w:lvlJc w:val="left"/>
+      <w:pPr>
+        <w:ind w:left="5040" w:hanging="360"/>
+      </w:pPr>
+      <w:rPr>
+        <w:rFonts w:ascii="Symbol" w:hAnsi="Symbol" w:hint="default"/>
+      </w:rPr>
+    </w:lvl>
+    <w:lvl w:ilvl="7" w:tplc="100C0003" w:tentative="1">
+      <w:start w:val="1"/>
+      <w:numFmt w:val="bullet"/>
+      <w:lvlText w:val="o"/>
+      <w:lvlJc w:val="left"/>
+      <w:pPr>
+        <w:ind w:left="5760" w:hanging="360"/>
+      </w:pPr>
+      <w:rPr>
+        <w:rFonts w:ascii="Courier New" w:hAnsi="Courier New" w:cs="Courier New" w:hint="default"/>
+      </w:rPr>
+    </w:lvl>
+    <w:lvl w:ilvl="8" w:tplc="100C0005" w:tentative="1">
+      <w:start w:val="1"/>
+      <w:numFmt w:val="bullet"/>
+      <w:lvlText w:val=""/>
+      <w:lvlJc w:val="left"/>
+      <w:pPr>
+        <w:ind w:left="6480" w:hanging="360"/>
+      </w:pPr>
+      <w:rPr>
+        <w:rFonts w:ascii="Wingdings" w:hAnsi="Wingdings" w:hint="default"/>
+      </w:rPr>
+    </w:lvl>
+  </w:abstractNum>
+  <w:abstractNum w:abstractNumId="3" w15:restartNumberingAfterBreak="0">
     <w:nsid w:val="13386E8A"/>
     <w:multiLevelType w:val="multilevel"/>
     <w:tmpl w:val="100C0021"/>
@@ -6842,7 +7034,7 @@
       </w:rPr>
     </w:lvl>
   </w:abstractNum>
-  <w:abstractNum w:abstractNumId="3" w15:restartNumberingAfterBreak="0">
+  <w:abstractNum w:abstractNumId="4" w15:restartNumberingAfterBreak="0">
     <w:nsid w:val="13AB381A"/>
     <w:multiLevelType w:val="hybridMultilevel"/>
     <w:tmpl w:val="B43857E8"/>
@@ -6985,7 +7177,7 @@
       </w:rPr>
     </w:lvl>
   </w:abstractNum>
-  <w:abstractNum w:abstractNumId="4" w15:restartNumberingAfterBreak="0">
+  <w:abstractNum w:abstractNumId="5" w15:restartNumberingAfterBreak="0">
     <w:nsid w:val="2BD00990"/>
     <w:multiLevelType w:val="multilevel"/>
     <w:tmpl w:val="06B2357E"/>
@@ -7134,7 +7326,7 @@
       </w:rPr>
     </w:lvl>
   </w:abstractNum>
-  <w:abstractNum w:abstractNumId="5" w15:restartNumberingAfterBreak="0">
+  <w:abstractNum w:abstractNumId="6" w15:restartNumberingAfterBreak="0">
     <w:nsid w:val="391D4706"/>
     <w:multiLevelType w:val="hybridMultilevel"/>
     <w:tmpl w:val="D00C0EE0"/>
@@ -7247,7 +7439,7 @@
       </w:rPr>
     </w:lvl>
   </w:abstractNum>
-  <w:abstractNum w:abstractNumId="6" w15:restartNumberingAfterBreak="0">
+  <w:abstractNum w:abstractNumId="7" w15:restartNumberingAfterBreak="0">
     <w:nsid w:val="39D43E6A"/>
     <w:multiLevelType w:val="hybridMultilevel"/>
     <w:tmpl w:val="5FE2D6EA"/>
@@ -7359,7 +7551,7 @@
       </w:rPr>
     </w:lvl>
   </w:abstractNum>
-  <w:abstractNum w:abstractNumId="7" w15:restartNumberingAfterBreak="0">
+  <w:abstractNum w:abstractNumId="8" w15:restartNumberingAfterBreak="0">
     <w:nsid w:val="42C3715D"/>
     <w:multiLevelType w:val="hybridMultilevel"/>
     <w:tmpl w:val="A6544F94"/>
@@ -7471,7 +7663,7 @@
       </w:rPr>
     </w:lvl>
   </w:abstractNum>
-  <w:abstractNum w:abstractNumId="8" w15:restartNumberingAfterBreak="0">
+  <w:abstractNum w:abstractNumId="9" w15:restartNumberingAfterBreak="0">
     <w:nsid w:val="4677751C"/>
     <w:multiLevelType w:val="hybridMultilevel"/>
     <w:tmpl w:val="111CC6E2"/>
@@ -7584,7 +7776,7 @@
       </w:rPr>
     </w:lvl>
   </w:abstractNum>
-  <w:abstractNum w:abstractNumId="9" w15:restartNumberingAfterBreak="0">
+  <w:abstractNum w:abstractNumId="10" w15:restartNumberingAfterBreak="0">
     <w:nsid w:val="4DAE50F6"/>
     <w:multiLevelType w:val="hybridMultilevel"/>
     <w:tmpl w:val="163C649A"/>
@@ -7696,7 +7888,7 @@
       </w:rPr>
     </w:lvl>
   </w:abstractNum>
-  <w:abstractNum w:abstractNumId="10" w15:restartNumberingAfterBreak="0">
+  <w:abstractNum w:abstractNumId="11" w15:restartNumberingAfterBreak="0">
     <w:nsid w:val="5ED670C5"/>
     <w:multiLevelType w:val="hybridMultilevel"/>
     <w:tmpl w:val="18F6FBE8"/>
@@ -7809,7 +8001,120 @@
       </w:rPr>
     </w:lvl>
   </w:abstractNum>
-  <w:abstractNum w:abstractNumId="11" w15:restartNumberingAfterBreak="0">
+  <w:abstractNum w:abstractNumId="12" w15:restartNumberingAfterBreak="0">
+    <w:nsid w:val="61565B1B"/>
+    <w:multiLevelType w:val="hybridMultilevel"/>
+    <w:tmpl w:val="C604366E"/>
+    <w:lvl w:ilvl="0" w:tplc="100C0001">
+      <w:start w:val="1"/>
+      <w:numFmt w:val="bullet"/>
+      <w:lvlText w:val=""/>
+      <w:lvlJc w:val="left"/>
+      <w:pPr>
+        <w:ind w:left="720" w:hanging="360"/>
+      </w:pPr>
+      <w:rPr>
+        <w:rFonts w:ascii="Symbol" w:hAnsi="Symbol" w:hint="default"/>
+      </w:rPr>
+    </w:lvl>
+    <w:lvl w:ilvl="1" w:tplc="100C0003" w:tentative="1">
+      <w:start w:val="1"/>
+      <w:numFmt w:val="bullet"/>
+      <w:lvlText w:val="o"/>
+      <w:lvlJc w:val="left"/>
+      <w:pPr>
+        <w:ind w:left="1440" w:hanging="360"/>
+      </w:pPr>
+      <w:rPr>
+        <w:rFonts w:ascii="Courier New" w:hAnsi="Courier New" w:cs="Courier New" w:hint="default"/>
+      </w:rPr>
+    </w:lvl>
+    <w:lvl w:ilvl="2" w:tplc="100C0005" w:tentative="1">
+      <w:start w:val="1"/>
+      <w:numFmt w:val="bullet"/>
+      <w:lvlText w:val=""/>
+      <w:lvlJc w:val="left"/>
+      <w:pPr>
+        <w:ind w:left="2160" w:hanging="360"/>
+      </w:pPr>
+      <w:rPr>
+        <w:rFonts w:ascii="Wingdings" w:hAnsi="Wingdings" w:hint="default"/>
+      </w:rPr>
+    </w:lvl>
+    <w:lvl w:ilvl="3" w:tplc="100C0001" w:tentative="1">
+      <w:start w:val="1"/>
+      <w:numFmt w:val="bullet"/>
+      <w:lvlText w:val=""/>
+      <w:lvlJc w:val="left"/>
+      <w:pPr>
+        <w:ind w:left="2880" w:hanging="360"/>
+      </w:pPr>
+      <w:rPr>
+        <w:rFonts w:ascii="Symbol" w:hAnsi="Symbol" w:hint="default"/>
+      </w:rPr>
+    </w:lvl>
+    <w:lvl w:ilvl="4" w:tplc="100C0003" w:tentative="1">
+      <w:start w:val="1"/>
+      <w:numFmt w:val="bullet"/>
+      <w:lvlText w:val="o"/>
+      <w:lvlJc w:val="left"/>
+      <w:pPr>
+        <w:ind w:left="3600" w:hanging="360"/>
+      </w:pPr>
+      <w:rPr>
+        <w:rFonts w:ascii="Courier New" w:hAnsi="Courier New" w:cs="Courier New" w:hint="default"/>
+      </w:rPr>
+    </w:lvl>
+    <w:lvl w:ilvl="5" w:tplc="100C0005" w:tentative="1">
+      <w:start w:val="1"/>
+      <w:numFmt w:val="bullet"/>
+      <w:lvlText w:val=""/>
+      <w:lvlJc w:val="left"/>
+      <w:pPr>
+        <w:ind w:left="4320" w:hanging="360"/>
+      </w:pPr>
+      <w:rPr>
+        <w:rFonts w:ascii="Wingdings" w:hAnsi="Wingdings" w:hint="default"/>
+      </w:rPr>
+    </w:lvl>
+    <w:lvl w:ilvl="6" w:tplc="100C0001" w:tentative="1">
+      <w:start w:val="1"/>
+      <w:numFmt w:val="bullet"/>
+      <w:lvlText w:val=""/>
+      <w:lvlJc w:val="left"/>
+      <w:pPr>
+        <w:ind w:left="5040" w:hanging="360"/>
+      </w:pPr>
+      <w:rPr>
+        <w:rFonts w:ascii="Symbol" w:hAnsi="Symbol" w:hint="default"/>
+      </w:rPr>
+    </w:lvl>
+    <w:lvl w:ilvl="7" w:tplc="100C0003" w:tentative="1">
+      <w:start w:val="1"/>
+      <w:numFmt w:val="bullet"/>
+      <w:lvlText w:val="o"/>
+      <w:lvlJc w:val="left"/>
+      <w:pPr>
+        <w:ind w:left="5760" w:hanging="360"/>
+      </w:pPr>
+      <w:rPr>
+        <w:rFonts w:ascii="Courier New" w:hAnsi="Courier New" w:cs="Courier New" w:hint="default"/>
+      </w:rPr>
+    </w:lvl>
+    <w:lvl w:ilvl="8" w:tplc="100C0005" w:tentative="1">
+      <w:start w:val="1"/>
+      <w:numFmt w:val="bullet"/>
+      <w:lvlText w:val=""/>
+      <w:lvlJc w:val="left"/>
+      <w:pPr>
+        <w:ind w:left="6480" w:hanging="360"/>
+      </w:pPr>
+      <w:rPr>
+        <w:rFonts w:ascii="Wingdings" w:hAnsi="Wingdings" w:hint="default"/>
+      </w:rPr>
+    </w:lvl>
+  </w:abstractNum>
+  <w:abstractNum w:abstractNumId="13" w15:restartNumberingAfterBreak="0">
     <w:nsid w:val="7CA80F47"/>
     <w:multiLevelType w:val="multilevel"/>
     <w:tmpl w:val="6E6A5C5C"/>
@@ -7959,7 +8264,7 @@
     </w:lvl>
   </w:abstractNum>
   <w:num w:numId="1" w16cid:durableId="219751386">
-    <w:abstractNumId w:val="3"/>
+    <w:abstractNumId w:val="4"/>
   </w:num>
   <w:num w:numId="2" w16cid:durableId="2053262383">
     <w:abstractNumId w:val="1"/>
@@ -7968,31 +8273,37 @@
     <w:abstractNumId w:val="0"/>
   </w:num>
   <w:num w:numId="4" w16cid:durableId="1979067499">
+    <w:abstractNumId w:val="3"/>
+  </w:num>
+  <w:num w:numId="5" w16cid:durableId="706881446">
+    <w:abstractNumId w:val="8"/>
+  </w:num>
+  <w:num w:numId="6" w16cid:durableId="504590212">
+    <w:abstractNumId w:val="11"/>
+  </w:num>
+  <w:num w:numId="7" w16cid:durableId="1270233319">
+    <w:abstractNumId w:val="13"/>
+  </w:num>
+  <w:num w:numId="8" w16cid:durableId="1304502320">
+    <w:abstractNumId w:val="5"/>
+  </w:num>
+  <w:num w:numId="9" w16cid:durableId="1570072861">
+    <w:abstractNumId w:val="9"/>
+  </w:num>
+  <w:num w:numId="10" w16cid:durableId="2438248">
+    <w:abstractNumId w:val="7"/>
+  </w:num>
+  <w:num w:numId="11" w16cid:durableId="767385839">
+    <w:abstractNumId w:val="10"/>
+  </w:num>
+  <w:num w:numId="12" w16cid:durableId="1797718650">
+    <w:abstractNumId w:val="6"/>
+  </w:num>
+  <w:num w:numId="13" w16cid:durableId="1135559714">
     <w:abstractNumId w:val="2"/>
   </w:num>
-  <w:num w:numId="5" w16cid:durableId="706881446">
-    <w:abstractNumId w:val="7"/>
-  </w:num>
-  <w:num w:numId="6" w16cid:durableId="504590212">
-    <w:abstractNumId w:val="10"/>
-  </w:num>
-  <w:num w:numId="7" w16cid:durableId="1270233319">
-    <w:abstractNumId w:val="11"/>
-  </w:num>
-  <w:num w:numId="8" w16cid:durableId="1304502320">
-    <w:abstractNumId w:val="4"/>
-  </w:num>
-  <w:num w:numId="9" w16cid:durableId="1570072861">
-    <w:abstractNumId w:val="8"/>
-  </w:num>
-  <w:num w:numId="10" w16cid:durableId="2438248">
-    <w:abstractNumId w:val="6"/>
-  </w:num>
-  <w:num w:numId="11" w16cid:durableId="767385839">
-    <w:abstractNumId w:val="9"/>
-  </w:num>
-  <w:num w:numId="12" w16cid:durableId="1797718650">
-    <w:abstractNumId w:val="5"/>
+  <w:num w:numId="14" w16cid:durableId="1400205128">
+    <w:abstractNumId w:val="12"/>
   </w:num>
   <w:numIdMacAtCleanup w:val="8"/>
 </w:numbering>

</xml_diff>

<commit_message>
update : nettoyer mon code
</commit_message>
<xml_diff>
--- a/annexe/CdC.docx
+++ b/annexe/CdC.docx
@@ -1517,13 +1517,13 @@
       <w:pPr>
         <w:pStyle w:val="Titre2"/>
       </w:pPr>
-      <w:bookmarkStart w:id="3" w:name="_Toc532179969"/>
-      <w:bookmarkStart w:id="4" w:name="_Toc165969639"/>
-      <w:bookmarkStart w:id="5" w:name="_Toc232586081"/>
+      <w:bookmarkStart w:id="3" w:name="_Toc232586081"/>
+      <w:bookmarkStart w:id="4" w:name="_Toc532179969"/>
+      <w:bookmarkStart w:id="5" w:name="_Toc165969639"/>
       <w:r>
         <w:t>Titre</w:t>
       </w:r>
-      <w:bookmarkEnd w:id="5"/>
+      <w:bookmarkEnd w:id="3"/>
     </w:p>
     <w:p>
       <w:pPr>
@@ -1856,8 +1856,8 @@
       <w:r>
         <w:t>Planification</w:t>
       </w:r>
-      <w:bookmarkEnd w:id="3"/>
       <w:bookmarkEnd w:id="4"/>
+      <w:bookmarkEnd w:id="5"/>
       <w:r>
         <w:t xml:space="preserve"> Initiale</w:t>
       </w:r>
@@ -5141,19 +5141,7 @@
               <w:rPr>
                 <w:noProof/>
               </w:rPr>
-              <w:t>Spécific</w:t>
-            </w:r>
-            <w:r>
-              <w:rPr>
-                <w:noProof/>
-              </w:rPr>
-              <w:t>a</w:t>
-            </w:r>
-            <w:r>
-              <w:rPr>
-                <w:noProof/>
-              </w:rPr>
-              <w:t>tions</w:t>
+              <w:t>Spécifications</w:t>
             </w:r>
             <w:r>
               <w:rPr>
@@ -5447,7 +5435,99 @@
               <w:right w:w="120" w:type="dxa"/>
             </w:tcMar>
           </w:tcPr>
-          <w:p/>
+          <w:p>
+            <w:r>
+              <w:t>17.06.26</w:t>
+            </w:r>
+          </w:p>
+        </w:tc>
+      </w:tr>
+      <w:tr>
+        <w:tc>
+          <w:tcPr>
+            <w:tcW w:w="3016" w:type="dxa"/>
+            <w:gridSpan w:val="2"/>
+            <w:tcBorders>
+              <w:top w:val="single" w:sz="1" w:space="0" w:color="CCCCCC"/>
+              <w:left w:val="single" w:sz="1" w:space="0" w:color="CCCCCC"/>
+              <w:bottom w:val="single" w:sz="1" w:space="0" w:color="CCCCCC"/>
+              <w:right w:val="single" w:sz="1" w:space="0" w:color="CCCCCC"/>
+            </w:tcBorders>
+            <w:shd w:val="clear" w:color="auto" w:fill="FFFFFF" w:themeFill="background1"/>
+            <w:tcMar>
+              <w:top w:w="80" w:type="dxa"/>
+              <w:left w:w="120" w:type="dxa"/>
+              <w:bottom w:w="80" w:type="dxa"/>
+              <w:right w:w="120" w:type="dxa"/>
+            </w:tcMar>
+          </w:tcPr>
+          <w:p>
+            <w:pPr>
+              <w:pStyle w:val="TM1"/>
+              <w:tabs>
+                <w:tab w:val="right" w:leader="dot" w:pos="9060"/>
+              </w:tabs>
+            </w:pPr>
+            <w:r>
+              <w:t>Nettoyer/Structurer mon code HTML/CSS pour que ça soit + propre et mon repo GitHub qui était une poubelle…</w:t>
+            </w:r>
+          </w:p>
+        </w:tc>
+        <w:tc>
+          <w:tcPr>
+            <w:tcW w:w="1298" w:type="dxa"/>
+            <w:gridSpan w:val="2"/>
+            <w:tcBorders>
+              <w:top w:val="single" w:sz="1" w:space="0" w:color="CCCCCC"/>
+              <w:left w:val="single" w:sz="1" w:space="0" w:color="CCCCCC"/>
+              <w:bottom w:val="single" w:sz="1" w:space="0" w:color="CCCCCC"/>
+              <w:right w:val="single" w:sz="1" w:space="0" w:color="CCCCCC"/>
+            </w:tcBorders>
+            <w:shd w:val="clear" w:color="auto" w:fill="FFFFFF" w:themeFill="background1"/>
+            <w:tcMar>
+              <w:top w:w="80" w:type="dxa"/>
+              <w:left w:w="120" w:type="dxa"/>
+              <w:bottom w:w="80" w:type="dxa"/>
+              <w:right w:w="120" w:type="dxa"/>
+            </w:tcMar>
+          </w:tcPr>
+          <w:p>
+            <w:r>
+              <w:t xml:space="preserve">1 séquence de </w:t>
+            </w:r>
+            <w:r>
+              <w:t>2</w:t>
+            </w:r>
+            <w:r>
+              <w:t xml:space="preserve"> période</w:t>
+            </w:r>
+            <w:r>
+              <w:t>s</w:t>
+            </w:r>
+          </w:p>
+        </w:tc>
+        <w:tc>
+          <w:tcPr>
+            <w:tcW w:w="1358" w:type="dxa"/>
+            <w:tcBorders>
+              <w:top w:val="single" w:sz="1" w:space="0" w:color="CCCCCC"/>
+              <w:left w:val="single" w:sz="1" w:space="0" w:color="CCCCCC"/>
+              <w:bottom w:val="single" w:sz="1" w:space="0" w:color="CCCCCC"/>
+              <w:right w:val="single" w:sz="1" w:space="0" w:color="CCCCCC"/>
+            </w:tcBorders>
+            <w:shd w:val="clear" w:color="auto" w:fill="FFFFFF" w:themeFill="background1"/>
+            <w:tcMar>
+              <w:top w:w="80" w:type="dxa"/>
+              <w:left w:w="120" w:type="dxa"/>
+              <w:bottom w:w="80" w:type="dxa"/>
+              <w:right w:w="120" w:type="dxa"/>
+            </w:tcMar>
+          </w:tcPr>
+          <w:p>
+            <w:r>
+              <w:t>17.06.26</w:t>
+            </w:r>
+          </w:p>
         </w:tc>
       </w:tr>
     </w:tbl>
@@ -5738,6 +5818,7 @@
       </w:pPr>
       <w:bookmarkStart w:id="21" w:name="_Toc232586095"/>
       <w:r>
+        <w:lastRenderedPageBreak/>
         <w:t>A</w:t>
       </w:r>
       <w:r>
@@ -5782,7 +5863,6 @@
         <w:ind w:left="1134"/>
       </w:pPr>
       <w:r>
-        <w:lastRenderedPageBreak/>
         <w:t>Ajout d’un CNAME : agashae.space</w:t>
       </w:r>
     </w:p>
@@ -6457,7 +6537,7 @@
               <w:noProof/>
               <w:szCs w:val="16"/>
             </w:rPr>
-            <w:t>17.06.2026 10:32</w:t>
+            <w:t>17.06.2026 11:00</w:t>
           </w:r>
           <w:r>
             <w:rPr>

</xml_diff>

<commit_message>
update : ajout slide pptx
</commit_message>
<xml_diff>
--- a/annexe/CdC.docx
+++ b/annexe/CdC.docx
@@ -108,10 +108,7 @@
         <w:jc w:val="center"/>
       </w:pPr>
       <w:r>
-        <w:t>3</w:t>
-      </w:r>
-      <w:r>
-        <w:t xml:space="preserve"> Périodes</w:t>
+        <w:t>DemoMot</w:t>
       </w:r>
     </w:p>
     <w:p>
@@ -119,7 +116,7 @@
         <w:jc w:val="center"/>
       </w:pPr>
       <w:r>
-        <w:t>Alexis Gugler</w:t>
+        <w:t>2025-2026</w:t>
       </w:r>
     </w:p>
     <w:p>
@@ -185,7 +182,7 @@
         </w:rPr>
         <w:fldChar w:fldCharType="separate"/>
       </w:r>
-      <w:hyperlink w:anchor="_Toc232586080" w:history="1">
+      <w:hyperlink w:anchor="_Toc232678039" w:history="1">
         <w:r>
           <w:rPr>
             <w:rStyle w:val="Lienhypertexte"/>
@@ -212,7 +209,7 @@
             <w:noProof/>
             <w:webHidden/>
           </w:rPr>
-          <w:instrText xml:space="preserve"> PAGEREF _Toc232586080 \h </w:instrText>
+          <w:instrText xml:space="preserve"> PAGEREF _Toc232678039 \h </w:instrText>
         </w:r>
         <w:r>
           <w:rPr>
@@ -258,7 +255,7 @@
           <w14:ligatures w14:val="standardContextual"/>
         </w:rPr>
       </w:pPr>
-      <w:hyperlink w:anchor="_Toc232586081" w:history="1">
+      <w:hyperlink w:anchor="_Toc232678040" w:history="1">
         <w:r>
           <w:rPr>
             <w:rStyle w:val="Lienhypertexte"/>
@@ -285,7 +282,7 @@
             <w:noProof/>
             <w:webHidden/>
           </w:rPr>
-          <w:instrText xml:space="preserve"> PAGEREF _Toc232586081 \h </w:instrText>
+          <w:instrText xml:space="preserve"> PAGEREF _Toc232678040 \h </w:instrText>
         </w:r>
         <w:r>
           <w:rPr>
@@ -331,7 +328,7 @@
           <w14:ligatures w14:val="standardContextual"/>
         </w:rPr>
       </w:pPr>
-      <w:hyperlink w:anchor="_Toc232586082" w:history="1">
+      <w:hyperlink w:anchor="_Toc232678041" w:history="1">
         <w:r>
           <w:rPr>
             <w:rStyle w:val="Lienhypertexte"/>
@@ -358,7 +355,7 @@
             <w:noProof/>
             <w:webHidden/>
           </w:rPr>
-          <w:instrText xml:space="preserve"> PAGEREF _Toc232586082 \h </w:instrText>
+          <w:instrText xml:space="preserve"> PAGEREF _Toc232678041 \h </w:instrText>
         </w:r>
         <w:r>
           <w:rPr>
@@ -404,7 +401,7 @@
           <w14:ligatures w14:val="standardContextual"/>
         </w:rPr>
       </w:pPr>
-      <w:hyperlink w:anchor="_Toc232586083" w:history="1">
+      <w:hyperlink w:anchor="_Toc232678042" w:history="1">
         <w:r>
           <w:rPr>
             <w:rStyle w:val="Lienhypertexte"/>
@@ -431,7 +428,7 @@
             <w:noProof/>
             <w:webHidden/>
           </w:rPr>
-          <w:instrText xml:space="preserve"> PAGEREF _Toc232586083 \h </w:instrText>
+          <w:instrText xml:space="preserve"> PAGEREF _Toc232678042 \h </w:instrText>
         </w:r>
         <w:r>
           <w:rPr>
@@ -477,7 +474,7 @@
           <w14:ligatures w14:val="standardContextual"/>
         </w:rPr>
       </w:pPr>
-      <w:hyperlink w:anchor="_Toc232586084" w:history="1">
+      <w:hyperlink w:anchor="_Toc232678043" w:history="1">
         <w:r>
           <w:rPr>
             <w:rStyle w:val="Lienhypertexte"/>
@@ -504,7 +501,7 @@
             <w:noProof/>
             <w:webHidden/>
           </w:rPr>
-          <w:instrText xml:space="preserve"> PAGEREF _Toc232586084 \h </w:instrText>
+          <w:instrText xml:space="preserve"> PAGEREF _Toc232678043 \h </w:instrText>
         </w:r>
         <w:r>
           <w:rPr>
@@ -550,7 +547,7 @@
           <w14:ligatures w14:val="standardContextual"/>
         </w:rPr>
       </w:pPr>
-      <w:hyperlink w:anchor="_Toc232586085" w:history="1">
+      <w:hyperlink w:anchor="_Toc232678044" w:history="1">
         <w:r>
           <w:rPr>
             <w:rStyle w:val="Lienhypertexte"/>
@@ -577,7 +574,7 @@
             <w:noProof/>
             <w:webHidden/>
           </w:rPr>
-          <w:instrText xml:space="preserve"> PAGEREF _Toc232586085 \h </w:instrText>
+          <w:instrText xml:space="preserve"> PAGEREF _Toc232678044 \h </w:instrText>
         </w:r>
         <w:r>
           <w:rPr>
@@ -623,7 +620,7 @@
           <w14:ligatures w14:val="standardContextual"/>
         </w:rPr>
       </w:pPr>
-      <w:hyperlink w:anchor="_Toc232586086" w:history="1">
+      <w:hyperlink w:anchor="_Toc232678045" w:history="1">
         <w:r>
           <w:rPr>
             <w:rStyle w:val="Lienhypertexte"/>
@@ -650,7 +647,7 @@
             <w:noProof/>
             <w:webHidden/>
           </w:rPr>
-          <w:instrText xml:space="preserve"> PAGEREF _Toc232586086 \h </w:instrText>
+          <w:instrText xml:space="preserve"> PAGEREF _Toc232678045 \h </w:instrText>
         </w:r>
         <w:r>
           <w:rPr>
@@ -696,7 +693,7 @@
           <w14:ligatures w14:val="standardContextual"/>
         </w:rPr>
       </w:pPr>
-      <w:hyperlink w:anchor="_Toc232586087" w:history="1">
+      <w:hyperlink w:anchor="_Toc232678046" w:history="1">
         <w:r>
           <w:rPr>
             <w:rStyle w:val="Lienhypertexte"/>
@@ -723,7 +720,7 @@
             <w:noProof/>
             <w:webHidden/>
           </w:rPr>
-          <w:instrText xml:space="preserve"> PAGEREF _Toc232586087 \h </w:instrText>
+          <w:instrText xml:space="preserve"> PAGEREF _Toc232678046 \h </w:instrText>
         </w:r>
         <w:r>
           <w:rPr>
@@ -769,7 +766,7 @@
           <w14:ligatures w14:val="standardContextual"/>
         </w:rPr>
       </w:pPr>
-      <w:hyperlink w:anchor="_Toc232586088" w:history="1">
+      <w:hyperlink w:anchor="_Toc232678047" w:history="1">
         <w:r>
           <w:rPr>
             <w:rStyle w:val="Lienhypertexte"/>
@@ -796,7 +793,7 @@
             <w:noProof/>
             <w:webHidden/>
           </w:rPr>
-          <w:instrText xml:space="preserve"> PAGEREF _Toc232586088 \h </w:instrText>
+          <w:instrText xml:space="preserve"> PAGEREF _Toc232678047 \h </w:instrText>
         </w:r>
         <w:r>
           <w:rPr>
@@ -842,7 +839,7 @@
           <w14:ligatures w14:val="standardContextual"/>
         </w:rPr>
       </w:pPr>
-      <w:hyperlink w:anchor="_Toc232586089" w:history="1">
+      <w:hyperlink w:anchor="_Toc232678048" w:history="1">
         <w:r>
           <w:rPr>
             <w:rStyle w:val="Lienhypertexte"/>
@@ -869,7 +866,7 @@
             <w:noProof/>
             <w:webHidden/>
           </w:rPr>
-          <w:instrText xml:space="preserve"> PAGEREF _Toc232586089 \h </w:instrText>
+          <w:instrText xml:space="preserve"> PAGEREF _Toc232678048 \h </w:instrText>
         </w:r>
         <w:r>
           <w:rPr>
@@ -915,7 +912,7 @@
           <w14:ligatures w14:val="standardContextual"/>
         </w:rPr>
       </w:pPr>
-      <w:hyperlink w:anchor="_Toc232586090" w:history="1">
+      <w:hyperlink w:anchor="_Toc232678049" w:history="1">
         <w:r>
           <w:rPr>
             <w:rStyle w:val="Lienhypertexte"/>
@@ -942,7 +939,7 @@
             <w:noProof/>
             <w:webHidden/>
           </w:rPr>
-          <w:instrText xml:space="preserve"> PAGEREF _Toc232586090 \h </w:instrText>
+          <w:instrText xml:space="preserve"> PAGEREF _Toc232678049 \h </w:instrText>
         </w:r>
         <w:r>
           <w:rPr>
@@ -962,7 +959,7 @@
             <w:noProof/>
             <w:webHidden/>
           </w:rPr>
-          <w:t>7</w:t>
+          <w:t>8</w:t>
         </w:r>
         <w:r>
           <w:rPr>
@@ -988,7 +985,7 @@
           <w14:ligatures w14:val="standardContextual"/>
         </w:rPr>
       </w:pPr>
-      <w:hyperlink w:anchor="_Toc232586091" w:history="1">
+      <w:hyperlink w:anchor="_Toc232678050" w:history="1">
         <w:r>
           <w:rPr>
             <w:rStyle w:val="Lienhypertexte"/>
@@ -1015,7 +1012,7 @@
             <w:noProof/>
             <w:webHidden/>
           </w:rPr>
-          <w:instrText xml:space="preserve"> PAGEREF _Toc232586091 \h </w:instrText>
+          <w:instrText xml:space="preserve"> PAGEREF _Toc232678050 \h </w:instrText>
         </w:r>
         <w:r>
           <w:rPr>
@@ -1035,7 +1032,7 @@
             <w:noProof/>
             <w:webHidden/>
           </w:rPr>
-          <w:t>7</w:t>
+          <w:t>8</w:t>
         </w:r>
         <w:r>
           <w:rPr>
@@ -1061,7 +1058,7 @@
           <w14:ligatures w14:val="standardContextual"/>
         </w:rPr>
       </w:pPr>
-      <w:hyperlink w:anchor="_Toc232586092" w:history="1">
+      <w:hyperlink w:anchor="_Toc232678051" w:history="1">
         <w:r>
           <w:rPr>
             <w:rStyle w:val="Lienhypertexte"/>
@@ -1088,7 +1085,7 @@
             <w:noProof/>
             <w:webHidden/>
           </w:rPr>
-          <w:instrText xml:space="preserve"> PAGEREF _Toc232586092 \h </w:instrText>
+          <w:instrText xml:space="preserve"> PAGEREF _Toc232678051 \h </w:instrText>
         </w:r>
         <w:r>
           <w:rPr>
@@ -1108,7 +1105,7 @@
             <w:noProof/>
             <w:webHidden/>
           </w:rPr>
-          <w:t>7</w:t>
+          <w:t>8</w:t>
         </w:r>
         <w:r>
           <w:rPr>
@@ -1134,7 +1131,7 @@
           <w14:ligatures w14:val="standardContextual"/>
         </w:rPr>
       </w:pPr>
-      <w:hyperlink w:anchor="_Toc232586093" w:history="1">
+      <w:hyperlink w:anchor="_Toc232678052" w:history="1">
         <w:r>
           <w:rPr>
             <w:rStyle w:val="Lienhypertexte"/>
@@ -1161,7 +1158,7 @@
             <w:noProof/>
             <w:webHidden/>
           </w:rPr>
-          <w:instrText xml:space="preserve"> PAGEREF _Toc232586093 \h </w:instrText>
+          <w:instrText xml:space="preserve"> PAGEREF _Toc232678052 \h </w:instrText>
         </w:r>
         <w:r>
           <w:rPr>
@@ -1181,7 +1178,7 @@
             <w:noProof/>
             <w:webHidden/>
           </w:rPr>
-          <w:t>7</w:t>
+          <w:t>8</w:t>
         </w:r>
         <w:r>
           <w:rPr>
@@ -1207,7 +1204,7 @@
           <w14:ligatures w14:val="standardContextual"/>
         </w:rPr>
       </w:pPr>
-      <w:hyperlink w:anchor="_Toc232586094" w:history="1">
+      <w:hyperlink w:anchor="_Toc232678053" w:history="1">
         <w:r>
           <w:rPr>
             <w:rStyle w:val="Lienhypertexte"/>
@@ -1234,7 +1231,7 @@
             <w:noProof/>
             <w:webHidden/>
           </w:rPr>
-          <w:instrText xml:space="preserve"> PAGEREF _Toc232586094 \h </w:instrText>
+          <w:instrText xml:space="preserve"> PAGEREF _Toc232678053 \h </w:instrText>
         </w:r>
         <w:r>
           <w:rPr>
@@ -1254,7 +1251,7 @@
             <w:noProof/>
             <w:webHidden/>
           </w:rPr>
-          <w:t>7</w:t>
+          <w:t>9</w:t>
         </w:r>
         <w:r>
           <w:rPr>
@@ -1280,7 +1277,7 @@
           <w14:ligatures w14:val="standardContextual"/>
         </w:rPr>
       </w:pPr>
-      <w:hyperlink w:anchor="_Toc232586095" w:history="1">
+      <w:hyperlink w:anchor="_Toc232678054" w:history="1">
         <w:r>
           <w:rPr>
             <w:rStyle w:val="Lienhypertexte"/>
@@ -1307,7 +1304,7 @@
             <w:noProof/>
             <w:webHidden/>
           </w:rPr>
-          <w:instrText xml:space="preserve"> PAGEREF _Toc232586095 \h </w:instrText>
+          <w:instrText xml:space="preserve"> PAGEREF _Toc232678054 \h </w:instrText>
         </w:r>
         <w:r>
           <w:rPr>
@@ -1327,7 +1324,7 @@
             <w:noProof/>
             <w:webHidden/>
           </w:rPr>
-          <w:t>7</w:t>
+          <w:t>9</w:t>
         </w:r>
         <w:r>
           <w:rPr>
@@ -1353,7 +1350,7 @@
           <w14:ligatures w14:val="standardContextual"/>
         </w:rPr>
       </w:pPr>
-      <w:hyperlink w:anchor="_Toc232586096" w:history="1">
+      <w:hyperlink w:anchor="_Toc232678055" w:history="1">
         <w:r>
           <w:rPr>
             <w:rStyle w:val="Lienhypertexte"/>
@@ -1380,7 +1377,7 @@
             <w:noProof/>
             <w:webHidden/>
           </w:rPr>
-          <w:instrText xml:space="preserve"> PAGEREF _Toc232586096 \h </w:instrText>
+          <w:instrText xml:space="preserve"> PAGEREF _Toc232678055 \h </w:instrText>
         </w:r>
         <w:r>
           <w:rPr>
@@ -1400,7 +1397,7 @@
             <w:noProof/>
             <w:webHidden/>
           </w:rPr>
-          <w:t>8</w:t>
+          <w:t>9</w:t>
         </w:r>
         <w:r>
           <w:rPr>
@@ -1426,12 +1423,85 @@
           <w14:ligatures w14:val="standardContextual"/>
         </w:rPr>
       </w:pPr>
-      <w:hyperlink w:anchor="_Toc232586097" w:history="1">
+      <w:hyperlink w:anchor="_Toc232678056" w:history="1">
         <w:r>
           <w:rPr>
             <w:rStyle w:val="Lienhypertexte"/>
             <w:noProof/>
           </w:rPr>
+          <w:t>Utilisation de l’IA</w:t>
+        </w:r>
+        <w:r>
+          <w:rPr>
+            <w:noProof/>
+            <w:webHidden/>
+          </w:rPr>
+          <w:tab/>
+        </w:r>
+        <w:r>
+          <w:rPr>
+            <w:noProof/>
+            <w:webHidden/>
+          </w:rPr>
+          <w:fldChar w:fldCharType="begin"/>
+        </w:r>
+        <w:r>
+          <w:rPr>
+            <w:noProof/>
+            <w:webHidden/>
+          </w:rPr>
+          <w:instrText xml:space="preserve"> PAGEREF _Toc232678056 \h </w:instrText>
+        </w:r>
+        <w:r>
+          <w:rPr>
+            <w:noProof/>
+            <w:webHidden/>
+          </w:rPr>
+        </w:r>
+        <w:r>
+          <w:rPr>
+            <w:noProof/>
+            <w:webHidden/>
+          </w:rPr>
+          <w:fldChar w:fldCharType="separate"/>
+        </w:r>
+        <w:r>
+          <w:rPr>
+            <w:noProof/>
+            <w:webHidden/>
+          </w:rPr>
+          <w:t>9</w:t>
+        </w:r>
+        <w:r>
+          <w:rPr>
+            <w:noProof/>
+            <w:webHidden/>
+          </w:rPr>
+          <w:fldChar w:fldCharType="end"/>
+        </w:r>
+      </w:hyperlink>
+    </w:p>
+    <w:p>
+      <w:pPr>
+        <w:pStyle w:val="TM1"/>
+        <w:tabs>
+          <w:tab w:val="right" w:leader="dot" w:pos="9060"/>
+        </w:tabs>
+        <w:rPr>
+          <w:rFonts w:eastAsiaTheme="minorEastAsia" w:cstheme="minorBidi"/>
+          <w:noProof/>
+          <w:kern w:val="2"/>
+          <w:sz w:val="24"/>
+          <w:szCs w:val="24"/>
+          <w14:ligatures w14:val="standardContextual"/>
+        </w:rPr>
+      </w:pPr>
+      <w:hyperlink w:anchor="_Toc232678057" w:history="1">
+        <w:r>
+          <w:rPr>
+            <w:rStyle w:val="Lienhypertexte"/>
+            <w:noProof/>
+          </w:rPr>
           <w:t>Annexes</w:t>
         </w:r>
         <w:r>
@@ -1453,7 +1523,7 @@
             <w:noProof/>
             <w:webHidden/>
           </w:rPr>
-          <w:instrText xml:space="preserve"> PAGEREF _Toc232586097 \h </w:instrText>
+          <w:instrText xml:space="preserve"> PAGEREF _Toc232678057 \h </w:instrText>
         </w:r>
         <w:r>
           <w:rPr>
@@ -1473,7 +1543,7 @@
             <w:noProof/>
             <w:webHidden/>
           </w:rPr>
-          <w:t>8</w:t>
+          <w:t>9</w:t>
         </w:r>
         <w:r>
           <w:rPr>
@@ -1504,7 +1574,7 @@
       </w:pPr>
       <w:bookmarkStart w:id="0" w:name="_Toc532179955"/>
       <w:bookmarkStart w:id="1" w:name="_Toc165969637"/>
-      <w:bookmarkStart w:id="2" w:name="_Toc232586080"/>
+      <w:bookmarkStart w:id="2" w:name="_Toc232678039"/>
       <w:r>
         <w:lastRenderedPageBreak/>
         <w:t>Spécifications</w:t>
@@ -1517,13 +1587,13 @@
       <w:pPr>
         <w:pStyle w:val="Titre2"/>
       </w:pPr>
-      <w:bookmarkStart w:id="3" w:name="_Toc232586081"/>
-      <w:bookmarkStart w:id="4" w:name="_Toc532179969"/>
-      <w:bookmarkStart w:id="5" w:name="_Toc165969639"/>
+      <w:bookmarkStart w:id="3" w:name="_Toc532179969"/>
+      <w:bookmarkStart w:id="4" w:name="_Toc165969639"/>
+      <w:bookmarkStart w:id="5" w:name="_Toc232678040"/>
       <w:r>
         <w:t>Titre</w:t>
       </w:r>
-      <w:bookmarkEnd w:id="3"/>
+      <w:bookmarkEnd w:id="5"/>
     </w:p>
     <w:p>
       <w:pPr>
@@ -1538,7 +1608,7 @@
       <w:pPr>
         <w:pStyle w:val="Titre2"/>
       </w:pPr>
-      <w:bookmarkStart w:id="6" w:name="_Toc232586082"/>
+      <w:bookmarkStart w:id="6" w:name="_Toc232678041"/>
       <w:r>
         <w:t>Description</w:t>
       </w:r>
@@ -1622,7 +1692,7 @@
       <w:pPr>
         <w:pStyle w:val="Titre2"/>
       </w:pPr>
-      <w:bookmarkStart w:id="7" w:name="_Toc232586083"/>
+      <w:bookmarkStart w:id="7" w:name="_Toc232678042"/>
       <w:r>
         <w:t>Matériel et logiciels à disposition</w:t>
       </w:r>
@@ -1668,7 +1738,7 @@
       <w:pPr>
         <w:pStyle w:val="Titre2"/>
       </w:pPr>
-      <w:bookmarkStart w:id="8" w:name="_Toc232586084"/>
+      <w:bookmarkStart w:id="8" w:name="_Toc232678043"/>
       <w:r>
         <w:t>Prérequis</w:t>
       </w:r>
@@ -1690,7 +1760,7 @@
       <w:pPr>
         <w:pStyle w:val="Titre1"/>
       </w:pPr>
-      <w:bookmarkStart w:id="9" w:name="_Toc232586085"/>
+      <w:bookmarkStart w:id="9" w:name="_Toc232678044"/>
       <w:r>
         <w:t>Cahier des charges</w:t>
       </w:r>
@@ -1700,7 +1770,7 @@
       <w:pPr>
         <w:pStyle w:val="Titre2"/>
       </w:pPr>
-      <w:bookmarkStart w:id="10" w:name="_Toc232586086"/>
+      <w:bookmarkStart w:id="10" w:name="_Toc232678045"/>
       <w:r>
         <w:t>Objectifs et portée du projet (objectifs SMART)</w:t>
       </w:r>
@@ -1758,7 +1828,7 @@
       <w:pPr>
         <w:pStyle w:val="Titre2"/>
       </w:pPr>
-      <w:bookmarkStart w:id="11" w:name="_Toc232586087"/>
+      <w:bookmarkStart w:id="11" w:name="_Toc232678046"/>
       <w:r>
         <w:t>Fonctionnalités requises</w:t>
       </w:r>
@@ -1852,12 +1922,12 @@
       <w:pPr>
         <w:pStyle w:val="Titre1"/>
       </w:pPr>
-      <w:bookmarkStart w:id="12" w:name="_Toc232586088"/>
+      <w:bookmarkStart w:id="12" w:name="_Toc232678047"/>
       <w:r>
         <w:t>Planification</w:t>
       </w:r>
+      <w:bookmarkEnd w:id="3"/>
       <w:bookmarkEnd w:id="4"/>
-      <w:bookmarkEnd w:id="5"/>
       <w:r>
         <w:t xml:space="preserve"> Initiale</w:t>
       </w:r>
@@ -2968,7 +3038,7 @@
       <w:pPr>
         <w:pStyle w:val="Titre1"/>
       </w:pPr>
-      <w:bookmarkStart w:id="13" w:name="_Toc232586089"/>
+      <w:bookmarkStart w:id="13" w:name="_Toc232678048"/>
       <w:r>
         <w:t>Journal de travail</w:t>
       </w:r>
@@ -3009,11 +3079,11 @@
         <w:tblLook w:val="04A0" w:firstRow="1" w:lastRow="0" w:firstColumn="1" w:lastColumn="0" w:noHBand="0" w:noVBand="1"/>
       </w:tblPr>
       <w:tblGrid>
-        <w:gridCol w:w="3003"/>
-        <w:gridCol w:w="13"/>
-        <w:gridCol w:w="1285"/>
-        <w:gridCol w:w="13"/>
-        <w:gridCol w:w="1358"/>
+        <w:gridCol w:w="3546"/>
+        <w:gridCol w:w="16"/>
+        <w:gridCol w:w="1094"/>
+        <w:gridCol w:w="7"/>
+        <w:gridCol w:w="1009"/>
       </w:tblGrid>
       <w:tr>
         <w:trPr>
@@ -3021,7 +3091,7 @@
         </w:trPr>
         <w:tc>
           <w:tcPr>
-            <w:tcW w:w="3003" w:type="dxa"/>
+            <w:tcW w:w="3546" w:type="dxa"/>
             <w:tcBorders>
               <w:top w:val="single" w:sz="1" w:space="0" w:color="CCCCCC"/>
               <w:left w:val="single" w:sz="1" w:space="0" w:color="CCCCCC"/>
@@ -3047,7 +3117,7 @@
         </w:tc>
         <w:tc>
           <w:tcPr>
-            <w:tcW w:w="1298" w:type="dxa"/>
+            <w:tcW w:w="1110" w:type="dxa"/>
             <w:gridSpan w:val="2"/>
             <w:tcBorders>
               <w:top w:val="single" w:sz="1" w:space="0" w:color="CCCCCC"/>
@@ -3074,7 +3144,7 @@
         </w:tc>
         <w:tc>
           <w:tcPr>
-            <w:tcW w:w="1371" w:type="dxa"/>
+            <w:tcW w:w="1016" w:type="dxa"/>
             <w:gridSpan w:val="2"/>
             <w:tcBorders>
               <w:top w:val="single" w:sz="1" w:space="0" w:color="CCCCCC"/>
@@ -3103,7 +3173,7 @@
       <w:tr>
         <w:tc>
           <w:tcPr>
-            <w:tcW w:w="3016" w:type="dxa"/>
+            <w:tcW w:w="3562" w:type="dxa"/>
             <w:gridSpan w:val="2"/>
             <w:tcBorders>
               <w:top w:val="single" w:sz="1" w:space="0" w:color="CCCCCC"/>
@@ -3127,7 +3197,7 @@
         </w:tc>
         <w:tc>
           <w:tcPr>
-            <w:tcW w:w="1298" w:type="dxa"/>
+            <w:tcW w:w="1101" w:type="dxa"/>
             <w:gridSpan w:val="2"/>
             <w:tcBorders>
               <w:top w:val="single" w:sz="1" w:space="0" w:color="CCCCCC"/>
@@ -3151,7 +3221,7 @@
         </w:tc>
         <w:tc>
           <w:tcPr>
-            <w:tcW w:w="1358" w:type="dxa"/>
+            <w:tcW w:w="1009" w:type="dxa"/>
             <w:tcBorders>
               <w:top w:val="single" w:sz="1" w:space="0" w:color="CCCCCC"/>
               <w:left w:val="single" w:sz="1" w:space="0" w:color="CCCCCC"/>
@@ -3177,7 +3247,7 @@
       <w:tr>
         <w:tc>
           <w:tcPr>
-            <w:tcW w:w="3016" w:type="dxa"/>
+            <w:tcW w:w="3562" w:type="dxa"/>
             <w:gridSpan w:val="2"/>
             <w:tcBorders>
               <w:top w:val="single" w:sz="1" w:space="0" w:color="CCCCCC"/>
@@ -3201,7 +3271,7 @@
         </w:tc>
         <w:tc>
           <w:tcPr>
-            <w:tcW w:w="1298" w:type="dxa"/>
+            <w:tcW w:w="1101" w:type="dxa"/>
             <w:gridSpan w:val="2"/>
             <w:tcBorders>
               <w:top w:val="single" w:sz="1" w:space="0" w:color="CCCCCC"/>
@@ -3225,7 +3295,7 @@
         </w:tc>
         <w:tc>
           <w:tcPr>
-            <w:tcW w:w="1358" w:type="dxa"/>
+            <w:tcW w:w="1009" w:type="dxa"/>
             <w:tcBorders>
               <w:top w:val="single" w:sz="1" w:space="0" w:color="CCCCCC"/>
               <w:left w:val="single" w:sz="1" w:space="0" w:color="CCCCCC"/>
@@ -3251,7 +3321,7 @@
       <w:tr>
         <w:tc>
           <w:tcPr>
-            <w:tcW w:w="3016" w:type="dxa"/>
+            <w:tcW w:w="3562" w:type="dxa"/>
             <w:gridSpan w:val="2"/>
             <w:tcBorders>
               <w:top w:val="single" w:sz="1" w:space="0" w:color="CCCCCC"/>
@@ -3275,7 +3345,7 @@
         </w:tc>
         <w:tc>
           <w:tcPr>
-            <w:tcW w:w="1298" w:type="dxa"/>
+            <w:tcW w:w="1101" w:type="dxa"/>
             <w:gridSpan w:val="2"/>
             <w:tcBorders>
               <w:top w:val="single" w:sz="1" w:space="0" w:color="CCCCCC"/>
@@ -3299,7 +3369,7 @@
         </w:tc>
         <w:tc>
           <w:tcPr>
-            <w:tcW w:w="1358" w:type="dxa"/>
+            <w:tcW w:w="1009" w:type="dxa"/>
             <w:tcBorders>
               <w:top w:val="single" w:sz="1" w:space="0" w:color="CCCCCC"/>
               <w:left w:val="single" w:sz="1" w:space="0" w:color="CCCCCC"/>
@@ -3324,7 +3394,7 @@
       <w:tr>
         <w:tc>
           <w:tcPr>
-            <w:tcW w:w="3016" w:type="dxa"/>
+            <w:tcW w:w="3562" w:type="dxa"/>
             <w:gridSpan w:val="2"/>
             <w:tcBorders>
               <w:top w:val="single" w:sz="1" w:space="0" w:color="CCCCCC"/>
@@ -3348,7 +3418,7 @@
         </w:tc>
         <w:tc>
           <w:tcPr>
-            <w:tcW w:w="1298" w:type="dxa"/>
+            <w:tcW w:w="1101" w:type="dxa"/>
             <w:gridSpan w:val="2"/>
             <w:tcBorders>
               <w:top w:val="single" w:sz="1" w:space="0" w:color="CCCCCC"/>
@@ -3372,7 +3442,7 @@
         </w:tc>
         <w:tc>
           <w:tcPr>
-            <w:tcW w:w="1358" w:type="dxa"/>
+            <w:tcW w:w="1009" w:type="dxa"/>
             <w:tcBorders>
               <w:top w:val="single" w:sz="1" w:space="0" w:color="CCCCCC"/>
               <w:left w:val="single" w:sz="1" w:space="0" w:color="CCCCCC"/>
@@ -3397,7 +3467,7 @@
       <w:tr>
         <w:tc>
           <w:tcPr>
-            <w:tcW w:w="3016" w:type="dxa"/>
+            <w:tcW w:w="3562" w:type="dxa"/>
             <w:gridSpan w:val="2"/>
             <w:tcBorders>
               <w:top w:val="single" w:sz="1" w:space="0" w:color="CCCCCC"/>
@@ -3415,13 +3485,14 @@
           </w:tcPr>
           <w:p>
             <w:r>
+              <w:lastRenderedPageBreak/>
               <w:t>Rédaction des règles du jeu</w:t>
             </w:r>
           </w:p>
         </w:tc>
         <w:tc>
           <w:tcPr>
-            <w:tcW w:w="1298" w:type="dxa"/>
+            <w:tcW w:w="1101" w:type="dxa"/>
             <w:gridSpan w:val="2"/>
             <w:tcBorders>
               <w:top w:val="single" w:sz="1" w:space="0" w:color="CCCCCC"/>
@@ -3445,7 +3516,7 @@
         </w:tc>
         <w:tc>
           <w:tcPr>
-            <w:tcW w:w="1358" w:type="dxa"/>
+            <w:tcW w:w="1009" w:type="dxa"/>
             <w:tcBorders>
               <w:top w:val="single" w:sz="1" w:space="0" w:color="CCCCCC"/>
               <w:left w:val="single" w:sz="1" w:space="0" w:color="CCCCCC"/>
@@ -3470,7 +3541,7 @@
       <w:tr>
         <w:tc>
           <w:tcPr>
-            <w:tcW w:w="3016" w:type="dxa"/>
+            <w:tcW w:w="3562" w:type="dxa"/>
             <w:gridSpan w:val="2"/>
             <w:tcBorders>
               <w:top w:val="single" w:sz="1" w:space="0" w:color="CCCCCC"/>
@@ -3488,14 +3559,13 @@
           </w:tcPr>
           <w:p>
             <w:r>
-              <w:lastRenderedPageBreak/>
               <w:t>Élaboration de la banque de questions</w:t>
             </w:r>
           </w:p>
         </w:tc>
         <w:tc>
           <w:tcPr>
-            <w:tcW w:w="1298" w:type="dxa"/>
+            <w:tcW w:w="1101" w:type="dxa"/>
             <w:gridSpan w:val="2"/>
             <w:tcBorders>
               <w:top w:val="single" w:sz="1" w:space="0" w:color="CCCCCC"/>
@@ -3519,7 +3589,7 @@
         </w:tc>
         <w:tc>
           <w:tcPr>
-            <w:tcW w:w="1358" w:type="dxa"/>
+            <w:tcW w:w="1009" w:type="dxa"/>
             <w:tcBorders>
               <w:top w:val="single" w:sz="1" w:space="0" w:color="CCCCCC"/>
               <w:left w:val="single" w:sz="1" w:space="0" w:color="CCCCCC"/>
@@ -3544,7 +3614,7 @@
       <w:tr>
         <w:tc>
           <w:tcPr>
-            <w:tcW w:w="3016" w:type="dxa"/>
+            <w:tcW w:w="3562" w:type="dxa"/>
             <w:gridSpan w:val="2"/>
             <w:tcBorders>
               <w:top w:val="single" w:sz="1" w:space="0" w:color="CCCCCC"/>
@@ -3568,7 +3638,7 @@
         </w:tc>
         <w:tc>
           <w:tcPr>
-            <w:tcW w:w="1298" w:type="dxa"/>
+            <w:tcW w:w="1101" w:type="dxa"/>
             <w:gridSpan w:val="2"/>
             <w:tcBorders>
               <w:top w:val="single" w:sz="1" w:space="0" w:color="CCCCCC"/>
@@ -3592,7 +3662,7 @@
         </w:tc>
         <w:tc>
           <w:tcPr>
-            <w:tcW w:w="1358" w:type="dxa"/>
+            <w:tcW w:w="1009" w:type="dxa"/>
             <w:tcBorders>
               <w:top w:val="single" w:sz="1" w:space="0" w:color="CCCCCC"/>
               <w:left w:val="single" w:sz="1" w:space="0" w:color="CCCCCC"/>
@@ -3617,7 +3687,7 @@
       <w:tr>
         <w:tc>
           <w:tcPr>
-            <w:tcW w:w="3016" w:type="dxa"/>
+            <w:tcW w:w="3562" w:type="dxa"/>
             <w:gridSpan w:val="2"/>
             <w:tcBorders>
               <w:top w:val="single" w:sz="1" w:space="0" w:color="CCCCCC"/>
@@ -3641,7 +3711,7 @@
         </w:tc>
         <w:tc>
           <w:tcPr>
-            <w:tcW w:w="1298" w:type="dxa"/>
+            <w:tcW w:w="1101" w:type="dxa"/>
             <w:gridSpan w:val="2"/>
             <w:tcBorders>
               <w:top w:val="single" w:sz="1" w:space="0" w:color="CCCCCC"/>
@@ -3665,7 +3735,7 @@
         </w:tc>
         <w:tc>
           <w:tcPr>
-            <w:tcW w:w="1358" w:type="dxa"/>
+            <w:tcW w:w="1009" w:type="dxa"/>
             <w:tcBorders>
               <w:top w:val="single" w:sz="1" w:space="0" w:color="CCCCCC"/>
               <w:left w:val="single" w:sz="1" w:space="0" w:color="CCCCCC"/>
@@ -3690,7 +3760,7 @@
       <w:tr>
         <w:tc>
           <w:tcPr>
-            <w:tcW w:w="3016" w:type="dxa"/>
+            <w:tcW w:w="3562" w:type="dxa"/>
             <w:gridSpan w:val="2"/>
             <w:tcBorders>
               <w:top w:val="single" w:sz="1" w:space="0" w:color="CCCCCC"/>
@@ -3714,7 +3784,7 @@
         </w:tc>
         <w:tc>
           <w:tcPr>
-            <w:tcW w:w="1298" w:type="dxa"/>
+            <w:tcW w:w="1101" w:type="dxa"/>
             <w:gridSpan w:val="2"/>
             <w:tcBorders>
               <w:top w:val="single" w:sz="1" w:space="0" w:color="CCCCCC"/>
@@ -3738,7 +3808,7 @@
         </w:tc>
         <w:tc>
           <w:tcPr>
-            <w:tcW w:w="1358" w:type="dxa"/>
+            <w:tcW w:w="1009" w:type="dxa"/>
             <w:tcBorders>
               <w:top w:val="single" w:sz="1" w:space="0" w:color="CCCCCC"/>
               <w:left w:val="single" w:sz="1" w:space="0" w:color="CCCCCC"/>
@@ -3763,7 +3833,7 @@
       <w:tr>
         <w:tc>
           <w:tcPr>
-            <w:tcW w:w="3016" w:type="dxa"/>
+            <w:tcW w:w="3562" w:type="dxa"/>
             <w:gridSpan w:val="2"/>
             <w:tcBorders>
               <w:top w:val="single" w:sz="1" w:space="0" w:color="CCCCCC"/>
@@ -3787,7 +3857,7 @@
         </w:tc>
         <w:tc>
           <w:tcPr>
-            <w:tcW w:w="1298" w:type="dxa"/>
+            <w:tcW w:w="1101" w:type="dxa"/>
             <w:gridSpan w:val="2"/>
             <w:tcBorders>
               <w:top w:val="single" w:sz="1" w:space="0" w:color="CCCCCC"/>
@@ -3811,7 +3881,7 @@
         </w:tc>
         <w:tc>
           <w:tcPr>
-            <w:tcW w:w="1358" w:type="dxa"/>
+            <w:tcW w:w="1009" w:type="dxa"/>
             <w:tcBorders>
               <w:top w:val="single" w:sz="1" w:space="0" w:color="CCCCCC"/>
               <w:left w:val="single" w:sz="1" w:space="0" w:color="CCCCCC"/>
@@ -3836,7 +3906,7 @@
       <w:tr>
         <w:tc>
           <w:tcPr>
-            <w:tcW w:w="3016" w:type="dxa"/>
+            <w:tcW w:w="3562" w:type="dxa"/>
             <w:gridSpan w:val="2"/>
             <w:tcBorders>
               <w:top w:val="single" w:sz="1" w:space="0" w:color="CCCCCC"/>
@@ -3860,7 +3930,7 @@
         </w:tc>
         <w:tc>
           <w:tcPr>
-            <w:tcW w:w="1298" w:type="dxa"/>
+            <w:tcW w:w="1101" w:type="dxa"/>
             <w:gridSpan w:val="2"/>
             <w:tcBorders>
               <w:top w:val="single" w:sz="1" w:space="0" w:color="CCCCCC"/>
@@ -3884,7 +3954,7 @@
         </w:tc>
         <w:tc>
           <w:tcPr>
-            <w:tcW w:w="1358" w:type="dxa"/>
+            <w:tcW w:w="1009" w:type="dxa"/>
             <w:tcBorders>
               <w:top w:val="single" w:sz="1" w:space="0" w:color="CCCCCC"/>
               <w:left w:val="single" w:sz="1" w:space="0" w:color="CCCCCC"/>
@@ -3909,7 +3979,7 @@
       <w:tr>
         <w:tc>
           <w:tcPr>
-            <w:tcW w:w="3016" w:type="dxa"/>
+            <w:tcW w:w="3562" w:type="dxa"/>
             <w:gridSpan w:val="2"/>
             <w:tcBorders>
               <w:top w:val="single" w:sz="1" w:space="0" w:color="CCCCCC"/>
@@ -3933,7 +4003,7 @@
         </w:tc>
         <w:tc>
           <w:tcPr>
-            <w:tcW w:w="1298" w:type="dxa"/>
+            <w:tcW w:w="1101" w:type="dxa"/>
             <w:gridSpan w:val="2"/>
             <w:tcBorders>
               <w:top w:val="single" w:sz="1" w:space="0" w:color="CCCCCC"/>
@@ -3957,7 +4027,7 @@
         </w:tc>
         <w:tc>
           <w:tcPr>
-            <w:tcW w:w="1358" w:type="dxa"/>
+            <w:tcW w:w="1009" w:type="dxa"/>
             <w:tcBorders>
               <w:top w:val="single" w:sz="1" w:space="0" w:color="CCCCCC"/>
               <w:left w:val="single" w:sz="1" w:space="0" w:color="CCCCCC"/>
@@ -3982,7 +4052,7 @@
       <w:tr>
         <w:tc>
           <w:tcPr>
-            <w:tcW w:w="3016" w:type="dxa"/>
+            <w:tcW w:w="3562" w:type="dxa"/>
             <w:gridSpan w:val="2"/>
             <w:tcBorders>
               <w:top w:val="single" w:sz="1" w:space="0" w:color="CCCCCC"/>
@@ -4006,7 +4076,7 @@
         </w:tc>
         <w:tc>
           <w:tcPr>
-            <w:tcW w:w="1298" w:type="dxa"/>
+            <w:tcW w:w="1101" w:type="dxa"/>
             <w:gridSpan w:val="2"/>
             <w:tcBorders>
               <w:top w:val="single" w:sz="1" w:space="0" w:color="CCCCCC"/>
@@ -4030,7 +4100,7 @@
         </w:tc>
         <w:tc>
           <w:tcPr>
-            <w:tcW w:w="1358" w:type="dxa"/>
+            <w:tcW w:w="1009" w:type="dxa"/>
             <w:tcBorders>
               <w:top w:val="single" w:sz="1" w:space="0" w:color="CCCCCC"/>
               <w:left w:val="single" w:sz="1" w:space="0" w:color="CCCCCC"/>
@@ -4055,7 +4125,7 @@
       <w:tr>
         <w:tc>
           <w:tcPr>
-            <w:tcW w:w="3016" w:type="dxa"/>
+            <w:tcW w:w="3562" w:type="dxa"/>
             <w:gridSpan w:val="2"/>
             <w:tcBorders>
               <w:top w:val="single" w:sz="1" w:space="0" w:color="CCCCCC"/>
@@ -4079,7 +4149,7 @@
         </w:tc>
         <w:tc>
           <w:tcPr>
-            <w:tcW w:w="1298" w:type="dxa"/>
+            <w:tcW w:w="1101" w:type="dxa"/>
             <w:gridSpan w:val="2"/>
             <w:tcBorders>
               <w:top w:val="single" w:sz="1" w:space="0" w:color="CCCCCC"/>
@@ -4103,7 +4173,7 @@
         </w:tc>
         <w:tc>
           <w:tcPr>
-            <w:tcW w:w="1358" w:type="dxa"/>
+            <w:tcW w:w="1009" w:type="dxa"/>
             <w:tcBorders>
               <w:top w:val="single" w:sz="1" w:space="0" w:color="CCCCCC"/>
               <w:left w:val="single" w:sz="1" w:space="0" w:color="CCCCCC"/>
@@ -4128,7 +4198,7 @@
       <w:tr>
         <w:tc>
           <w:tcPr>
-            <w:tcW w:w="3016" w:type="dxa"/>
+            <w:tcW w:w="3562" w:type="dxa"/>
             <w:gridSpan w:val="2"/>
             <w:tcBorders>
               <w:top w:val="single" w:sz="1" w:space="0" w:color="CCCCCC"/>
@@ -4152,7 +4222,7 @@
         </w:tc>
         <w:tc>
           <w:tcPr>
-            <w:tcW w:w="1298" w:type="dxa"/>
+            <w:tcW w:w="1101" w:type="dxa"/>
             <w:gridSpan w:val="2"/>
             <w:tcBorders>
               <w:top w:val="single" w:sz="1" w:space="0" w:color="CCCCCC"/>
@@ -4170,29 +4240,34 @@
           </w:tcPr>
           <w:p>
             <w:r>
-              <w:t>1 séquence de 2 périodes</w:t>
-            </w:r>
-          </w:p>
-        </w:tc>
-        <w:tc>
-          <w:tcPr>
-            <w:tcW w:w="1358" w:type="dxa"/>
-            <w:tcBorders>
-              <w:top w:val="single" w:sz="1" w:space="0" w:color="CCCCCC"/>
-              <w:left w:val="single" w:sz="1" w:space="0" w:color="CCCCCC"/>
-              <w:bottom w:val="single" w:sz="1" w:space="0" w:color="CCCCCC"/>
-              <w:right w:val="single" w:sz="1" w:space="0" w:color="CCCCCC"/>
-            </w:tcBorders>
-            <w:shd w:val="clear" w:color="auto" w:fill="FFFFFF" w:themeFill="background1"/>
-            <w:tcMar>
-              <w:top w:w="80" w:type="dxa"/>
-              <w:left w:w="120" w:type="dxa"/>
-              <w:bottom w:w="80" w:type="dxa"/>
-              <w:right w:w="120" w:type="dxa"/>
-            </w:tcMar>
-          </w:tcPr>
-          <w:p>
-            <w:r>
+              <w:t xml:space="preserve">1 séquence </w:t>
+            </w:r>
+            <w:r>
+              <w:lastRenderedPageBreak/>
+              <w:t>de 2 périodes</w:t>
+            </w:r>
+          </w:p>
+        </w:tc>
+        <w:tc>
+          <w:tcPr>
+            <w:tcW w:w="1009" w:type="dxa"/>
+            <w:tcBorders>
+              <w:top w:val="single" w:sz="1" w:space="0" w:color="CCCCCC"/>
+              <w:left w:val="single" w:sz="1" w:space="0" w:color="CCCCCC"/>
+              <w:bottom w:val="single" w:sz="1" w:space="0" w:color="CCCCCC"/>
+              <w:right w:val="single" w:sz="1" w:space="0" w:color="CCCCCC"/>
+            </w:tcBorders>
+            <w:shd w:val="clear" w:color="auto" w:fill="FFFFFF" w:themeFill="background1"/>
+            <w:tcMar>
+              <w:top w:w="80" w:type="dxa"/>
+              <w:left w:w="120" w:type="dxa"/>
+              <w:bottom w:w="80" w:type="dxa"/>
+              <w:right w:w="120" w:type="dxa"/>
+            </w:tcMar>
+          </w:tcPr>
+          <w:p>
+            <w:r>
+              <w:lastRenderedPageBreak/>
               <w:t>04.06.26</w:t>
             </w:r>
           </w:p>
@@ -4201,7 +4276,7 @@
       <w:tr>
         <w:tc>
           <w:tcPr>
-            <w:tcW w:w="3016" w:type="dxa"/>
+            <w:tcW w:w="3562" w:type="dxa"/>
             <w:gridSpan w:val="2"/>
             <w:tcBorders>
               <w:top w:val="single" w:sz="1" w:space="0" w:color="CCCCCC"/>
@@ -4225,7 +4300,7 @@
         </w:tc>
         <w:tc>
           <w:tcPr>
-            <w:tcW w:w="1298" w:type="dxa"/>
+            <w:tcW w:w="1101" w:type="dxa"/>
             <w:gridSpan w:val="2"/>
             <w:tcBorders>
               <w:top w:val="single" w:sz="1" w:space="0" w:color="CCCCCC"/>
@@ -4249,7 +4324,7 @@
         </w:tc>
         <w:tc>
           <w:tcPr>
-            <w:tcW w:w="1358" w:type="dxa"/>
+            <w:tcW w:w="1009" w:type="dxa"/>
             <w:tcBorders>
               <w:top w:val="single" w:sz="1" w:space="0" w:color="CCCCCC"/>
               <w:left w:val="single" w:sz="1" w:space="0" w:color="CCCCCC"/>
@@ -4274,7 +4349,7 @@
       <w:tr>
         <w:tc>
           <w:tcPr>
-            <w:tcW w:w="3016" w:type="dxa"/>
+            <w:tcW w:w="3562" w:type="dxa"/>
             <w:gridSpan w:val="2"/>
             <w:tcBorders>
               <w:top w:val="single" w:sz="1" w:space="0" w:color="CCCCCC"/>
@@ -4298,7 +4373,7 @@
         </w:tc>
         <w:tc>
           <w:tcPr>
-            <w:tcW w:w="1298" w:type="dxa"/>
+            <w:tcW w:w="1101" w:type="dxa"/>
             <w:gridSpan w:val="2"/>
             <w:tcBorders>
               <w:top w:val="single" w:sz="1" w:space="0" w:color="CCCCCC"/>
@@ -4322,7 +4397,7 @@
         </w:tc>
         <w:tc>
           <w:tcPr>
-            <w:tcW w:w="1358" w:type="dxa"/>
+            <w:tcW w:w="1009" w:type="dxa"/>
             <w:tcBorders>
               <w:top w:val="single" w:sz="1" w:space="0" w:color="CCCCCC"/>
               <w:left w:val="single" w:sz="1" w:space="0" w:color="CCCCCC"/>
@@ -4347,7 +4422,7 @@
       <w:tr>
         <w:tc>
           <w:tcPr>
-            <w:tcW w:w="3016" w:type="dxa"/>
+            <w:tcW w:w="3562" w:type="dxa"/>
             <w:gridSpan w:val="2"/>
             <w:tcBorders>
               <w:top w:val="single" w:sz="1" w:space="0" w:color="CCCCCC"/>
@@ -4365,14 +4440,13 @@
           </w:tcPr>
           <w:p>
             <w:r>
-              <w:lastRenderedPageBreak/>
               <w:t>Faire une démo de chaque projet de la classe et discuter des fonctionnalités/améliorations</w:t>
             </w:r>
           </w:p>
         </w:tc>
         <w:tc>
           <w:tcPr>
-            <w:tcW w:w="1298" w:type="dxa"/>
+            <w:tcW w:w="1101" w:type="dxa"/>
             <w:gridSpan w:val="2"/>
             <w:tcBorders>
               <w:top w:val="single" w:sz="1" w:space="0" w:color="CCCCCC"/>
@@ -4396,7 +4470,7 @@
         </w:tc>
         <w:tc>
           <w:tcPr>
-            <w:tcW w:w="1358" w:type="dxa"/>
+            <w:tcW w:w="1009" w:type="dxa"/>
             <w:tcBorders>
               <w:top w:val="single" w:sz="1" w:space="0" w:color="CCCCCC"/>
               <w:left w:val="single" w:sz="1" w:space="0" w:color="CCCCCC"/>
@@ -4421,7 +4495,7 @@
       <w:tr>
         <w:tc>
           <w:tcPr>
-            <w:tcW w:w="3016" w:type="dxa"/>
+            <w:tcW w:w="3562" w:type="dxa"/>
             <w:gridSpan w:val="2"/>
             <w:tcBorders>
               <w:top w:val="single" w:sz="1" w:space="0" w:color="CCCCCC"/>
@@ -4456,7 +4530,7 @@
         </w:tc>
         <w:tc>
           <w:tcPr>
-            <w:tcW w:w="1298" w:type="dxa"/>
+            <w:tcW w:w="1101" w:type="dxa"/>
             <w:gridSpan w:val="2"/>
             <w:tcBorders>
               <w:top w:val="single" w:sz="1" w:space="0" w:color="CCCCCC"/>
@@ -4480,7 +4554,7 @@
         </w:tc>
         <w:tc>
           <w:tcPr>
-            <w:tcW w:w="1358" w:type="dxa"/>
+            <w:tcW w:w="1009" w:type="dxa"/>
             <w:tcBorders>
               <w:top w:val="single" w:sz="1" w:space="0" w:color="CCCCCC"/>
               <w:left w:val="single" w:sz="1" w:space="0" w:color="CCCCCC"/>
@@ -4505,7 +4579,7 @@
       <w:tr>
         <w:tc>
           <w:tcPr>
-            <w:tcW w:w="3016" w:type="dxa"/>
+            <w:tcW w:w="3562" w:type="dxa"/>
             <w:gridSpan w:val="2"/>
             <w:tcBorders>
               <w:top w:val="single" w:sz="1" w:space="0" w:color="CCCCCC"/>
@@ -4529,7 +4603,7 @@
         </w:tc>
         <w:tc>
           <w:tcPr>
-            <w:tcW w:w="1298" w:type="dxa"/>
+            <w:tcW w:w="1101" w:type="dxa"/>
             <w:gridSpan w:val="2"/>
             <w:tcBorders>
               <w:top w:val="single" w:sz="1" w:space="0" w:color="CCCCCC"/>
@@ -4553,7 +4627,7 @@
         </w:tc>
         <w:tc>
           <w:tcPr>
-            <w:tcW w:w="1358" w:type="dxa"/>
+            <w:tcW w:w="1009" w:type="dxa"/>
             <w:tcBorders>
               <w:top w:val="single" w:sz="1" w:space="0" w:color="CCCCCC"/>
               <w:left w:val="single" w:sz="1" w:space="0" w:color="CCCCCC"/>
@@ -4578,7 +4652,7 @@
       <w:tr>
         <w:tc>
           <w:tcPr>
-            <w:tcW w:w="3016" w:type="dxa"/>
+            <w:tcW w:w="3562" w:type="dxa"/>
             <w:gridSpan w:val="2"/>
             <w:tcBorders>
               <w:top w:val="single" w:sz="1" w:space="0" w:color="CCCCCC"/>
@@ -4602,7 +4676,7 @@
         </w:tc>
         <w:tc>
           <w:tcPr>
-            <w:tcW w:w="1298" w:type="dxa"/>
+            <w:tcW w:w="1101" w:type="dxa"/>
             <w:gridSpan w:val="2"/>
             <w:tcBorders>
               <w:top w:val="single" w:sz="1" w:space="0" w:color="CCCCCC"/>
@@ -4626,7 +4700,7 @@
         </w:tc>
         <w:tc>
           <w:tcPr>
-            <w:tcW w:w="1358" w:type="dxa"/>
+            <w:tcW w:w="1009" w:type="dxa"/>
             <w:tcBorders>
               <w:top w:val="single" w:sz="1" w:space="0" w:color="CCCCCC"/>
               <w:left w:val="single" w:sz="1" w:space="0" w:color="CCCCCC"/>
@@ -4651,7 +4725,7 @@
       <w:tr>
         <w:tc>
           <w:tcPr>
-            <w:tcW w:w="3016" w:type="dxa"/>
+            <w:tcW w:w="3562" w:type="dxa"/>
             <w:gridSpan w:val="2"/>
             <w:tcBorders>
               <w:top w:val="single" w:sz="1" w:space="0" w:color="CCCCCC"/>
@@ -4675,7 +4749,7 @@
         </w:tc>
         <w:tc>
           <w:tcPr>
-            <w:tcW w:w="1298" w:type="dxa"/>
+            <w:tcW w:w="1101" w:type="dxa"/>
             <w:gridSpan w:val="2"/>
             <w:tcBorders>
               <w:top w:val="single" w:sz="1" w:space="0" w:color="CCCCCC"/>
@@ -4699,7 +4773,7 @@
         </w:tc>
         <w:tc>
           <w:tcPr>
-            <w:tcW w:w="1358" w:type="dxa"/>
+            <w:tcW w:w="1009" w:type="dxa"/>
             <w:tcBorders>
               <w:top w:val="single" w:sz="1" w:space="0" w:color="CCCCCC"/>
               <w:left w:val="single" w:sz="1" w:space="0" w:color="CCCCCC"/>
@@ -4724,7 +4798,7 @@
       <w:tr>
         <w:tc>
           <w:tcPr>
-            <w:tcW w:w="3016" w:type="dxa"/>
+            <w:tcW w:w="3562" w:type="dxa"/>
             <w:gridSpan w:val="2"/>
             <w:tcBorders>
               <w:top w:val="single" w:sz="1" w:space="0" w:color="CCCCCC"/>
@@ -4748,7 +4822,7 @@
         </w:tc>
         <w:tc>
           <w:tcPr>
-            <w:tcW w:w="1298" w:type="dxa"/>
+            <w:tcW w:w="1101" w:type="dxa"/>
             <w:gridSpan w:val="2"/>
             <w:tcBorders>
               <w:top w:val="single" w:sz="1" w:space="0" w:color="CCCCCC"/>
@@ -4772,7 +4846,7 @@
         </w:tc>
         <w:tc>
           <w:tcPr>
-            <w:tcW w:w="1358" w:type="dxa"/>
+            <w:tcW w:w="1009" w:type="dxa"/>
             <w:tcBorders>
               <w:top w:val="single" w:sz="1" w:space="0" w:color="CCCCCC"/>
               <w:left w:val="single" w:sz="1" w:space="0" w:color="CCCCCC"/>
@@ -4797,7 +4871,7 @@
       <w:tr>
         <w:tc>
           <w:tcPr>
-            <w:tcW w:w="3016" w:type="dxa"/>
+            <w:tcW w:w="3562" w:type="dxa"/>
             <w:gridSpan w:val="2"/>
             <w:tcBorders>
               <w:top w:val="single" w:sz="1" w:space="0" w:color="CCCCCC"/>
@@ -4832,7 +4906,7 @@
         </w:tc>
         <w:tc>
           <w:tcPr>
-            <w:tcW w:w="1298" w:type="dxa"/>
+            <w:tcW w:w="1101" w:type="dxa"/>
             <w:gridSpan w:val="2"/>
             <w:tcBorders>
               <w:top w:val="single" w:sz="1" w:space="0" w:color="CCCCCC"/>
@@ -4856,7 +4930,7 @@
         </w:tc>
         <w:tc>
           <w:tcPr>
-            <w:tcW w:w="1358" w:type="dxa"/>
+            <w:tcW w:w="1009" w:type="dxa"/>
             <w:tcBorders>
               <w:top w:val="single" w:sz="1" w:space="0" w:color="CCCCCC"/>
               <w:left w:val="single" w:sz="1" w:space="0" w:color="CCCCCC"/>
@@ -4881,7 +4955,7 @@
       <w:tr>
         <w:tc>
           <w:tcPr>
-            <w:tcW w:w="3016" w:type="dxa"/>
+            <w:tcW w:w="3562" w:type="dxa"/>
             <w:gridSpan w:val="2"/>
             <w:tcBorders>
               <w:top w:val="single" w:sz="1" w:space="0" w:color="CCCCCC"/>
@@ -4905,7 +4979,7 @@
         </w:tc>
         <w:tc>
           <w:tcPr>
-            <w:tcW w:w="1298" w:type="dxa"/>
+            <w:tcW w:w="1101" w:type="dxa"/>
             <w:gridSpan w:val="2"/>
             <w:tcBorders>
               <w:top w:val="single" w:sz="1" w:space="0" w:color="CCCCCC"/>
@@ -4929,7 +5003,7 @@
         </w:tc>
         <w:tc>
           <w:tcPr>
-            <w:tcW w:w="1358" w:type="dxa"/>
+            <w:tcW w:w="1009" w:type="dxa"/>
             <w:tcBorders>
               <w:top w:val="single" w:sz="1" w:space="0" w:color="CCCCCC"/>
               <w:left w:val="single" w:sz="1" w:space="0" w:color="CCCCCC"/>
@@ -4954,7 +5028,7 @@
       <w:tr>
         <w:tc>
           <w:tcPr>
-            <w:tcW w:w="3016" w:type="dxa"/>
+            <w:tcW w:w="3562" w:type="dxa"/>
             <w:gridSpan w:val="2"/>
             <w:tcBorders>
               <w:top w:val="single" w:sz="1" w:space="0" w:color="CCCCCC"/>
@@ -4978,7 +5052,7 @@
         </w:tc>
         <w:tc>
           <w:tcPr>
-            <w:tcW w:w="1298" w:type="dxa"/>
+            <w:tcW w:w="1101" w:type="dxa"/>
             <w:gridSpan w:val="2"/>
             <w:tcBorders>
               <w:top w:val="single" w:sz="1" w:space="0" w:color="CCCCCC"/>
@@ -5002,7 +5076,7 @@
         </w:tc>
         <w:tc>
           <w:tcPr>
-            <w:tcW w:w="1358" w:type="dxa"/>
+            <w:tcW w:w="1009" w:type="dxa"/>
             <w:tcBorders>
               <w:top w:val="single" w:sz="1" w:space="0" w:color="CCCCCC"/>
               <w:left w:val="single" w:sz="1" w:space="0" w:color="CCCCCC"/>
@@ -5027,7 +5101,7 @@
       <w:tr>
         <w:tc>
           <w:tcPr>
-            <w:tcW w:w="3016" w:type="dxa"/>
+            <w:tcW w:w="3562" w:type="dxa"/>
             <w:gridSpan w:val="2"/>
             <w:tcBorders>
               <w:top w:val="single" w:sz="1" w:space="0" w:color="CCCCCC"/>
@@ -5045,6 +5119,7 @@
           </w:tcPr>
           <w:p>
             <w:r>
+              <w:lastRenderedPageBreak/>
               <w:t>Création du CdC</w:t>
             </w:r>
             <w:r>
@@ -5054,7 +5129,7 @@
         </w:tc>
         <w:tc>
           <w:tcPr>
-            <w:tcW w:w="1298" w:type="dxa"/>
+            <w:tcW w:w="1101" w:type="dxa"/>
             <w:gridSpan w:val="2"/>
             <w:tcBorders>
               <w:top w:val="single" w:sz="1" w:space="0" w:color="CCCCCC"/>
@@ -5078,7 +5153,7 @@
         </w:tc>
         <w:tc>
           <w:tcPr>
-            <w:tcW w:w="1358" w:type="dxa"/>
+            <w:tcW w:w="1009" w:type="dxa"/>
             <w:tcBorders>
               <w:top w:val="single" w:sz="1" w:space="0" w:color="CCCCCC"/>
               <w:left w:val="single" w:sz="1" w:space="0" w:color="CCCCCC"/>
@@ -5103,7 +5178,7 @@
       <w:tr>
         <w:tc>
           <w:tcPr>
-            <w:tcW w:w="3016" w:type="dxa"/>
+            <w:tcW w:w="3562" w:type="dxa"/>
             <w:gridSpan w:val="2"/>
             <w:tcBorders>
               <w:top w:val="single" w:sz="1" w:space="0" w:color="CCCCCC"/>
@@ -5342,15 +5417,7 @@
                 <w:noProof/>
                 <w:webHidden/>
               </w:rPr>
-              <w:t xml:space="preserve">, </w:t>
-            </w:r>
-            <w:r>
-              <w:rPr>
-                <w:noProof/>
-                <w:webHidden/>
-              </w:rPr>
-              <w:lastRenderedPageBreak/>
-              <w:t>D</w:t>
+              <w:t>, D</w:t>
             </w:r>
             <w:r>
               <w:rPr>
@@ -5386,7 +5453,7 @@
         </w:tc>
         <w:tc>
           <w:tcPr>
-            <w:tcW w:w="1298" w:type="dxa"/>
+            <w:tcW w:w="1101" w:type="dxa"/>
             <w:gridSpan w:val="2"/>
             <w:tcBorders>
               <w:top w:val="single" w:sz="1" w:space="0" w:color="CCCCCC"/>
@@ -5404,7 +5471,6 @@
           </w:tcPr>
           <w:p>
             <w:r>
-              <w:lastRenderedPageBreak/>
               <w:t xml:space="preserve">1 séquence de </w:t>
             </w:r>
             <w:r>
@@ -5420,7 +5486,7 @@
         </w:tc>
         <w:tc>
           <w:tcPr>
-            <w:tcW w:w="1358" w:type="dxa"/>
+            <w:tcW w:w="1009" w:type="dxa"/>
             <w:tcBorders>
               <w:top w:val="single" w:sz="1" w:space="0" w:color="CCCCCC"/>
               <w:left w:val="single" w:sz="1" w:space="0" w:color="CCCCCC"/>
@@ -5445,7 +5511,7 @@
       <w:tr>
         <w:tc>
           <w:tcPr>
-            <w:tcW w:w="3016" w:type="dxa"/>
+            <w:tcW w:w="3562" w:type="dxa"/>
             <w:gridSpan w:val="2"/>
             <w:tcBorders>
               <w:top w:val="single" w:sz="1" w:space="0" w:color="CCCCCC"/>
@@ -5475,7 +5541,7 @@
         </w:tc>
         <w:tc>
           <w:tcPr>
-            <w:tcW w:w="1298" w:type="dxa"/>
+            <w:tcW w:w="1101" w:type="dxa"/>
             <w:gridSpan w:val="2"/>
             <w:tcBorders>
               <w:top w:val="single" w:sz="1" w:space="0" w:color="CCCCCC"/>
@@ -5508,7 +5574,7 @@
         </w:tc>
         <w:tc>
           <w:tcPr>
-            <w:tcW w:w="1358" w:type="dxa"/>
+            <w:tcW w:w="1009" w:type="dxa"/>
             <w:tcBorders>
               <w:top w:val="single" w:sz="1" w:space="0" w:color="CCCCCC"/>
               <w:left w:val="single" w:sz="1" w:space="0" w:color="CCCCCC"/>
@@ -5528,6 +5594,871 @@
               <w:t>17.06.26</w:t>
             </w:r>
           </w:p>
+        </w:tc>
+      </w:tr>
+      <w:tr>
+        <w:tc>
+          <w:tcPr>
+            <w:tcW w:w="3562" w:type="dxa"/>
+            <w:gridSpan w:val="2"/>
+            <w:tcBorders>
+              <w:top w:val="single" w:sz="1" w:space="0" w:color="CCCCCC"/>
+              <w:left w:val="single" w:sz="1" w:space="0" w:color="CCCCCC"/>
+              <w:bottom w:val="single" w:sz="1" w:space="0" w:color="CCCCCC"/>
+              <w:right w:val="single" w:sz="1" w:space="0" w:color="CCCCCC"/>
+            </w:tcBorders>
+            <w:shd w:val="clear" w:color="auto" w:fill="FFFFFF" w:themeFill="background1"/>
+            <w:tcMar>
+              <w:top w:w="80" w:type="dxa"/>
+              <w:left w:w="120" w:type="dxa"/>
+              <w:bottom w:w="80" w:type="dxa"/>
+              <w:right w:w="120" w:type="dxa"/>
+            </w:tcMar>
+          </w:tcPr>
+          <w:p>
+            <w:pPr>
+              <w:pStyle w:val="TM1"/>
+              <w:tabs>
+                <w:tab w:val="right" w:leader="dot" w:pos="9060"/>
+              </w:tabs>
+            </w:pPr>
+            <w:r>
+              <w:t>Chercher un nouveau projet à faire</w:t>
+            </w:r>
+            <w:r>
+              <w:t xml:space="preserve"> (regarder des projets en C#, HTML/CSS/JS, avec des VM, et Python)</w:t>
+            </w:r>
+          </w:p>
+          <w:p>
+            <w:pPr>
+              <w:pStyle w:val="TM1"/>
+              <w:tabs>
+                <w:tab w:val="right" w:leader="dot" w:pos="9060"/>
+              </w:tabs>
+            </w:pPr>
+            <w:r>
+              <w:t>Faire un nouveau projet</w:t>
+            </w:r>
+            <w:r>
+              <w:t> </w:t>
+            </w:r>
+            <w:r>
+              <w:t xml:space="preserve">: </w:t>
+            </w:r>
+            <w:hyperlink r:id="rId11" w:history="1">
+              <w:r>
+                <w:rPr>
+                  <w:rStyle w:val="Lienhypertexte"/>
+                </w:rPr>
+                <w:t>https</w:t>
+              </w:r>
+              <w:r>
+                <w:rPr>
+                  <w:rStyle w:val="Lienhypertexte"/>
+                </w:rPr>
+                <w:t> </w:t>
+              </w:r>
+              <w:r>
+                <w:rPr>
+                  <w:rStyle w:val="Lienhypertexte"/>
+                </w:rPr>
+                <w:t>://github.com/Agashae/AstroLab</w:t>
+              </w:r>
+            </w:hyperlink>
+          </w:p>
+        </w:tc>
+        <w:tc>
+          <w:tcPr>
+            <w:tcW w:w="1101" w:type="dxa"/>
+            <w:gridSpan w:val="2"/>
+            <w:tcBorders>
+              <w:top w:val="single" w:sz="1" w:space="0" w:color="CCCCCC"/>
+              <w:left w:val="single" w:sz="1" w:space="0" w:color="CCCCCC"/>
+              <w:bottom w:val="single" w:sz="1" w:space="0" w:color="CCCCCC"/>
+              <w:right w:val="single" w:sz="1" w:space="0" w:color="CCCCCC"/>
+            </w:tcBorders>
+            <w:shd w:val="clear" w:color="auto" w:fill="FFFFFF" w:themeFill="background1"/>
+            <w:tcMar>
+              <w:top w:w="80" w:type="dxa"/>
+              <w:left w:w="120" w:type="dxa"/>
+              <w:bottom w:w="80" w:type="dxa"/>
+              <w:right w:w="120" w:type="dxa"/>
+            </w:tcMar>
+          </w:tcPr>
+          <w:p>
+            <w:r>
+              <w:t xml:space="preserve">1 séquence de </w:t>
+            </w:r>
+            <w:r>
+              <w:t>2</w:t>
+            </w:r>
+            <w:r>
+              <w:t xml:space="preserve"> période</w:t>
+            </w:r>
+            <w:r>
+              <w:t>s</w:t>
+            </w:r>
+            <w:r>
+              <w:t xml:space="preserve"> </w:t>
+            </w:r>
+          </w:p>
+        </w:tc>
+        <w:tc>
+          <w:tcPr>
+            <w:tcW w:w="1009" w:type="dxa"/>
+            <w:tcBorders>
+              <w:top w:val="single" w:sz="1" w:space="0" w:color="CCCCCC"/>
+              <w:left w:val="single" w:sz="1" w:space="0" w:color="CCCCCC"/>
+              <w:bottom w:val="single" w:sz="1" w:space="0" w:color="CCCCCC"/>
+              <w:right w:val="single" w:sz="1" w:space="0" w:color="CCCCCC"/>
+            </w:tcBorders>
+            <w:shd w:val="clear" w:color="auto" w:fill="FFFFFF" w:themeFill="background1"/>
+            <w:tcMar>
+              <w:top w:w="80" w:type="dxa"/>
+              <w:left w:w="120" w:type="dxa"/>
+              <w:bottom w:w="80" w:type="dxa"/>
+              <w:right w:w="120" w:type="dxa"/>
+            </w:tcMar>
+          </w:tcPr>
+          <w:p>
+            <w:r>
+              <w:t>1</w:t>
+            </w:r>
+            <w:r>
+              <w:t>8</w:t>
+            </w:r>
+            <w:r>
+              <w:t>.06.26</w:t>
+            </w:r>
+          </w:p>
+        </w:tc>
+      </w:tr>
+      <w:tr>
+        <w:tc>
+          <w:tcPr>
+            <w:tcW w:w="3562" w:type="dxa"/>
+            <w:gridSpan w:val="2"/>
+            <w:tcBorders>
+              <w:top w:val="single" w:sz="1" w:space="0" w:color="CCCCCC"/>
+              <w:left w:val="single" w:sz="1" w:space="0" w:color="CCCCCC"/>
+              <w:bottom w:val="single" w:sz="1" w:space="0" w:color="CCCCCC"/>
+              <w:right w:val="single" w:sz="1" w:space="0" w:color="CCCCCC"/>
+            </w:tcBorders>
+            <w:shd w:val="clear" w:color="auto" w:fill="FFFFFF" w:themeFill="background1"/>
+            <w:tcMar>
+              <w:top w:w="80" w:type="dxa"/>
+              <w:left w:w="120" w:type="dxa"/>
+              <w:bottom w:w="80" w:type="dxa"/>
+              <w:right w:w="120" w:type="dxa"/>
+            </w:tcMar>
+          </w:tcPr>
+          <w:p>
+            <w:pPr>
+              <w:pStyle w:val="TM1"/>
+              <w:tabs>
+                <w:tab w:val="right" w:leader="dot" w:pos="9060"/>
+              </w:tabs>
+            </w:pPr>
+            <w:r>
+              <w:t>Découvrir la synthaxe de Python grâce à des docs et des vidéos</w:t>
+            </w:r>
+          </w:p>
+        </w:tc>
+        <w:tc>
+          <w:tcPr>
+            <w:tcW w:w="1101" w:type="dxa"/>
+            <w:gridSpan w:val="2"/>
+            <w:tcBorders>
+              <w:top w:val="single" w:sz="1" w:space="0" w:color="CCCCCC"/>
+              <w:left w:val="single" w:sz="1" w:space="0" w:color="CCCCCC"/>
+              <w:bottom w:val="single" w:sz="1" w:space="0" w:color="CCCCCC"/>
+              <w:right w:val="single" w:sz="1" w:space="0" w:color="CCCCCC"/>
+            </w:tcBorders>
+            <w:shd w:val="clear" w:color="auto" w:fill="FFFFFF" w:themeFill="background1"/>
+            <w:tcMar>
+              <w:top w:w="80" w:type="dxa"/>
+              <w:left w:w="120" w:type="dxa"/>
+              <w:bottom w:w="80" w:type="dxa"/>
+              <w:right w:w="120" w:type="dxa"/>
+            </w:tcMar>
+          </w:tcPr>
+          <w:p>
+            <w:r>
+              <w:t xml:space="preserve">1 séquence de </w:t>
+            </w:r>
+            <w:r>
+              <w:t>2</w:t>
+            </w:r>
+            <w:r>
+              <w:t xml:space="preserve"> période</w:t>
+            </w:r>
+            <w:r>
+              <w:t xml:space="preserve">s </w:t>
+            </w:r>
+          </w:p>
+        </w:tc>
+        <w:tc>
+          <w:tcPr>
+            <w:tcW w:w="1009" w:type="dxa"/>
+            <w:tcBorders>
+              <w:top w:val="single" w:sz="1" w:space="0" w:color="CCCCCC"/>
+              <w:left w:val="single" w:sz="1" w:space="0" w:color="CCCCCC"/>
+              <w:bottom w:val="single" w:sz="1" w:space="0" w:color="CCCCCC"/>
+              <w:right w:val="single" w:sz="1" w:space="0" w:color="CCCCCC"/>
+            </w:tcBorders>
+            <w:shd w:val="clear" w:color="auto" w:fill="FFFFFF" w:themeFill="background1"/>
+            <w:tcMar>
+              <w:top w:w="80" w:type="dxa"/>
+              <w:left w:w="120" w:type="dxa"/>
+              <w:bottom w:w="80" w:type="dxa"/>
+              <w:right w:w="120" w:type="dxa"/>
+            </w:tcMar>
+          </w:tcPr>
+          <w:p>
+            <w:r>
+              <w:t>1</w:t>
+            </w:r>
+            <w:r>
+              <w:t>8</w:t>
+            </w:r>
+            <w:r>
+              <w:t>.06.26</w:t>
+            </w:r>
+          </w:p>
+        </w:tc>
+      </w:tr>
+      <w:tr>
+        <w:tc>
+          <w:tcPr>
+            <w:tcW w:w="3562" w:type="dxa"/>
+            <w:gridSpan w:val="2"/>
+            <w:tcBorders>
+              <w:top w:val="single" w:sz="1" w:space="0" w:color="CCCCCC"/>
+              <w:left w:val="single" w:sz="1" w:space="0" w:color="CCCCCC"/>
+              <w:bottom w:val="single" w:sz="1" w:space="0" w:color="CCCCCC"/>
+              <w:right w:val="single" w:sz="1" w:space="0" w:color="CCCCCC"/>
+            </w:tcBorders>
+            <w:shd w:val="clear" w:color="auto" w:fill="FFFFFF" w:themeFill="background1"/>
+            <w:tcMar>
+              <w:top w:w="80" w:type="dxa"/>
+              <w:left w:w="120" w:type="dxa"/>
+              <w:bottom w:w="80" w:type="dxa"/>
+              <w:right w:w="120" w:type="dxa"/>
+            </w:tcMar>
+          </w:tcPr>
+          <w:p>
+            <w:pPr>
+              <w:pStyle w:val="TM1"/>
+              <w:tabs>
+                <w:tab w:val="right" w:leader="dot" w:pos="9060"/>
+              </w:tabs>
+            </w:pPr>
+            <w:r>
+              <w:t>Créer la première def avec des conditions/boucles de choix</w:t>
+            </w:r>
+          </w:p>
+        </w:tc>
+        <w:tc>
+          <w:tcPr>
+            <w:tcW w:w="1101" w:type="dxa"/>
+            <w:gridSpan w:val="2"/>
+            <w:tcBorders>
+              <w:top w:val="single" w:sz="1" w:space="0" w:color="CCCCCC"/>
+              <w:left w:val="single" w:sz="1" w:space="0" w:color="CCCCCC"/>
+              <w:bottom w:val="single" w:sz="1" w:space="0" w:color="CCCCCC"/>
+              <w:right w:val="single" w:sz="1" w:space="0" w:color="CCCCCC"/>
+            </w:tcBorders>
+            <w:shd w:val="clear" w:color="auto" w:fill="FFFFFF" w:themeFill="background1"/>
+            <w:tcMar>
+              <w:top w:w="80" w:type="dxa"/>
+              <w:left w:w="120" w:type="dxa"/>
+              <w:bottom w:w="80" w:type="dxa"/>
+              <w:right w:w="120" w:type="dxa"/>
+            </w:tcMar>
+          </w:tcPr>
+          <w:p>
+            <w:r>
+              <w:t xml:space="preserve">1 séquence de </w:t>
+            </w:r>
+            <w:r>
+              <w:t>2</w:t>
+            </w:r>
+            <w:r>
+              <w:t xml:space="preserve"> période</w:t>
+            </w:r>
+            <w:r>
+              <w:t>s</w:t>
+            </w:r>
+            <w:r>
+              <w:t xml:space="preserve"> </w:t>
+            </w:r>
+          </w:p>
+        </w:tc>
+        <w:tc>
+          <w:tcPr>
+            <w:tcW w:w="1009" w:type="dxa"/>
+            <w:tcBorders>
+              <w:top w:val="single" w:sz="1" w:space="0" w:color="CCCCCC"/>
+              <w:left w:val="single" w:sz="1" w:space="0" w:color="CCCCCC"/>
+              <w:bottom w:val="single" w:sz="1" w:space="0" w:color="CCCCCC"/>
+              <w:right w:val="single" w:sz="1" w:space="0" w:color="CCCCCC"/>
+            </w:tcBorders>
+            <w:shd w:val="clear" w:color="auto" w:fill="FFFFFF" w:themeFill="background1"/>
+            <w:tcMar>
+              <w:top w:w="80" w:type="dxa"/>
+              <w:left w:w="120" w:type="dxa"/>
+              <w:bottom w:w="80" w:type="dxa"/>
+              <w:right w:w="120" w:type="dxa"/>
+            </w:tcMar>
+          </w:tcPr>
+          <w:p>
+            <w:r>
+              <w:t>1</w:t>
+            </w:r>
+            <w:r>
+              <w:t>8</w:t>
+            </w:r>
+            <w:r>
+              <w:t>.06.26</w:t>
+            </w:r>
+          </w:p>
+        </w:tc>
+      </w:tr>
+      <w:tr>
+        <w:tc>
+          <w:tcPr>
+            <w:tcW w:w="3562" w:type="dxa"/>
+            <w:gridSpan w:val="2"/>
+            <w:tcBorders>
+              <w:top w:val="single" w:sz="1" w:space="0" w:color="CCCCCC"/>
+              <w:left w:val="single" w:sz="1" w:space="0" w:color="CCCCCC"/>
+              <w:bottom w:val="single" w:sz="1" w:space="0" w:color="CCCCCC"/>
+              <w:right w:val="single" w:sz="1" w:space="0" w:color="CCCCCC"/>
+            </w:tcBorders>
+            <w:shd w:val="clear" w:color="auto" w:fill="FFFFFF" w:themeFill="background1"/>
+            <w:tcMar>
+              <w:top w:w="80" w:type="dxa"/>
+              <w:left w:w="120" w:type="dxa"/>
+              <w:bottom w:w="80" w:type="dxa"/>
+              <w:right w:w="120" w:type="dxa"/>
+            </w:tcMar>
+          </w:tcPr>
+          <w:p>
+            <w:pPr>
+              <w:pStyle w:val="TM1"/>
+              <w:tabs>
+                <w:tab w:val="right" w:leader="dot" w:pos="9060"/>
+              </w:tabs>
+            </w:pPr>
+            <w:r>
+              <w:t>Créer la def planètes() : pour avoir un dictionnaire de data</w:t>
+            </w:r>
+          </w:p>
+        </w:tc>
+        <w:tc>
+          <w:tcPr>
+            <w:tcW w:w="1101" w:type="dxa"/>
+            <w:gridSpan w:val="2"/>
+            <w:tcBorders>
+              <w:top w:val="single" w:sz="1" w:space="0" w:color="CCCCCC"/>
+              <w:left w:val="single" w:sz="1" w:space="0" w:color="CCCCCC"/>
+              <w:bottom w:val="single" w:sz="1" w:space="0" w:color="CCCCCC"/>
+              <w:right w:val="single" w:sz="1" w:space="0" w:color="CCCCCC"/>
+            </w:tcBorders>
+            <w:shd w:val="clear" w:color="auto" w:fill="FFFFFF" w:themeFill="background1"/>
+            <w:tcMar>
+              <w:top w:w="80" w:type="dxa"/>
+              <w:left w:w="120" w:type="dxa"/>
+              <w:bottom w:w="80" w:type="dxa"/>
+              <w:right w:w="120" w:type="dxa"/>
+            </w:tcMar>
+          </w:tcPr>
+          <w:p>
+            <w:r>
+              <w:t xml:space="preserve">1 séquence de </w:t>
+            </w:r>
+            <w:r>
+              <w:t>2</w:t>
+            </w:r>
+            <w:r>
+              <w:t xml:space="preserve"> période</w:t>
+            </w:r>
+            <w:r>
+              <w:t>s</w:t>
+            </w:r>
+            <w:r>
+              <w:t xml:space="preserve"> </w:t>
+            </w:r>
+          </w:p>
+        </w:tc>
+        <w:tc>
+          <w:tcPr>
+            <w:tcW w:w="1009" w:type="dxa"/>
+            <w:tcBorders>
+              <w:top w:val="single" w:sz="1" w:space="0" w:color="CCCCCC"/>
+              <w:left w:val="single" w:sz="1" w:space="0" w:color="CCCCCC"/>
+              <w:bottom w:val="single" w:sz="1" w:space="0" w:color="CCCCCC"/>
+              <w:right w:val="single" w:sz="1" w:space="0" w:color="CCCCCC"/>
+            </w:tcBorders>
+            <w:shd w:val="clear" w:color="auto" w:fill="FFFFFF" w:themeFill="background1"/>
+            <w:tcMar>
+              <w:top w:w="80" w:type="dxa"/>
+              <w:left w:w="120" w:type="dxa"/>
+              <w:bottom w:w="80" w:type="dxa"/>
+              <w:right w:w="120" w:type="dxa"/>
+            </w:tcMar>
+          </w:tcPr>
+          <w:p>
+            <w:r>
+              <w:t>1</w:t>
+            </w:r>
+            <w:r>
+              <w:t>8</w:t>
+            </w:r>
+            <w:r>
+              <w:t>.06.26</w:t>
+            </w:r>
+          </w:p>
+        </w:tc>
+      </w:tr>
+      <w:tr>
+        <w:tc>
+          <w:tcPr>
+            <w:tcW w:w="3562" w:type="dxa"/>
+            <w:gridSpan w:val="2"/>
+            <w:tcBorders>
+              <w:top w:val="single" w:sz="1" w:space="0" w:color="CCCCCC"/>
+              <w:left w:val="single" w:sz="1" w:space="0" w:color="CCCCCC"/>
+              <w:bottom w:val="single" w:sz="1" w:space="0" w:color="CCCCCC"/>
+              <w:right w:val="single" w:sz="1" w:space="0" w:color="CCCCCC"/>
+            </w:tcBorders>
+            <w:shd w:val="clear" w:color="auto" w:fill="FFFFFF" w:themeFill="background1"/>
+            <w:tcMar>
+              <w:top w:w="80" w:type="dxa"/>
+              <w:left w:w="120" w:type="dxa"/>
+              <w:bottom w:w="80" w:type="dxa"/>
+              <w:right w:w="120" w:type="dxa"/>
+            </w:tcMar>
+          </w:tcPr>
+          <w:p>
+            <w:pPr>
+              <w:pStyle w:val="TM1"/>
+              <w:tabs>
+                <w:tab w:val="right" w:leader="dot" w:pos="9060"/>
+              </w:tabs>
+            </w:pPr>
+            <w:r>
+              <w:t>Check si la valeur de user peut être prise dans le tableau et apprendre return</w:t>
+            </w:r>
+          </w:p>
+        </w:tc>
+        <w:tc>
+          <w:tcPr>
+            <w:tcW w:w="1101" w:type="dxa"/>
+            <w:gridSpan w:val="2"/>
+            <w:tcBorders>
+              <w:top w:val="single" w:sz="1" w:space="0" w:color="CCCCCC"/>
+              <w:left w:val="single" w:sz="1" w:space="0" w:color="CCCCCC"/>
+              <w:bottom w:val="single" w:sz="1" w:space="0" w:color="CCCCCC"/>
+              <w:right w:val="single" w:sz="1" w:space="0" w:color="CCCCCC"/>
+            </w:tcBorders>
+            <w:shd w:val="clear" w:color="auto" w:fill="FFFFFF" w:themeFill="background1"/>
+            <w:tcMar>
+              <w:top w:w="80" w:type="dxa"/>
+              <w:left w:w="120" w:type="dxa"/>
+              <w:bottom w:w="80" w:type="dxa"/>
+              <w:right w:w="120" w:type="dxa"/>
+            </w:tcMar>
+          </w:tcPr>
+          <w:p>
+            <w:r>
+              <w:t xml:space="preserve">1 séquence de </w:t>
+            </w:r>
+            <w:r>
+              <w:t>3</w:t>
+            </w:r>
+            <w:r>
+              <w:t xml:space="preserve"> période</w:t>
+            </w:r>
+            <w:r>
+              <w:t>s</w:t>
+            </w:r>
+            <w:r>
+              <w:t xml:space="preserve"> </w:t>
+            </w:r>
+          </w:p>
+        </w:tc>
+        <w:tc>
+          <w:tcPr>
+            <w:tcW w:w="1009" w:type="dxa"/>
+            <w:tcBorders>
+              <w:top w:val="single" w:sz="1" w:space="0" w:color="CCCCCC"/>
+              <w:left w:val="single" w:sz="1" w:space="0" w:color="CCCCCC"/>
+              <w:bottom w:val="single" w:sz="1" w:space="0" w:color="CCCCCC"/>
+              <w:right w:val="single" w:sz="1" w:space="0" w:color="CCCCCC"/>
+            </w:tcBorders>
+            <w:shd w:val="clear" w:color="auto" w:fill="FFFFFF" w:themeFill="background1"/>
+            <w:tcMar>
+              <w:top w:w="80" w:type="dxa"/>
+              <w:left w:w="120" w:type="dxa"/>
+              <w:bottom w:w="80" w:type="dxa"/>
+              <w:right w:w="120" w:type="dxa"/>
+            </w:tcMar>
+          </w:tcPr>
+          <w:p/>
+        </w:tc>
+      </w:tr>
+      <w:tr>
+        <w:tc>
+          <w:tcPr>
+            <w:tcW w:w="3562" w:type="dxa"/>
+            <w:gridSpan w:val="2"/>
+            <w:tcBorders>
+              <w:top w:val="single" w:sz="1" w:space="0" w:color="CCCCCC"/>
+              <w:left w:val="single" w:sz="1" w:space="0" w:color="CCCCCC"/>
+              <w:bottom w:val="single" w:sz="1" w:space="0" w:color="CCCCCC"/>
+              <w:right w:val="single" w:sz="1" w:space="0" w:color="CCCCCC"/>
+            </w:tcBorders>
+            <w:shd w:val="clear" w:color="auto" w:fill="FFFFFF" w:themeFill="background1"/>
+            <w:tcMar>
+              <w:top w:w="80" w:type="dxa"/>
+              <w:left w:w="120" w:type="dxa"/>
+              <w:bottom w:w="80" w:type="dxa"/>
+              <w:right w:w="120" w:type="dxa"/>
+            </w:tcMar>
+          </w:tcPr>
+          <w:p>
+            <w:pPr>
+              <w:pStyle w:val="TM1"/>
+              <w:tabs>
+                <w:tab w:val="right" w:leader="dot" w:pos="9060"/>
+              </w:tabs>
+            </w:pPr>
+            <w:r>
+              <w:t>Rendre mon code beau dans le terminal</w:t>
+            </w:r>
+          </w:p>
+        </w:tc>
+        <w:tc>
+          <w:tcPr>
+            <w:tcW w:w="1101" w:type="dxa"/>
+            <w:gridSpan w:val="2"/>
+            <w:tcBorders>
+              <w:top w:val="single" w:sz="1" w:space="0" w:color="CCCCCC"/>
+              <w:left w:val="single" w:sz="1" w:space="0" w:color="CCCCCC"/>
+              <w:bottom w:val="single" w:sz="1" w:space="0" w:color="CCCCCC"/>
+              <w:right w:val="single" w:sz="1" w:space="0" w:color="CCCCCC"/>
+            </w:tcBorders>
+            <w:shd w:val="clear" w:color="auto" w:fill="FFFFFF" w:themeFill="background1"/>
+            <w:tcMar>
+              <w:top w:w="80" w:type="dxa"/>
+              <w:left w:w="120" w:type="dxa"/>
+              <w:bottom w:w="80" w:type="dxa"/>
+              <w:right w:w="120" w:type="dxa"/>
+            </w:tcMar>
+          </w:tcPr>
+          <w:p>
+            <w:r>
+              <w:t xml:space="preserve">1 séquence de </w:t>
+            </w:r>
+            <w:r>
+              <w:t>1</w:t>
+            </w:r>
+            <w:r>
+              <w:t xml:space="preserve"> période</w:t>
+            </w:r>
+            <w:r>
+              <w:t xml:space="preserve"> </w:t>
+            </w:r>
+          </w:p>
+        </w:tc>
+        <w:tc>
+          <w:tcPr>
+            <w:tcW w:w="1009" w:type="dxa"/>
+            <w:tcBorders>
+              <w:top w:val="single" w:sz="1" w:space="0" w:color="CCCCCC"/>
+              <w:left w:val="single" w:sz="1" w:space="0" w:color="CCCCCC"/>
+              <w:bottom w:val="single" w:sz="1" w:space="0" w:color="CCCCCC"/>
+              <w:right w:val="single" w:sz="1" w:space="0" w:color="CCCCCC"/>
+            </w:tcBorders>
+            <w:shd w:val="clear" w:color="auto" w:fill="FFFFFF" w:themeFill="background1"/>
+            <w:tcMar>
+              <w:top w:w="80" w:type="dxa"/>
+              <w:left w:w="120" w:type="dxa"/>
+              <w:bottom w:w="80" w:type="dxa"/>
+              <w:right w:w="120" w:type="dxa"/>
+            </w:tcMar>
+          </w:tcPr>
+          <w:p/>
+        </w:tc>
+      </w:tr>
+      <w:tr>
+        <w:tc>
+          <w:tcPr>
+            <w:tcW w:w="3562" w:type="dxa"/>
+            <w:gridSpan w:val="2"/>
+            <w:tcBorders>
+              <w:top w:val="single" w:sz="1" w:space="0" w:color="CCCCCC"/>
+              <w:left w:val="single" w:sz="1" w:space="0" w:color="CCCCCC"/>
+              <w:bottom w:val="single" w:sz="1" w:space="0" w:color="CCCCCC"/>
+              <w:right w:val="single" w:sz="1" w:space="0" w:color="CCCCCC"/>
+            </w:tcBorders>
+            <w:shd w:val="clear" w:color="auto" w:fill="FFFFFF" w:themeFill="background1"/>
+            <w:tcMar>
+              <w:top w:w="80" w:type="dxa"/>
+              <w:left w:w="120" w:type="dxa"/>
+              <w:bottom w:w="80" w:type="dxa"/>
+              <w:right w:w="120" w:type="dxa"/>
+            </w:tcMar>
+          </w:tcPr>
+          <w:p>
+            <w:pPr>
+              <w:pStyle w:val="TM1"/>
+              <w:tabs>
+                <w:tab w:val="right" w:leader="dot" w:pos="9060"/>
+              </w:tabs>
+            </w:pPr>
+            <w:r>
+              <w:t xml:space="preserve">Créer la def fusees avec un calcul, avec des fusées, calculer le carburant </w:t>
+            </w:r>
+            <w:r>
+              <w:lastRenderedPageBreak/>
+              <w:t>+ galérer avec le d</w:t>
+            </w:r>
+            <w:r>
+              <w:t xml:space="preserve">ictionnaire </w:t>
+            </w:r>
+            <w:r>
+              <w:t>qui ne voulait pas…</w:t>
+            </w:r>
+          </w:p>
+        </w:tc>
+        <w:tc>
+          <w:tcPr>
+            <w:tcW w:w="1101" w:type="dxa"/>
+            <w:gridSpan w:val="2"/>
+            <w:tcBorders>
+              <w:top w:val="single" w:sz="1" w:space="0" w:color="CCCCCC"/>
+              <w:left w:val="single" w:sz="1" w:space="0" w:color="CCCCCC"/>
+              <w:bottom w:val="single" w:sz="1" w:space="0" w:color="CCCCCC"/>
+              <w:right w:val="single" w:sz="1" w:space="0" w:color="CCCCCC"/>
+            </w:tcBorders>
+            <w:shd w:val="clear" w:color="auto" w:fill="FFFFFF" w:themeFill="background1"/>
+            <w:tcMar>
+              <w:top w:w="80" w:type="dxa"/>
+              <w:left w:w="120" w:type="dxa"/>
+              <w:bottom w:w="80" w:type="dxa"/>
+              <w:right w:w="120" w:type="dxa"/>
+            </w:tcMar>
+          </w:tcPr>
+          <w:p>
+            <w:r>
+              <w:lastRenderedPageBreak/>
+              <w:t xml:space="preserve">1 séquence </w:t>
+            </w:r>
+            <w:r>
+              <w:lastRenderedPageBreak/>
+              <w:t xml:space="preserve">de </w:t>
+            </w:r>
+            <w:r>
+              <w:t>4</w:t>
+            </w:r>
+            <w:r>
+              <w:t xml:space="preserve"> période</w:t>
+            </w:r>
+            <w:r>
+              <w:t xml:space="preserve"> </w:t>
+            </w:r>
+          </w:p>
+        </w:tc>
+        <w:tc>
+          <w:tcPr>
+            <w:tcW w:w="1009" w:type="dxa"/>
+            <w:tcBorders>
+              <w:top w:val="single" w:sz="1" w:space="0" w:color="CCCCCC"/>
+              <w:left w:val="single" w:sz="1" w:space="0" w:color="CCCCCC"/>
+              <w:bottom w:val="single" w:sz="1" w:space="0" w:color="CCCCCC"/>
+              <w:right w:val="single" w:sz="1" w:space="0" w:color="CCCCCC"/>
+            </w:tcBorders>
+            <w:shd w:val="clear" w:color="auto" w:fill="FFFFFF" w:themeFill="background1"/>
+            <w:tcMar>
+              <w:top w:w="80" w:type="dxa"/>
+              <w:left w:w="120" w:type="dxa"/>
+              <w:bottom w:w="80" w:type="dxa"/>
+              <w:right w:w="120" w:type="dxa"/>
+            </w:tcMar>
+          </w:tcPr>
+          <w:p/>
+        </w:tc>
+      </w:tr>
+      <w:tr>
+        <w:tc>
+          <w:tcPr>
+            <w:tcW w:w="3562" w:type="dxa"/>
+            <w:gridSpan w:val="2"/>
+            <w:tcBorders>
+              <w:top w:val="single" w:sz="1" w:space="0" w:color="CCCCCC"/>
+              <w:left w:val="single" w:sz="1" w:space="0" w:color="CCCCCC"/>
+              <w:bottom w:val="single" w:sz="1" w:space="0" w:color="CCCCCC"/>
+              <w:right w:val="single" w:sz="1" w:space="0" w:color="CCCCCC"/>
+            </w:tcBorders>
+            <w:shd w:val="clear" w:color="auto" w:fill="FFFFFF" w:themeFill="background1"/>
+            <w:tcMar>
+              <w:top w:w="80" w:type="dxa"/>
+              <w:left w:w="120" w:type="dxa"/>
+              <w:bottom w:w="80" w:type="dxa"/>
+              <w:right w:w="120" w:type="dxa"/>
+            </w:tcMar>
+          </w:tcPr>
+          <w:p>
+            <w:pPr>
+              <w:pStyle w:val="TM1"/>
+              <w:tabs>
+                <w:tab w:val="right" w:leader="dot" w:pos="9060"/>
+              </w:tabs>
+            </w:pPr>
+            <w:r>
+              <w:t xml:space="preserve">Créer la def calculs qui va calculer le poids sur une planete + galérer à récupérer toutes les données des autres tableaux + </w:t>
+            </w:r>
+            <w:r>
+              <w:t>hauteur saut</w:t>
+            </w:r>
+            <w:r>
+              <w:t xml:space="preserve"> + </w:t>
+            </w:r>
+            <w:r>
+              <w:t>temps de voyage</w:t>
+            </w:r>
+            <w:r>
+              <w:t xml:space="preserve"> + âge</w:t>
+            </w:r>
+            <w:r>
+              <w:t xml:space="preserve"> cosmique</w:t>
+            </w:r>
+            <w:r>
+              <w:t xml:space="preserve"> </w:t>
+            </w:r>
+          </w:p>
+        </w:tc>
+        <w:tc>
+          <w:tcPr>
+            <w:tcW w:w="1101" w:type="dxa"/>
+            <w:gridSpan w:val="2"/>
+            <w:tcBorders>
+              <w:top w:val="single" w:sz="1" w:space="0" w:color="CCCCCC"/>
+              <w:left w:val="single" w:sz="1" w:space="0" w:color="CCCCCC"/>
+              <w:bottom w:val="single" w:sz="1" w:space="0" w:color="CCCCCC"/>
+              <w:right w:val="single" w:sz="1" w:space="0" w:color="CCCCCC"/>
+            </w:tcBorders>
+            <w:shd w:val="clear" w:color="auto" w:fill="FFFFFF" w:themeFill="background1"/>
+            <w:tcMar>
+              <w:top w:w="80" w:type="dxa"/>
+              <w:left w:w="120" w:type="dxa"/>
+              <w:bottom w:w="80" w:type="dxa"/>
+              <w:right w:w="120" w:type="dxa"/>
+            </w:tcMar>
+          </w:tcPr>
+          <w:p>
+            <w:r>
+              <w:t xml:space="preserve">1 séquence de </w:t>
+            </w:r>
+            <w:r>
+              <w:t>4</w:t>
+            </w:r>
+            <w:r>
+              <w:t xml:space="preserve"> période</w:t>
+            </w:r>
+            <w:r>
+              <w:t xml:space="preserve"> </w:t>
+            </w:r>
+          </w:p>
+        </w:tc>
+        <w:tc>
+          <w:tcPr>
+            <w:tcW w:w="1009" w:type="dxa"/>
+            <w:tcBorders>
+              <w:top w:val="single" w:sz="1" w:space="0" w:color="CCCCCC"/>
+              <w:left w:val="single" w:sz="1" w:space="0" w:color="CCCCCC"/>
+              <w:bottom w:val="single" w:sz="1" w:space="0" w:color="CCCCCC"/>
+              <w:right w:val="single" w:sz="1" w:space="0" w:color="CCCCCC"/>
+            </w:tcBorders>
+            <w:shd w:val="clear" w:color="auto" w:fill="FFFFFF" w:themeFill="background1"/>
+            <w:tcMar>
+              <w:top w:w="80" w:type="dxa"/>
+              <w:left w:w="120" w:type="dxa"/>
+              <w:bottom w:w="80" w:type="dxa"/>
+              <w:right w:w="120" w:type="dxa"/>
+            </w:tcMar>
+          </w:tcPr>
+          <w:p/>
+        </w:tc>
+      </w:tr>
+      <w:tr>
+        <w:tc>
+          <w:tcPr>
+            <w:tcW w:w="3562" w:type="dxa"/>
+            <w:gridSpan w:val="2"/>
+            <w:tcBorders>
+              <w:top w:val="single" w:sz="1" w:space="0" w:color="CCCCCC"/>
+              <w:left w:val="single" w:sz="1" w:space="0" w:color="CCCCCC"/>
+              <w:bottom w:val="single" w:sz="1" w:space="0" w:color="CCCCCC"/>
+              <w:right w:val="single" w:sz="1" w:space="0" w:color="CCCCCC"/>
+            </w:tcBorders>
+            <w:shd w:val="clear" w:color="auto" w:fill="FFFFFF" w:themeFill="background1"/>
+            <w:tcMar>
+              <w:top w:w="80" w:type="dxa"/>
+              <w:left w:w="120" w:type="dxa"/>
+              <w:bottom w:w="80" w:type="dxa"/>
+              <w:right w:w="120" w:type="dxa"/>
+            </w:tcMar>
+          </w:tcPr>
+          <w:p>
+            <w:pPr>
+              <w:pStyle w:val="TM1"/>
+              <w:tabs>
+                <w:tab w:val="right" w:leader="dot" w:pos="9060"/>
+              </w:tabs>
+            </w:pPr>
+          </w:p>
+        </w:tc>
+        <w:tc>
+          <w:tcPr>
+            <w:tcW w:w="1101" w:type="dxa"/>
+            <w:gridSpan w:val="2"/>
+            <w:tcBorders>
+              <w:top w:val="single" w:sz="1" w:space="0" w:color="CCCCCC"/>
+              <w:left w:val="single" w:sz="1" w:space="0" w:color="CCCCCC"/>
+              <w:bottom w:val="single" w:sz="1" w:space="0" w:color="CCCCCC"/>
+              <w:right w:val="single" w:sz="1" w:space="0" w:color="CCCCCC"/>
+            </w:tcBorders>
+            <w:shd w:val="clear" w:color="auto" w:fill="FFFFFF" w:themeFill="background1"/>
+            <w:tcMar>
+              <w:top w:w="80" w:type="dxa"/>
+              <w:left w:w="120" w:type="dxa"/>
+              <w:bottom w:w="80" w:type="dxa"/>
+              <w:right w:w="120" w:type="dxa"/>
+            </w:tcMar>
+          </w:tcPr>
+          <w:p/>
+        </w:tc>
+        <w:tc>
+          <w:tcPr>
+            <w:tcW w:w="1009" w:type="dxa"/>
+            <w:tcBorders>
+              <w:top w:val="single" w:sz="1" w:space="0" w:color="CCCCCC"/>
+              <w:left w:val="single" w:sz="1" w:space="0" w:color="CCCCCC"/>
+              <w:bottom w:val="single" w:sz="1" w:space="0" w:color="CCCCCC"/>
+              <w:right w:val="single" w:sz="1" w:space="0" w:color="CCCCCC"/>
+            </w:tcBorders>
+            <w:shd w:val="clear" w:color="auto" w:fill="FFFFFF" w:themeFill="background1"/>
+            <w:tcMar>
+              <w:top w:w="80" w:type="dxa"/>
+              <w:left w:w="120" w:type="dxa"/>
+              <w:bottom w:w="80" w:type="dxa"/>
+              <w:right w:w="120" w:type="dxa"/>
+            </w:tcMar>
+          </w:tcPr>
+          <w:p/>
         </w:tc>
       </w:tr>
     </w:tbl>
@@ -5547,7 +6478,7 @@
       </w:pPr>
       <w:bookmarkStart w:id="14" w:name="_Toc532179957"/>
       <w:bookmarkStart w:id="15" w:name="_Toc165969641"/>
-      <w:bookmarkStart w:id="16" w:name="_Toc232586090"/>
+      <w:bookmarkStart w:id="16" w:name="_Toc232678049"/>
       <w:r>
         <w:t>Analyse</w:t>
       </w:r>
@@ -5559,7 +6490,7 @@
       <w:pPr>
         <w:pStyle w:val="Titre2"/>
       </w:pPr>
-      <w:bookmarkStart w:id="17" w:name="_Toc232586091"/>
+      <w:bookmarkStart w:id="17" w:name="_Toc232678050"/>
       <w:r>
         <w:t>Temps</w:t>
       </w:r>
@@ -5734,7 +6665,7 @@
       <w:pPr>
         <w:pStyle w:val="Titre2"/>
       </w:pPr>
-      <w:bookmarkStart w:id="18" w:name="_Toc232586092"/>
+      <w:bookmarkStart w:id="18" w:name="_Toc232678051"/>
       <w:r>
         <w:t>Observations &amp; Analyse</w:t>
       </w:r>
@@ -5744,7 +6675,7 @@
       <w:pPr>
         <w:pStyle w:val="Titre3"/>
       </w:pPr>
-      <w:bookmarkStart w:id="19" w:name="_Toc232586093"/>
+      <w:bookmarkStart w:id="19" w:name="_Toc232678052"/>
       <w:r>
         <w:t>Points positifs</w:t>
       </w:r>
@@ -5801,8 +6732,9 @@
       <w:pPr>
         <w:pStyle w:val="Titre3"/>
       </w:pPr>
-      <w:bookmarkStart w:id="20" w:name="_Toc232586094"/>
-      <w:r>
+      <w:bookmarkStart w:id="20" w:name="_Toc232678053"/>
+      <w:r>
+        <w:lastRenderedPageBreak/>
         <w:t>Points d’amélioration</w:t>
       </w:r>
       <w:bookmarkEnd w:id="20"/>
@@ -5816,9 +6748,8 @@
       <w:pPr>
         <w:pStyle w:val="Titre1"/>
       </w:pPr>
-      <w:bookmarkStart w:id="21" w:name="_Toc232586095"/>
-      <w:r>
-        <w:lastRenderedPageBreak/>
+      <w:bookmarkStart w:id="21" w:name="_Toc232678054"/>
+      <w:r>
         <w:t>A</w:t>
       </w:r>
       <w:r>
@@ -5870,7 +6801,7 @@
       <w:pPr>
         <w:pStyle w:val="Titre1"/>
       </w:pPr>
-      <w:bookmarkStart w:id="23" w:name="_Toc232586096"/>
+      <w:bookmarkStart w:id="23" w:name="_Toc232678055"/>
       <w:r>
         <w:t>Opportunités</w:t>
       </w:r>
@@ -5939,9 +6870,11 @@
       <w:pPr>
         <w:pStyle w:val="Titre1"/>
       </w:pPr>
+      <w:bookmarkStart w:id="24" w:name="_Toc232678056"/>
       <w:r>
         <w:t>Utilisation de l’IA</w:t>
       </w:r>
+      <w:bookmarkEnd w:id="24"/>
     </w:p>
     <w:p>
       <w:r>
@@ -6018,11 +6951,11 @@
       <w:pPr>
         <w:pStyle w:val="Titre1"/>
       </w:pPr>
-      <w:bookmarkStart w:id="24" w:name="_Toc232586097"/>
+      <w:bookmarkStart w:id="25" w:name="_Toc232678057"/>
       <w:r>
         <w:t>Annexes</w:t>
       </w:r>
-      <w:bookmarkEnd w:id="24"/>
+      <w:bookmarkEnd w:id="25"/>
     </w:p>
     <w:p>
       <w:pPr>
@@ -6040,7 +6973,7 @@
         </w:rPr>
         <w:t xml:space="preserve">Tout dans le repo : </w:t>
       </w:r>
-      <w:hyperlink r:id="rId11" w:history="1">
+      <w:hyperlink r:id="rId12" w:history="1">
         <w:r>
           <w:rPr>
             <w:rStyle w:val="Lienhypertexte"/>
@@ -6061,8 +6994,8 @@
       </w:pPr>
     </w:p>
     <w:sectPr>
-      <w:headerReference w:type="default" r:id="rId12"/>
-      <w:footerReference w:type="default" r:id="rId13"/>
+      <w:headerReference w:type="default" r:id="rId13"/>
+      <w:footerReference w:type="default" r:id="rId14"/>
       <w:pgSz w:w="11906" w:h="16838" w:code="9"/>
       <w:pgMar w:top="1418" w:right="1418" w:bottom="1418" w:left="1418" w:header="709" w:footer="709" w:gutter="0"/>
       <w:cols w:space="708"/>
@@ -6537,7 +7470,7 @@
               <w:noProof/>
               <w:szCs w:val="16"/>
             </w:rPr>
-            <w:t>17.06.2026 11:00</w:t>
+            <w:t>17.06.2026 13:17</w:t>
           </w:r>
           <w:r>
             <w:rPr>
@@ -8985,7 +9918,6 @@
   <w:style w:type="character" w:default="1" w:styleId="Policepardfaut">
     <w:name w:val="Default Paragraph Font"/>
     <w:uiPriority w:val="1"/>
-    <w:semiHidden/>
     <w:unhideWhenUsed/>
   </w:style>
   <w:style w:type="table" w:default="1" w:styleId="TableauNormal">

</xml_diff>

<commit_message>
update : update le Readme js et rename html/css
</commit_message>
<xml_diff>
--- a/annexe/CdC.docx
+++ b/annexe/CdC.docx
@@ -1747,13 +1747,28 @@
     <w:p>
       <w:pPr>
         <w:pStyle w:val="Retraitcorpsdetexte"/>
-        <w:ind w:left="0"/>
+        <w:numPr>
+          <w:ilvl w:val="0"/>
+          <w:numId w:val="15"/>
+        </w:numPr>
       </w:pPr>
       <w:r>
         <w:t>Être motivé</w:t>
       </w:r>
       <w:r>
         <w:t> !</w:t>
+      </w:r>
+    </w:p>
+    <w:p>
+      <w:pPr>
+        <w:pStyle w:val="Retraitcorpsdetexte"/>
+        <w:numPr>
+          <w:ilvl w:val="0"/>
+          <w:numId w:val="15"/>
+        </w:numPr>
+      </w:pPr>
+      <w:r>
+        <w:t>I293</w:t>
       </w:r>
     </w:p>
     <w:p>
@@ -5787,7 +5802,7 @@
               <w:t xml:space="preserve">1 séquence de </w:t>
             </w:r>
             <w:r>
-              <w:t>2</w:t>
+              <w:t>1</w:t>
             </w:r>
             <w:r>
               <w:t xml:space="preserve"> période</w:t>
@@ -5881,7 +5896,7 @@
               <w:t xml:space="preserve">1 séquence de </w:t>
             </w:r>
             <w:r>
-              <w:t>2</w:t>
+              <w:t>3</w:t>
             </w:r>
             <w:r>
               <w:t xml:space="preserve"> période</w:t>
@@ -6419,6 +6434,9 @@
                 <w:tab w:val="right" w:leader="dot" w:pos="9060"/>
               </w:tabs>
             </w:pPr>
+            <w:r>
+              <w:t>Création d’un PowerPoint pour la présentation de mercredi prochain + ajout de mes projets Portes Ouvertes + 2 projets DemoMot</w:t>
+            </w:r>
           </w:p>
         </w:tc>
         <w:tc>
@@ -6439,7 +6457,104 @@
               <w:right w:w="120" w:type="dxa"/>
             </w:tcMar>
           </w:tcPr>
+          <w:p>
+            <w:r>
+              <w:t xml:space="preserve">1 séquence de </w:t>
+            </w:r>
+            <w:r>
+              <w:t>4</w:t>
+            </w:r>
+            <w:r>
+              <w:t xml:space="preserve"> période</w:t>
+            </w:r>
+            <w:r>
+              <w:t xml:space="preserve"> </w:t>
+            </w:r>
+          </w:p>
+        </w:tc>
+        <w:tc>
+          <w:tcPr>
+            <w:tcW w:w="1009" w:type="dxa"/>
+            <w:tcBorders>
+              <w:top w:val="single" w:sz="1" w:space="0" w:color="CCCCCC"/>
+              <w:left w:val="single" w:sz="1" w:space="0" w:color="CCCCCC"/>
+              <w:bottom w:val="single" w:sz="1" w:space="0" w:color="CCCCCC"/>
+              <w:right w:val="single" w:sz="1" w:space="0" w:color="CCCCCC"/>
+            </w:tcBorders>
+            <w:shd w:val="clear" w:color="auto" w:fill="FFFFFF" w:themeFill="background1"/>
+            <w:tcMar>
+              <w:top w:w="80" w:type="dxa"/>
+              <w:left w:w="120" w:type="dxa"/>
+              <w:bottom w:w="80" w:type="dxa"/>
+              <w:right w:w="120" w:type="dxa"/>
+            </w:tcMar>
+          </w:tcPr>
           <w:p/>
+        </w:tc>
+      </w:tr>
+      <w:tr>
+        <w:tc>
+          <w:tcPr>
+            <w:tcW w:w="3562" w:type="dxa"/>
+            <w:gridSpan w:val="2"/>
+            <w:tcBorders>
+              <w:top w:val="single" w:sz="1" w:space="0" w:color="CCCCCC"/>
+              <w:left w:val="single" w:sz="1" w:space="0" w:color="CCCCCC"/>
+              <w:bottom w:val="single" w:sz="1" w:space="0" w:color="CCCCCC"/>
+              <w:right w:val="single" w:sz="1" w:space="0" w:color="CCCCCC"/>
+            </w:tcBorders>
+            <w:shd w:val="clear" w:color="auto" w:fill="FFFFFF" w:themeFill="background1"/>
+            <w:tcMar>
+              <w:top w:w="80" w:type="dxa"/>
+              <w:left w:w="120" w:type="dxa"/>
+              <w:bottom w:w="80" w:type="dxa"/>
+              <w:right w:w="120" w:type="dxa"/>
+            </w:tcMar>
+          </w:tcPr>
+          <w:p>
+            <w:pPr>
+              <w:pStyle w:val="TM1"/>
+              <w:tabs>
+                <w:tab w:val="right" w:leader="dot" w:pos="9060"/>
+              </w:tabs>
+            </w:pPr>
+            <w:r>
+              <w:t>Régler problème de création PWA sur mobile depuis que j’ai activé un CNAME et restructurer mon repo</w:t>
+            </w:r>
+          </w:p>
+        </w:tc>
+        <w:tc>
+          <w:tcPr>
+            <w:tcW w:w="1101" w:type="dxa"/>
+            <w:gridSpan w:val="2"/>
+            <w:tcBorders>
+              <w:top w:val="single" w:sz="1" w:space="0" w:color="CCCCCC"/>
+              <w:left w:val="single" w:sz="1" w:space="0" w:color="CCCCCC"/>
+              <w:bottom w:val="single" w:sz="1" w:space="0" w:color="CCCCCC"/>
+              <w:right w:val="single" w:sz="1" w:space="0" w:color="CCCCCC"/>
+            </w:tcBorders>
+            <w:shd w:val="clear" w:color="auto" w:fill="FFFFFF" w:themeFill="background1"/>
+            <w:tcMar>
+              <w:top w:w="80" w:type="dxa"/>
+              <w:left w:w="120" w:type="dxa"/>
+              <w:bottom w:w="80" w:type="dxa"/>
+              <w:right w:w="120" w:type="dxa"/>
+            </w:tcMar>
+          </w:tcPr>
+          <w:p>
+            <w:r>
+              <w:t xml:space="preserve">1 séquence de </w:t>
+            </w:r>
+            <w:r>
+              <w:t>6</w:t>
+            </w:r>
+            <w:r>
+              <w:t xml:space="preserve"> période</w:t>
+            </w:r>
+            <w:r>
+              <w:t xml:space="preserve"> </w:t>
+            </w:r>
+          </w:p>
         </w:tc>
         <w:tc>
           <w:tcPr>
@@ -6667,6 +6782,7 @@
       </w:pPr>
       <w:bookmarkStart w:id="18" w:name="_Toc232678051"/>
       <w:r>
+        <w:lastRenderedPageBreak/>
         <w:t>Observations &amp; Analyse</w:t>
       </w:r>
       <w:bookmarkEnd w:id="18"/>
@@ -6734,7 +6850,6 @@
       </w:pPr>
       <w:bookmarkStart w:id="20" w:name="_Toc232678053"/>
       <w:r>
-        <w:lastRenderedPageBreak/>
         <w:t>Points d’amélioration</w:t>
       </w:r>
       <w:bookmarkEnd w:id="20"/>
@@ -8191,6 +8306,119 @@
     </w:lvl>
   </w:abstractNum>
   <w:abstractNum w:abstractNumId="5" w15:restartNumberingAfterBreak="0">
+    <w:nsid w:val="17D44D7B"/>
+    <w:multiLevelType w:val="hybridMultilevel"/>
+    <w:tmpl w:val="5D3883D0"/>
+    <w:lvl w:ilvl="0" w:tplc="100C0001">
+      <w:start w:val="1"/>
+      <w:numFmt w:val="bullet"/>
+      <w:lvlText w:val=""/>
+      <w:lvlJc w:val="left"/>
+      <w:pPr>
+        <w:ind w:left="720" w:hanging="360"/>
+      </w:pPr>
+      <w:rPr>
+        <w:rFonts w:ascii="Symbol" w:hAnsi="Symbol" w:hint="default"/>
+      </w:rPr>
+    </w:lvl>
+    <w:lvl w:ilvl="1" w:tplc="100C0003" w:tentative="1">
+      <w:start w:val="1"/>
+      <w:numFmt w:val="bullet"/>
+      <w:lvlText w:val="o"/>
+      <w:lvlJc w:val="left"/>
+      <w:pPr>
+        <w:ind w:left="1440" w:hanging="360"/>
+      </w:pPr>
+      <w:rPr>
+        <w:rFonts w:ascii="Courier New" w:hAnsi="Courier New" w:cs="Courier New" w:hint="default"/>
+      </w:rPr>
+    </w:lvl>
+    <w:lvl w:ilvl="2" w:tplc="100C0005" w:tentative="1">
+      <w:start w:val="1"/>
+      <w:numFmt w:val="bullet"/>
+      <w:lvlText w:val=""/>
+      <w:lvlJc w:val="left"/>
+      <w:pPr>
+        <w:ind w:left="2160" w:hanging="360"/>
+      </w:pPr>
+      <w:rPr>
+        <w:rFonts w:ascii="Wingdings" w:hAnsi="Wingdings" w:hint="default"/>
+      </w:rPr>
+    </w:lvl>
+    <w:lvl w:ilvl="3" w:tplc="100C0001" w:tentative="1">
+      <w:start w:val="1"/>
+      <w:numFmt w:val="bullet"/>
+      <w:lvlText w:val=""/>
+      <w:lvlJc w:val="left"/>
+      <w:pPr>
+        <w:ind w:left="2880" w:hanging="360"/>
+      </w:pPr>
+      <w:rPr>
+        <w:rFonts w:ascii="Symbol" w:hAnsi="Symbol" w:hint="default"/>
+      </w:rPr>
+    </w:lvl>
+    <w:lvl w:ilvl="4" w:tplc="100C0003" w:tentative="1">
+      <w:start w:val="1"/>
+      <w:numFmt w:val="bullet"/>
+      <w:lvlText w:val="o"/>
+      <w:lvlJc w:val="left"/>
+      <w:pPr>
+        <w:ind w:left="3600" w:hanging="360"/>
+      </w:pPr>
+      <w:rPr>
+        <w:rFonts w:ascii="Courier New" w:hAnsi="Courier New" w:cs="Courier New" w:hint="default"/>
+      </w:rPr>
+    </w:lvl>
+    <w:lvl w:ilvl="5" w:tplc="100C0005" w:tentative="1">
+      <w:start w:val="1"/>
+      <w:numFmt w:val="bullet"/>
+      <w:lvlText w:val=""/>
+      <w:lvlJc w:val="left"/>
+      <w:pPr>
+        <w:ind w:left="4320" w:hanging="360"/>
+      </w:pPr>
+      <w:rPr>
+        <w:rFonts w:ascii="Wingdings" w:hAnsi="Wingdings" w:hint="default"/>
+      </w:rPr>
+    </w:lvl>
+    <w:lvl w:ilvl="6" w:tplc="100C0001" w:tentative="1">
+      <w:start w:val="1"/>
+      <w:numFmt w:val="bullet"/>
+      <w:lvlText w:val=""/>
+      <w:lvlJc w:val="left"/>
+      <w:pPr>
+        <w:ind w:left="5040" w:hanging="360"/>
+      </w:pPr>
+      <w:rPr>
+        <w:rFonts w:ascii="Symbol" w:hAnsi="Symbol" w:hint="default"/>
+      </w:rPr>
+    </w:lvl>
+    <w:lvl w:ilvl="7" w:tplc="100C0003" w:tentative="1">
+      <w:start w:val="1"/>
+      <w:numFmt w:val="bullet"/>
+      <w:lvlText w:val="o"/>
+      <w:lvlJc w:val="left"/>
+      <w:pPr>
+        <w:ind w:left="5760" w:hanging="360"/>
+      </w:pPr>
+      <w:rPr>
+        <w:rFonts w:ascii="Courier New" w:hAnsi="Courier New" w:cs="Courier New" w:hint="default"/>
+      </w:rPr>
+    </w:lvl>
+    <w:lvl w:ilvl="8" w:tplc="100C0005" w:tentative="1">
+      <w:start w:val="1"/>
+      <w:numFmt w:val="bullet"/>
+      <w:lvlText w:val=""/>
+      <w:lvlJc w:val="left"/>
+      <w:pPr>
+        <w:ind w:left="6480" w:hanging="360"/>
+      </w:pPr>
+      <w:rPr>
+        <w:rFonts w:ascii="Wingdings" w:hAnsi="Wingdings" w:hint="default"/>
+      </w:rPr>
+    </w:lvl>
+  </w:abstractNum>
+  <w:abstractNum w:abstractNumId="6" w15:restartNumberingAfterBreak="0">
     <w:nsid w:val="2BD00990"/>
     <w:multiLevelType w:val="multilevel"/>
     <w:tmpl w:val="06B2357E"/>
@@ -8339,7 +8567,7 @@
       </w:rPr>
     </w:lvl>
   </w:abstractNum>
-  <w:abstractNum w:abstractNumId="6" w15:restartNumberingAfterBreak="0">
+  <w:abstractNum w:abstractNumId="7" w15:restartNumberingAfterBreak="0">
     <w:nsid w:val="391D4706"/>
     <w:multiLevelType w:val="hybridMultilevel"/>
     <w:tmpl w:val="D00C0EE0"/>
@@ -8452,7 +8680,7 @@
       </w:rPr>
     </w:lvl>
   </w:abstractNum>
-  <w:abstractNum w:abstractNumId="7" w15:restartNumberingAfterBreak="0">
+  <w:abstractNum w:abstractNumId="8" w15:restartNumberingAfterBreak="0">
     <w:nsid w:val="39D43E6A"/>
     <w:multiLevelType w:val="hybridMultilevel"/>
     <w:tmpl w:val="5FE2D6EA"/>
@@ -8564,7 +8792,7 @@
       </w:rPr>
     </w:lvl>
   </w:abstractNum>
-  <w:abstractNum w:abstractNumId="8" w15:restartNumberingAfterBreak="0">
+  <w:abstractNum w:abstractNumId="9" w15:restartNumberingAfterBreak="0">
     <w:nsid w:val="42C3715D"/>
     <w:multiLevelType w:val="hybridMultilevel"/>
     <w:tmpl w:val="A6544F94"/>
@@ -8676,7 +8904,7 @@
       </w:rPr>
     </w:lvl>
   </w:abstractNum>
-  <w:abstractNum w:abstractNumId="9" w15:restartNumberingAfterBreak="0">
+  <w:abstractNum w:abstractNumId="10" w15:restartNumberingAfterBreak="0">
     <w:nsid w:val="4677751C"/>
     <w:multiLevelType w:val="hybridMultilevel"/>
     <w:tmpl w:val="111CC6E2"/>
@@ -8789,7 +9017,7 @@
       </w:rPr>
     </w:lvl>
   </w:abstractNum>
-  <w:abstractNum w:abstractNumId="10" w15:restartNumberingAfterBreak="0">
+  <w:abstractNum w:abstractNumId="11" w15:restartNumberingAfterBreak="0">
     <w:nsid w:val="4DAE50F6"/>
     <w:multiLevelType w:val="hybridMultilevel"/>
     <w:tmpl w:val="163C649A"/>
@@ -8901,7 +9129,7 @@
       </w:rPr>
     </w:lvl>
   </w:abstractNum>
-  <w:abstractNum w:abstractNumId="11" w15:restartNumberingAfterBreak="0">
+  <w:abstractNum w:abstractNumId="12" w15:restartNumberingAfterBreak="0">
     <w:nsid w:val="5ED670C5"/>
     <w:multiLevelType w:val="hybridMultilevel"/>
     <w:tmpl w:val="18F6FBE8"/>
@@ -9014,7 +9242,7 @@
       </w:rPr>
     </w:lvl>
   </w:abstractNum>
-  <w:abstractNum w:abstractNumId="12" w15:restartNumberingAfterBreak="0">
+  <w:abstractNum w:abstractNumId="13" w15:restartNumberingAfterBreak="0">
     <w:nsid w:val="61565B1B"/>
     <w:multiLevelType w:val="hybridMultilevel"/>
     <w:tmpl w:val="C604366E"/>
@@ -9127,7 +9355,7 @@
       </w:rPr>
     </w:lvl>
   </w:abstractNum>
-  <w:abstractNum w:abstractNumId="13" w15:restartNumberingAfterBreak="0">
+  <w:abstractNum w:abstractNumId="14" w15:restartNumberingAfterBreak="0">
     <w:nsid w:val="7CA80F47"/>
     <w:multiLevelType w:val="multilevel"/>
     <w:tmpl w:val="6E6A5C5C"/>
@@ -9289,34 +9517,37 @@
     <w:abstractNumId w:val="3"/>
   </w:num>
   <w:num w:numId="5" w16cid:durableId="706881446">
+    <w:abstractNumId w:val="9"/>
+  </w:num>
+  <w:num w:numId="6" w16cid:durableId="504590212">
+    <w:abstractNumId w:val="12"/>
+  </w:num>
+  <w:num w:numId="7" w16cid:durableId="1270233319">
+    <w:abstractNumId w:val="14"/>
+  </w:num>
+  <w:num w:numId="8" w16cid:durableId="1304502320">
+    <w:abstractNumId w:val="6"/>
+  </w:num>
+  <w:num w:numId="9" w16cid:durableId="1570072861">
+    <w:abstractNumId w:val="10"/>
+  </w:num>
+  <w:num w:numId="10" w16cid:durableId="2438248">
     <w:abstractNumId w:val="8"/>
   </w:num>
-  <w:num w:numId="6" w16cid:durableId="504590212">
+  <w:num w:numId="11" w16cid:durableId="767385839">
     <w:abstractNumId w:val="11"/>
   </w:num>
-  <w:num w:numId="7" w16cid:durableId="1270233319">
-    <w:abstractNumId w:val="13"/>
-  </w:num>
-  <w:num w:numId="8" w16cid:durableId="1304502320">
-    <w:abstractNumId w:val="5"/>
-  </w:num>
-  <w:num w:numId="9" w16cid:durableId="1570072861">
-    <w:abstractNumId w:val="9"/>
-  </w:num>
-  <w:num w:numId="10" w16cid:durableId="2438248">
+  <w:num w:numId="12" w16cid:durableId="1797718650">
     <w:abstractNumId w:val="7"/>
-  </w:num>
-  <w:num w:numId="11" w16cid:durableId="767385839">
-    <w:abstractNumId w:val="10"/>
-  </w:num>
-  <w:num w:numId="12" w16cid:durableId="1797718650">
-    <w:abstractNumId w:val="6"/>
   </w:num>
   <w:num w:numId="13" w16cid:durableId="1135559714">
     <w:abstractNumId w:val="2"/>
   </w:num>
   <w:num w:numId="14" w16cid:durableId="1400205128">
-    <w:abstractNumId w:val="12"/>
+    <w:abstractNumId w:val="13"/>
+  </w:num>
+  <w:num w:numId="15" w16cid:durableId="2106219793">
+    <w:abstractNumId w:val="5"/>
   </w:num>
   <w:numIdMacAtCleanup w:val="8"/>
 </w:numbering>

</xml_diff>

<commit_message>
update ; changer readme
</commit_message>
<xml_diff>
--- a/annexe/CdC.docx
+++ b/annexe/CdC.docx
@@ -1587,13 +1587,13 @@
       <w:pPr>
         <w:pStyle w:val="Titre2"/>
       </w:pPr>
-      <w:bookmarkStart w:id="3" w:name="_Toc532179969"/>
-      <w:bookmarkStart w:id="4" w:name="_Toc165969639"/>
-      <w:bookmarkStart w:id="5" w:name="_Toc232678040"/>
+      <w:bookmarkStart w:id="3" w:name="_Toc232678040"/>
+      <w:bookmarkStart w:id="4" w:name="_Toc532179969"/>
+      <w:bookmarkStart w:id="5" w:name="_Toc165969639"/>
       <w:r>
         <w:t>Titre</w:t>
       </w:r>
-      <w:bookmarkEnd w:id="5"/>
+      <w:bookmarkEnd w:id="3"/>
     </w:p>
     <w:p>
       <w:pPr>
@@ -1941,8 +1941,8 @@
       <w:r>
         <w:t>Planification</w:t>
       </w:r>
-      <w:bookmarkEnd w:id="3"/>
       <w:bookmarkEnd w:id="4"/>
+      <w:bookmarkEnd w:id="5"/>
       <w:r>
         <w:t xml:space="preserve"> Initiale</w:t>
       </w:r>
@@ -5652,13 +5652,7 @@
               </w:tabs>
             </w:pPr>
             <w:r>
-              <w:t>Faire un nouveau projet</w:t>
-            </w:r>
-            <w:r>
-              <w:t> </w:t>
-            </w:r>
-            <w:r>
-              <w:t xml:space="preserve">: </w:t>
+              <w:t xml:space="preserve">Faire un nouveau projet : </w:t>
             </w:r>
             <w:hyperlink r:id="rId11" w:history="1">
               <w:r>
@@ -6096,10 +6090,7 @@
               <w:t xml:space="preserve"> période</w:t>
             </w:r>
             <w:r>
-              <w:t>s</w:t>
-            </w:r>
-            <w:r>
-              <w:t xml:space="preserve"> </w:t>
+              <w:t xml:space="preserve">s </w:t>
             </w:r>
           </w:p>
         </w:tc>
@@ -6120,7 +6111,17 @@
               <w:right w:w="120" w:type="dxa"/>
             </w:tcMar>
           </w:tcPr>
-          <w:p/>
+          <w:p>
+            <w:r>
+              <w:t>1</w:t>
+            </w:r>
+            <w:r>
+              <w:t>9</w:t>
+            </w:r>
+            <w:r>
+              <w:t>.06.26</w:t>
+            </w:r>
+          </w:p>
         </w:tc>
       </w:tr>
       <w:tr>
@@ -6204,7 +6205,17 @@
               <w:right w:w="120" w:type="dxa"/>
             </w:tcMar>
           </w:tcPr>
-          <w:p/>
+          <w:p>
+            <w:r>
+              <w:t>1</w:t>
+            </w:r>
+            <w:r>
+              <w:t>9</w:t>
+            </w:r>
+            <w:r>
+              <w:t>.06.26</w:t>
+            </w:r>
+          </w:p>
         </w:tc>
       </w:tr>
       <w:tr>
@@ -6282,6 +6293,9 @@
               <w:t xml:space="preserve"> période</w:t>
             </w:r>
             <w:r>
+              <w:t>s</w:t>
+            </w:r>
+            <w:r>
               <w:t xml:space="preserve"> </w:t>
             </w:r>
           </w:p>
@@ -6303,7 +6317,18 @@
               <w:right w:w="120" w:type="dxa"/>
             </w:tcMar>
           </w:tcPr>
-          <w:p/>
+          <w:p>
+            <w:r>
+              <w:lastRenderedPageBreak/>
+              <w:t>1</w:t>
+            </w:r>
+            <w:r>
+              <w:t>9</w:t>
+            </w:r>
+            <w:r>
+              <w:t>.06.26</w:t>
+            </w:r>
+          </w:p>
         </w:tc>
       </w:tr>
       <w:tr>
@@ -6333,25 +6358,7 @@
               </w:tabs>
             </w:pPr>
             <w:r>
-              <w:t xml:space="preserve">Créer la def calculs qui va calculer le poids sur une planete + galérer à récupérer toutes les données des autres tableaux + </w:t>
-            </w:r>
-            <w:r>
-              <w:t>hauteur saut</w:t>
-            </w:r>
-            <w:r>
-              <w:t xml:space="preserve"> + </w:t>
-            </w:r>
-            <w:r>
-              <w:t>temps de voyage</w:t>
-            </w:r>
-            <w:r>
-              <w:t xml:space="preserve"> + âge</w:t>
-            </w:r>
-            <w:r>
-              <w:t xml:space="preserve"> cosmique</w:t>
-            </w:r>
-            <w:r>
-              <w:t xml:space="preserve"> </w:t>
+              <w:t xml:space="preserve">Créer la def calculs qui va calculer le poids sur une planete + galérer à récupérer toutes les données des autres tableaux + hauteur saut + temps de voyage + âge cosmique </w:t>
             </w:r>
           </w:p>
         </w:tc>
@@ -6384,7 +6391,7 @@
               <w:t xml:space="preserve"> période</w:t>
             </w:r>
             <w:r>
-              <w:t xml:space="preserve"> </w:t>
+              <w:t>s</w:t>
             </w:r>
           </w:p>
         </w:tc>
@@ -6468,7 +6475,7 @@
               <w:t xml:space="preserve"> période</w:t>
             </w:r>
             <w:r>
-              <w:t xml:space="preserve"> </w:t>
+              <w:t>s</w:t>
             </w:r>
           </w:p>
         </w:tc>
@@ -6552,7 +6559,7 @@
               <w:t xml:space="preserve"> période</w:t>
             </w:r>
             <w:r>
-              <w:t xml:space="preserve"> </w:t>
+              <w:t>s</w:t>
             </w:r>
           </w:p>
         </w:tc>
@@ -7585,7 +7592,7 @@
               <w:noProof/>
               <w:szCs w:val="16"/>
             </w:rPr>
-            <w:t>17.06.2026 13:17</w:t>
+            <w:t>18.06.2026 15:34</w:t>
           </w:r>
           <w:r>
             <w:rPr>
@@ -10149,6 +10156,7 @@
   <w:style w:type="character" w:default="1" w:styleId="Policepardfaut">
     <w:name w:val="Default Paragraph Font"/>
     <w:uiPriority w:val="1"/>
+    <w:semiHidden/>
     <w:unhideWhenUsed/>
   </w:style>
   <w:style w:type="table" w:default="1" w:styleId="TableauNormal">

</xml_diff>

<commit_message>
update : mettre à jour pptx
</commit_message>
<xml_diff>
--- a/annexe/CdC.docx
+++ b/annexe/CdC.docx
@@ -6412,7 +6412,14 @@
               <w:right w:w="120" w:type="dxa"/>
             </w:tcMar>
           </w:tcPr>
-          <w:p/>
+          <w:p>
+            <w:r>
+              <w:t>22</w:t>
+            </w:r>
+            <w:r>
+              <w:t>.06.26</w:t>
+            </w:r>
+          </w:p>
         </w:tc>
       </w:tr>
       <w:tr>
@@ -6496,7 +6503,14 @@
               <w:right w:w="120" w:type="dxa"/>
             </w:tcMar>
           </w:tcPr>
-          <w:p/>
+          <w:p>
+            <w:r>
+              <w:t>22</w:t>
+            </w:r>
+            <w:r>
+              <w:t>.06.26</w:t>
+            </w:r>
+          </w:p>
         </w:tc>
       </w:tr>
       <w:tr>
@@ -6580,7 +6594,17 @@
               <w:right w:w="120" w:type="dxa"/>
             </w:tcMar>
           </w:tcPr>
-          <w:p/>
+          <w:p>
+            <w:r>
+              <w:t>2</w:t>
+            </w:r>
+            <w:r>
+              <w:t>3</w:t>
+            </w:r>
+            <w:r>
+              <w:t>.06.26</w:t>
+            </w:r>
+          </w:p>
         </w:tc>
       </w:tr>
     </w:tbl>
@@ -7592,7 +7616,7 @@
               <w:noProof/>
               <w:szCs w:val="16"/>
             </w:rPr>
-            <w:t>18.06.2026 15:34</w:t>
+            <w:t>22.06.2026 08:14</w:t>
           </w:r>
           <w:r>
             <w:rPr>
@@ -7804,7 +7828,7 @@
         <v:path o:extrusionok="f" gradientshapeok="t" o:connecttype="rect"/>
         <o:lock v:ext="edit" aspectratio="t"/>
       </v:shapetype>
-      <v:shape id="_x0000_i1025" type="#_x0000_t75" style="width:11.15pt;height:11.15pt" o:bullet="t">
+      <v:shape id="_x0000_i1025" type="#_x0000_t75" style="width:11.2pt;height:11.2pt" o:bullet="t">
         <v:imagedata r:id="rId1" o:title="BD10263_"/>
       </v:shape>
     </w:pict>

</xml_diff>

<commit_message>
update : MàJ JDT Readme
</commit_message>
<xml_diff>
--- a/annexe/CdC.docx
+++ b/annexe/CdC.docx
@@ -146,9 +146,6 @@
     <w:p>
       <w:pPr>
         <w:pStyle w:val="TM1"/>
-        <w:tabs>
-          <w:tab w:val="right" w:leader="dot" w:pos="9060"/>
-        </w:tabs>
         <w:rPr>
           <w:rFonts w:eastAsiaTheme="minorEastAsia" w:cstheme="minorBidi"/>
           <w:noProof/>
@@ -535,9 +532,6 @@
     <w:p>
       <w:pPr>
         <w:pStyle w:val="TM1"/>
-        <w:tabs>
-          <w:tab w:val="right" w:leader="dot" w:pos="9060"/>
-        </w:tabs>
         <w:rPr>
           <w:rFonts w:eastAsiaTheme="minorEastAsia" w:cstheme="minorBidi"/>
           <w:noProof/>
@@ -754,9 +748,6 @@
     <w:p>
       <w:pPr>
         <w:pStyle w:val="TM1"/>
-        <w:tabs>
-          <w:tab w:val="right" w:leader="dot" w:pos="9060"/>
-        </w:tabs>
         <w:rPr>
           <w:rFonts w:eastAsiaTheme="minorEastAsia" w:cstheme="minorBidi"/>
           <w:noProof/>
@@ -827,9 +818,6 @@
     <w:p>
       <w:pPr>
         <w:pStyle w:val="TM1"/>
-        <w:tabs>
-          <w:tab w:val="right" w:leader="dot" w:pos="9060"/>
-        </w:tabs>
         <w:rPr>
           <w:rFonts w:eastAsiaTheme="minorEastAsia" w:cstheme="minorBidi"/>
           <w:noProof/>
@@ -900,9 +888,6 @@
     <w:p>
       <w:pPr>
         <w:pStyle w:val="TM1"/>
-        <w:tabs>
-          <w:tab w:val="right" w:leader="dot" w:pos="9060"/>
-        </w:tabs>
         <w:rPr>
           <w:rFonts w:eastAsiaTheme="minorEastAsia" w:cstheme="minorBidi"/>
           <w:noProof/>
@@ -1265,9 +1250,6 @@
     <w:p>
       <w:pPr>
         <w:pStyle w:val="TM1"/>
-        <w:tabs>
-          <w:tab w:val="right" w:leader="dot" w:pos="9060"/>
-        </w:tabs>
         <w:rPr>
           <w:rFonts w:eastAsiaTheme="minorEastAsia" w:cstheme="minorBidi"/>
           <w:noProof/>
@@ -1338,9 +1320,6 @@
     <w:p>
       <w:pPr>
         <w:pStyle w:val="TM1"/>
-        <w:tabs>
-          <w:tab w:val="right" w:leader="dot" w:pos="9060"/>
-        </w:tabs>
         <w:rPr>
           <w:rFonts w:eastAsiaTheme="minorEastAsia" w:cstheme="minorBidi"/>
           <w:noProof/>
@@ -1411,9 +1390,6 @@
     <w:p>
       <w:pPr>
         <w:pStyle w:val="TM1"/>
-        <w:tabs>
-          <w:tab w:val="right" w:leader="dot" w:pos="9060"/>
-        </w:tabs>
         <w:rPr>
           <w:rFonts w:eastAsiaTheme="minorEastAsia" w:cstheme="minorBidi"/>
           <w:noProof/>
@@ -1484,9 +1460,6 @@
     <w:p>
       <w:pPr>
         <w:pStyle w:val="TM1"/>
-        <w:tabs>
-          <w:tab w:val="right" w:leader="dot" w:pos="9060"/>
-        </w:tabs>
         <w:rPr>
           <w:rFonts w:eastAsiaTheme="minorEastAsia" w:cstheme="minorBidi"/>
           <w:noProof/>
@@ -5212,9 +5185,6 @@
           <w:p>
             <w:pPr>
               <w:pStyle w:val="TM1"/>
-              <w:tabs>
-                <w:tab w:val="right" w:leader="dot" w:pos="9060"/>
-              </w:tabs>
               <w:rPr>
                 <w:rFonts w:eastAsiaTheme="minorEastAsia" w:cstheme="minorBidi"/>
                 <w:noProof/>
@@ -5545,9 +5515,6 @@
           <w:p>
             <w:pPr>
               <w:pStyle w:val="TM1"/>
-              <w:tabs>
-                <w:tab w:val="right" w:leader="dot" w:pos="9060"/>
-              </w:tabs>
             </w:pPr>
             <w:r>
               <w:t>Nettoyer/Structurer mon code HTML/CSS pour que ça soit + propre et mon repo GitHub qui était une poubelle…</w:t>
@@ -5633,9 +5600,6 @@
           <w:p>
             <w:pPr>
               <w:pStyle w:val="TM1"/>
-              <w:tabs>
-                <w:tab w:val="right" w:leader="dot" w:pos="9060"/>
-              </w:tabs>
             </w:pPr>
             <w:r>
               <w:t>Chercher un nouveau projet à faire</w:t>
@@ -5647,9 +5611,6 @@
           <w:p>
             <w:pPr>
               <w:pStyle w:val="TM1"/>
-              <w:tabs>
-                <w:tab w:val="right" w:leader="dot" w:pos="9060"/>
-              </w:tabs>
             </w:pPr>
             <w:r>
               <w:t xml:space="preserve">Faire un nouveau projet : </w:t>
@@ -5671,8 +5632,16 @@
                 <w:rPr>
                   <w:rStyle w:val="Lienhypertexte"/>
                 </w:rPr>
-                <w:t>://github.com/Agashae/AstroLab</w:t>
+                <w:t>://github.com/Agashae/</w:t>
               </w:r>
+              <w:proofErr w:type="spellStart"/>
+              <w:r>
+                <w:rPr>
+                  <w:rStyle w:val="Lienhypertexte"/>
+                </w:rPr>
+                <w:t>AstroLab</w:t>
+              </w:r>
+              <w:proofErr w:type="spellEnd"/>
             </w:hyperlink>
           </w:p>
         </w:tc>
@@ -5764,12 +5733,17 @@
           <w:p>
             <w:pPr>
               <w:pStyle w:val="TM1"/>
-              <w:tabs>
-                <w:tab w:val="right" w:leader="dot" w:pos="9060"/>
-              </w:tabs>
             </w:pPr>
             <w:r>
-              <w:t>Découvrir la synthaxe de Python grâce à des docs et des vidéos</w:t>
+              <w:t xml:space="preserve">Découvrir la </w:t>
+            </w:r>
+            <w:proofErr w:type="spellStart"/>
+            <w:r>
+              <w:t>synthaxe</w:t>
+            </w:r>
+            <w:proofErr w:type="spellEnd"/>
+            <w:r>
+              <w:t xml:space="preserve"> de Python grâce à des docs et des vidéos</w:t>
             </w:r>
           </w:p>
         </w:tc>
@@ -5858,12 +5832,17 @@
           <w:p>
             <w:pPr>
               <w:pStyle w:val="TM1"/>
-              <w:tabs>
-                <w:tab w:val="right" w:leader="dot" w:pos="9060"/>
-              </w:tabs>
             </w:pPr>
             <w:r>
-              <w:t>Créer la première def avec des conditions/boucles de choix</w:t>
+              <w:t xml:space="preserve">Créer la première </w:t>
+            </w:r>
+            <w:proofErr w:type="spellStart"/>
+            <w:r>
+              <w:t>def</w:t>
+            </w:r>
+            <w:proofErr w:type="spellEnd"/>
+            <w:r>
+              <w:t xml:space="preserve"> avec des conditions/boucles de choix</w:t>
             </w:r>
           </w:p>
         </w:tc>
@@ -5955,12 +5934,17 @@
           <w:p>
             <w:pPr>
               <w:pStyle w:val="TM1"/>
-              <w:tabs>
-                <w:tab w:val="right" w:leader="dot" w:pos="9060"/>
-              </w:tabs>
             </w:pPr>
             <w:r>
-              <w:t>Créer la def planètes() : pour avoir un dictionnaire de data</w:t>
+              <w:t xml:space="preserve">Créer la </w:t>
+            </w:r>
+            <w:proofErr w:type="spellStart"/>
+            <w:r>
+              <w:t>def</w:t>
+            </w:r>
+            <w:proofErr w:type="spellEnd"/>
+            <w:r>
+              <w:t xml:space="preserve"> planètes() : pour avoir un dictionnaire de data</w:t>
             </w:r>
           </w:p>
         </w:tc>
@@ -6052,12 +6036,25 @@
           <w:p>
             <w:pPr>
               <w:pStyle w:val="TM1"/>
-              <w:tabs>
-                <w:tab w:val="right" w:leader="dot" w:pos="9060"/>
-              </w:tabs>
             </w:pPr>
             <w:r>
-              <w:t>Check si la valeur de user peut être prise dans le tableau et apprendre return</w:t>
+              <w:t xml:space="preserve">Check si la valeur </w:t>
+            </w:r>
+            <w:proofErr w:type="gramStart"/>
+            <w:r>
+              <w:t>de user</w:t>
+            </w:r>
+            <w:proofErr w:type="gramEnd"/>
+            <w:r>
+              <w:t xml:space="preserve"> </w:t>
+            </w:r>
+            <w:proofErr w:type="gramStart"/>
+            <w:r>
+              <w:t>peut être</w:t>
+            </w:r>
+            <w:proofErr w:type="gramEnd"/>
+            <w:r>
+              <w:t xml:space="preserve"> prise dans le tableau et apprendre return</w:t>
             </w:r>
           </w:p>
         </w:tc>
@@ -6146,9 +6143,6 @@
           <w:p>
             <w:pPr>
               <w:pStyle w:val="TM1"/>
-              <w:tabs>
-                <w:tab w:val="right" w:leader="dot" w:pos="9060"/>
-              </w:tabs>
             </w:pPr>
             <w:r>
               <w:t>Rendre mon code beau dans le terminal</w:t>
@@ -6240,12 +6234,25 @@
           <w:p>
             <w:pPr>
               <w:pStyle w:val="TM1"/>
-              <w:tabs>
-                <w:tab w:val="right" w:leader="dot" w:pos="9060"/>
-              </w:tabs>
             </w:pPr>
             <w:r>
-              <w:t xml:space="preserve">Créer la def fusees avec un calcul, avec des fusées, calculer le carburant </w:t>
+              <w:t xml:space="preserve">Créer la </w:t>
+            </w:r>
+            <w:proofErr w:type="spellStart"/>
+            <w:r>
+              <w:t>def</w:t>
+            </w:r>
+            <w:proofErr w:type="spellEnd"/>
+            <w:r>
+              <w:t xml:space="preserve"> </w:t>
+            </w:r>
+            <w:proofErr w:type="spellStart"/>
+            <w:r>
+              <w:t>fusees</w:t>
+            </w:r>
+            <w:proofErr w:type="spellEnd"/>
+            <w:r>
+              <w:t xml:space="preserve"> avec un calcul, avec des fusées, calculer le carburant </w:t>
             </w:r>
             <w:r>
               <w:lastRenderedPageBreak/>
@@ -6353,12 +6360,25 @@
           <w:p>
             <w:pPr>
               <w:pStyle w:val="TM1"/>
-              <w:tabs>
-                <w:tab w:val="right" w:leader="dot" w:pos="9060"/>
-              </w:tabs>
             </w:pPr>
             <w:r>
-              <w:t xml:space="preserve">Créer la def calculs qui va calculer le poids sur une planete + galérer à récupérer toutes les données des autres tableaux + hauteur saut + temps de voyage + âge cosmique </w:t>
+              <w:t xml:space="preserve">Créer la </w:t>
+            </w:r>
+            <w:proofErr w:type="spellStart"/>
+            <w:r>
+              <w:t>def</w:t>
+            </w:r>
+            <w:proofErr w:type="spellEnd"/>
+            <w:r>
+              <w:t xml:space="preserve"> calculs qui va calculer le poids sur une </w:t>
+            </w:r>
+            <w:proofErr w:type="spellStart"/>
+            <w:r>
+              <w:t>planete</w:t>
+            </w:r>
+            <w:proofErr w:type="spellEnd"/>
+            <w:r>
+              <w:t xml:space="preserve"> + galérer à récupérer toutes les données des autres tableaux + hauteur saut + temps de voyage + âge cosmique </w:t>
             </w:r>
           </w:p>
         </w:tc>
@@ -6444,9 +6464,6 @@
           <w:p>
             <w:pPr>
               <w:pStyle w:val="TM1"/>
-              <w:tabs>
-                <w:tab w:val="right" w:leader="dot" w:pos="9060"/>
-              </w:tabs>
             </w:pPr>
             <w:r>
               <w:t>Création d’un PowerPoint pour la présentation de mercredi prochain + ajout de mes projets Portes Ouvertes + 2 projets DemoMot</w:t>
@@ -6535,9 +6552,6 @@
           <w:p>
             <w:pPr>
               <w:pStyle w:val="TM1"/>
-              <w:tabs>
-                <w:tab w:val="right" w:leader="dot" w:pos="9060"/>
-              </w:tabs>
             </w:pPr>
             <w:r>
               <w:t>Régler problème de création PWA sur mobile depuis que j’ai activé un CNAME et restructurer mon repo</w:t>
@@ -6596,10 +6610,101 @@
           </w:tcPr>
           <w:p>
             <w:r>
+              <w:t>23</w:t>
+            </w:r>
+            <w:r>
+              <w:t>.06.26</w:t>
+            </w:r>
+          </w:p>
+        </w:tc>
+      </w:tr>
+      <w:tr>
+        <w:tc>
+          <w:tcPr>
+            <w:tcW w:w="3562" w:type="dxa"/>
+            <w:gridSpan w:val="2"/>
+            <w:tcBorders>
+              <w:top w:val="single" w:sz="1" w:space="0" w:color="CCCCCC"/>
+              <w:left w:val="single" w:sz="1" w:space="0" w:color="CCCCCC"/>
+              <w:bottom w:val="single" w:sz="1" w:space="0" w:color="CCCCCC"/>
+              <w:right w:val="single" w:sz="1" w:space="0" w:color="CCCCCC"/>
+            </w:tcBorders>
+            <w:shd w:val="clear" w:color="auto" w:fill="FFFFFF" w:themeFill="background1"/>
+            <w:tcMar>
+              <w:top w:w="80" w:type="dxa"/>
+              <w:left w:w="120" w:type="dxa"/>
+              <w:bottom w:w="80" w:type="dxa"/>
+              <w:right w:w="120" w:type="dxa"/>
+            </w:tcMar>
+          </w:tcPr>
+          <w:p>
+            <w:pPr>
+              <w:pStyle w:val="TM1"/>
+            </w:pPr>
+            <w:r>
+              <w:t>Ajout nouvelles images (</w:t>
+            </w:r>
+            <w:r>
+              <w:t>Rencontre Célestes</w:t>
+            </w:r>
+            <w:r>
+              <w:t>)</w:t>
+            </w:r>
+          </w:p>
+        </w:tc>
+        <w:tc>
+          <w:tcPr>
+            <w:tcW w:w="1101" w:type="dxa"/>
+            <w:gridSpan w:val="2"/>
+            <w:tcBorders>
+              <w:top w:val="single" w:sz="1" w:space="0" w:color="CCCCCC"/>
+              <w:left w:val="single" w:sz="1" w:space="0" w:color="CCCCCC"/>
+              <w:bottom w:val="single" w:sz="1" w:space="0" w:color="CCCCCC"/>
+              <w:right w:val="single" w:sz="1" w:space="0" w:color="CCCCCC"/>
+            </w:tcBorders>
+            <w:shd w:val="clear" w:color="auto" w:fill="FFFFFF" w:themeFill="background1"/>
+            <w:tcMar>
+              <w:top w:w="80" w:type="dxa"/>
+              <w:left w:w="120" w:type="dxa"/>
+              <w:bottom w:w="80" w:type="dxa"/>
+              <w:right w:w="120" w:type="dxa"/>
+            </w:tcMar>
+          </w:tcPr>
+          <w:p>
+            <w:r>
+              <w:t xml:space="preserve">1 séquence de </w:t>
+            </w:r>
+            <w:r>
               <w:t>2</w:t>
             </w:r>
             <w:r>
-              <w:t>3</w:t>
+              <w:t xml:space="preserve"> période</w:t>
+            </w:r>
+            <w:r>
+              <w:t>s</w:t>
+            </w:r>
+          </w:p>
+        </w:tc>
+        <w:tc>
+          <w:tcPr>
+            <w:tcW w:w="1009" w:type="dxa"/>
+            <w:tcBorders>
+              <w:top w:val="single" w:sz="1" w:space="0" w:color="CCCCCC"/>
+              <w:left w:val="single" w:sz="1" w:space="0" w:color="CCCCCC"/>
+              <w:bottom w:val="single" w:sz="1" w:space="0" w:color="CCCCCC"/>
+              <w:right w:val="single" w:sz="1" w:space="0" w:color="CCCCCC"/>
+            </w:tcBorders>
+            <w:shd w:val="clear" w:color="auto" w:fill="FFFFFF" w:themeFill="background1"/>
+            <w:tcMar>
+              <w:top w:w="80" w:type="dxa"/>
+              <w:left w:w="120" w:type="dxa"/>
+              <w:bottom w:w="80" w:type="dxa"/>
+              <w:right w:w="120" w:type="dxa"/>
+            </w:tcMar>
+          </w:tcPr>
+          <w:p>
+            <w:r>
+              <w:t>23</w:t>
             </w:r>
             <w:r>
               <w:t>.06.26</w:t>
@@ -6813,7 +6918,6 @@
       </w:pPr>
       <w:bookmarkStart w:id="18" w:name="_Toc232678051"/>
       <w:r>
-        <w:lastRenderedPageBreak/>
         <w:t>Observations &amp; Analyse</w:t>
       </w:r>
       <w:bookmarkEnd w:id="18"/>
@@ -7616,7 +7720,7 @@
               <w:noProof/>
               <w:szCs w:val="16"/>
             </w:rPr>
-            <w:t>22.06.2026 08:14</w:t>
+            <w:t>22.06.2026 08:39</w:t>
           </w:r>
           <w:r>
             <w:rPr>
@@ -10180,7 +10284,6 @@
   <w:style w:type="character" w:default="1" w:styleId="Policepardfaut">
     <w:name w:val="Default Paragraph Font"/>
     <w:uiPriority w:val="1"/>
-    <w:semiHidden/>
     <w:unhideWhenUsed/>
   </w:style>
   <w:style w:type="table" w:default="1" w:styleId="TableauNormal">
@@ -10499,8 +10602,11 @@
     <w:autoRedefine/>
     <w:uiPriority w:val="39"/>
     <w:unhideWhenUsed/>
-    <w:rsid w:val="009B57E9"/>
+    <w:rsid w:val="00FE0F42"/>
     <w:pPr>
+      <w:tabs>
+        <w:tab w:val="right" w:leader="dot" w:pos="9060"/>
+      </w:tabs>
       <w:spacing w:after="100"/>
     </w:pPr>
   </w:style>

</xml_diff>